<commit_message>
feature: times per layer
</commit_message>
<xml_diff>
--- a/doc/Versuchsauswertung Zelasto.docx
+++ b/doc/Versuchsauswertung Zelasto.docx
@@ -36,6 +36,9 @@
     </w:p>
     <w:p>
       <w:r>
+        <w:rPr>
+          <w:noProof/>
+        </w:rPr>
         <w:drawing>
           <wp:inline distT="0" distB="0" distL="0" distR="0" wp14:anchorId="1539DF20" wp14:editId="702E8456">
             <wp:extent cx="5760720" cy="1782445"/>
@@ -122,6 +125,9 @@
     </w:p>
     <w:p>
       <w:r>
+        <w:rPr>
+          <w:noProof/>
+        </w:rPr>
         <w:drawing>
           <wp:inline distT="0" distB="0" distL="0" distR="0" wp14:anchorId="0F48EC4A" wp14:editId="31F58FB6">
             <wp:extent cx="5760720" cy="1431290"/>
@@ -216,6 +222,9 @@
     </w:p>
     <w:p>
       <w:r>
+        <w:rPr>
+          <w:noProof/>
+        </w:rPr>
         <w:drawing>
           <wp:inline distT="0" distB="0" distL="0" distR="0" wp14:anchorId="7C8F224A" wp14:editId="1268E3CD">
             <wp:extent cx="5760720" cy="1443990"/>
@@ -355,6 +364,9 @@
     </w:p>
     <w:p>
       <w:r>
+        <w:rPr>
+          <w:noProof/>
+        </w:rPr>
         <w:drawing>
           <wp:inline distT="0" distB="0" distL="0" distR="0" wp14:anchorId="37185EB0" wp14:editId="78632ABE">
             <wp:extent cx="5760720" cy="2030095"/>
@@ -440,6 +452,9 @@
     </w:p>
     <w:p>
       <w:r>
+        <w:rPr>
+          <w:noProof/>
+        </w:rPr>
         <w:drawing>
           <wp:inline distT="0" distB="0" distL="0" distR="0" wp14:anchorId="2727CDC1" wp14:editId="680A1A5D">
             <wp:extent cx="5760720" cy="3313430"/>
@@ -527,6 +542,9 @@
     </w:p>
     <w:p>
       <w:r>
+        <w:rPr>
+          <w:noProof/>
+        </w:rPr>
         <w:drawing>
           <wp:inline distT="0" distB="0" distL="0" distR="0" wp14:anchorId="6C0E0B84" wp14:editId="727AD9A8">
             <wp:extent cx="5760720" cy="1557020"/>
@@ -592,7 +610,10 @@
       </w:pPr>
       <w:r>
         <w:lastRenderedPageBreak/>
-        <w:t xml:space="preserve">18 Datensätze: 6 </w:t>
+        <w:t>6</w:t>
+      </w:r>
+      <w:r>
+        <w:t xml:space="preserve"> Datensätze: 6 </w:t>
       </w:r>
       <w:proofErr w:type="spellStart"/>
       <w:r>
@@ -615,17 +636,18 @@
       <w:r>
         <w:t xml:space="preserve"> </w:t>
       </w:r>
-      <w:proofErr w:type="gramStart"/>
       <w:r>
         <w:t>pro</w:t>
       </w:r>
       <w:r>
         <w:t xml:space="preserve"> Proband</w:t>
       </w:r>
-      <w:proofErr w:type="gramEnd"/>
-    </w:p>
-    <w:p>
-      <w:r>
+    </w:p>
+    <w:p>
+      <w:r>
+        <w:rPr>
+          <w:noProof/>
+        </w:rPr>
         <w:drawing>
           <wp:inline distT="0" distB="0" distL="0" distR="0" wp14:anchorId="17B1D678" wp14:editId="77C23930">
             <wp:extent cx="5760720" cy="2412365"/>
@@ -771,6 +793,9 @@
     </w:p>
     <w:p>
       <w:r>
+        <w:rPr>
+          <w:noProof/>
+        </w:rPr>
         <w:drawing>
           <wp:inline distT="0" distB="0" distL="0" distR="0" wp14:anchorId="707C07D7" wp14:editId="03936562">
             <wp:extent cx="5760720" cy="3653155"/>
@@ -879,6 +904,9 @@
     </w:p>
     <w:p>
       <w:r>
+        <w:rPr>
+          <w:noProof/>
+        </w:rPr>
         <w:drawing>
           <wp:inline distT="0" distB="0" distL="0" distR="0" wp14:anchorId="3BB79EEB" wp14:editId="51D29CCC">
             <wp:extent cx="5760720" cy="2122170"/>
@@ -1007,10 +1035,7 @@
         <w:pStyle w:val="berschrift2"/>
       </w:pPr>
       <w:r>
-        <w:t>Dauer</w:t>
-      </w:r>
-      <w:r>
-        <w:t xml:space="preserve"> nach </w:t>
+        <w:t xml:space="preserve">Dauer nach </w:t>
       </w:r>
       <w:proofErr w:type="spellStart"/>
       <w:r>
@@ -1018,6 +1043,111 @@
       </w:r>
       <w:proofErr w:type="spellEnd"/>
     </w:p>
+    <w:p>
+      <w:r>
+        <w:drawing>
+          <wp:inline distT="0" distB="0" distL="0" distR="0" wp14:anchorId="738B2FB8" wp14:editId="55B9EFA4">
+            <wp:extent cx="5760720" cy="875665"/>
+            <wp:effectExtent l="0" t="0" r="0" b="635"/>
+            <wp:docPr id="10" name="Grafik 10"/>
+            <wp:cNvGraphicFramePr>
+              <a:graphicFrameLocks xmlns:a="http://schemas.openxmlformats.org/drawingml/2006/main" noChangeAspect="1"/>
+            </wp:cNvGraphicFramePr>
+            <a:graphic xmlns:a="http://schemas.openxmlformats.org/drawingml/2006/main">
+              <a:graphicData uri="http://schemas.openxmlformats.org/drawingml/2006/picture">
+                <pic:pic xmlns:pic="http://schemas.openxmlformats.org/drawingml/2006/picture">
+                  <pic:nvPicPr>
+                    <pic:cNvPr id="1" name=""/>
+                    <pic:cNvPicPr/>
+                  </pic:nvPicPr>
+                  <pic:blipFill>
+                    <a:blip r:embed="rId14"/>
+                    <a:stretch>
+                      <a:fillRect/>
+                    </a:stretch>
+                  </pic:blipFill>
+                  <pic:spPr>
+                    <a:xfrm>
+                      <a:off x="0" y="0"/>
+                      <a:ext cx="5760720" cy="875665"/>
+                    </a:xfrm>
+                    <a:prstGeom prst="rect">
+                      <a:avLst/>
+                    </a:prstGeom>
+                  </pic:spPr>
+                </pic:pic>
+              </a:graphicData>
+            </a:graphic>
+          </wp:inline>
+        </w:drawing>
+      </w:r>
+    </w:p>
+    <w:p>
+      <w:pPr>
+        <w:pStyle w:val="Listenabsatz"/>
+        <w:numPr>
+          <w:ilvl w:val="0"/>
+          <w:numId w:val="4"/>
+        </w:numPr>
+        <w:rPr>
+          <w:lang w:val="en-GB"/>
+        </w:rPr>
+      </w:pPr>
+      <w:r>
+        <w:rPr>
+          <w:lang w:val="en-GB"/>
+        </w:rPr>
+        <w:t>export/</w:t>
+      </w:r>
+      <w:r>
+        <w:rPr>
+          <w:lang w:val="en-GB"/>
+        </w:rPr>
+        <w:t>times</w:t>
+      </w:r>
+      <w:r>
+        <w:rPr>
+          <w:lang w:val="en-GB"/>
+        </w:rPr>
+        <w:t>_global_layers.csv</w:t>
+      </w:r>
+    </w:p>
+    <w:p>
+      <w:pPr>
+        <w:pStyle w:val="Listenabsatz"/>
+        <w:numPr>
+          <w:ilvl w:val="0"/>
+          <w:numId w:val="4"/>
+        </w:numPr>
+      </w:pPr>
+      <w:r>
+        <w:t xml:space="preserve">6 </w:t>
+      </w:r>
+      <w:r>
+        <w:t xml:space="preserve">Datensätze: 6 </w:t>
+      </w:r>
+      <w:proofErr w:type="spellStart"/>
+      <w:r>
+        <w:t>Ebenenanzahlen</w:t>
+      </w:r>
+      <w:proofErr w:type="spellEnd"/>
+    </w:p>
+    <w:p>
+      <w:pPr>
+        <w:pStyle w:val="berschrift2"/>
+      </w:pPr>
+      <w:r>
+        <w:t xml:space="preserve">Dauer nach </w:t>
+      </w:r>
+      <w:proofErr w:type="spellStart"/>
+      <w:r>
+        <w:t>Ebenenanzahl</w:t>
+      </w:r>
+      <w:proofErr w:type="spellEnd"/>
+      <w:r>
+        <w:t xml:space="preserve"> pro Proband</w:t>
+      </w:r>
+    </w:p>
     <w:p/>
     <w:p>
       <w:pPr>
@@ -1034,6 +1164,119 @@
         <w:rPr>
           <w:lang w:val="en-GB"/>
         </w:rPr>
+        <w:t>Export/</w:t>
+      </w:r>
+      <w:r>
+        <w:rPr>
+          <w:lang w:val="en-GB"/>
+        </w:rPr>
+        <w:t>times</w:t>
+      </w:r>
+      <w:r>
+        <w:rPr>
+          <w:lang w:val="en-GB"/>
+        </w:rPr>
+        <w:t>_subject_l</w:t>
+      </w:r>
+      <w:r>
+        <w:rPr>
+          <w:lang w:val="en-GB"/>
+        </w:rPr>
+        <w:t>ayers.csv</w:t>
+      </w:r>
+    </w:p>
+    <w:p>
+      <w:pPr>
+        <w:pStyle w:val="Listenabsatz"/>
+        <w:numPr>
+          <w:ilvl w:val="0"/>
+          <w:numId w:val="4"/>
+        </w:numPr>
+        <w:rPr>
+          <w:lang w:val="en-GB"/>
+        </w:rPr>
+      </w:pPr>
+      <w:r>
+        <w:rPr>
+          <w:lang w:val="en-GB"/>
+        </w:rPr>
+        <w:t xml:space="preserve">138 </w:t>
+      </w:r>
+      <w:proofErr w:type="spellStart"/>
+      <w:r>
+        <w:rPr>
+          <w:lang w:val="en-GB"/>
+        </w:rPr>
+        <w:t>Datensätze</w:t>
+      </w:r>
+      <w:proofErr w:type="spellEnd"/>
+      <w:r>
+        <w:rPr>
+          <w:lang w:val="en-GB"/>
+        </w:rPr>
+        <w:t xml:space="preserve">: 6 </w:t>
+      </w:r>
+      <w:proofErr w:type="spellStart"/>
+      <w:r>
+        <w:rPr>
+          <w:lang w:val="en-GB"/>
+        </w:rPr>
+        <w:t>Ebenenanzahlen</w:t>
+      </w:r>
+      <w:proofErr w:type="spellEnd"/>
+      <w:r>
+        <w:rPr>
+          <w:lang w:val="en-GB"/>
+        </w:rPr>
+        <w:t xml:space="preserve"> * 23 </w:t>
+      </w:r>
+      <w:proofErr w:type="spellStart"/>
+      <w:r>
+        <w:rPr>
+          <w:lang w:val="en-GB"/>
+        </w:rPr>
+        <w:t>Probanden</w:t>
+      </w:r>
+      <w:proofErr w:type="spellEnd"/>
+      <w:r>
+        <w:rPr>
+          <w:lang w:val="en-GB"/>
+        </w:rPr>
+        <w:t xml:space="preserve"> </w:t>
+      </w:r>
+    </w:p>
+    <w:p>
+      <w:pPr>
+        <w:pStyle w:val="berschrift2"/>
+      </w:pPr>
+      <w:r>
+        <w:t xml:space="preserve">Dauer nach </w:t>
+      </w:r>
+      <w:proofErr w:type="spellStart"/>
+      <w:r>
+        <w:t>Ebenenanzahl</w:t>
+      </w:r>
+      <w:proofErr w:type="spellEnd"/>
+      <w:r>
+        <w:t xml:space="preserve"> und Mapping Methode</w:t>
+      </w:r>
+    </w:p>
+    <w:p/>
+    <w:p>
+      <w:pPr>
+        <w:pStyle w:val="Listenabsatz"/>
+        <w:numPr>
+          <w:ilvl w:val="0"/>
+          <w:numId w:val="4"/>
+        </w:numPr>
+        <w:rPr>
+          <w:lang w:val="en-GB"/>
+        </w:rPr>
+      </w:pPr>
+      <w:r>
+        <w:rPr>
+          <w:lang w:val="en-GB"/>
+        </w:rPr>
         <w:t>export/</w:t>
       </w:r>
       <w:r>
@@ -1046,7 +1289,13 @@
         <w:rPr>
           <w:lang w:val="en-GB"/>
         </w:rPr>
-        <w:t>_global_layers.csv</w:t>
+        <w:t>_global_mapping_l</w:t>
+      </w:r>
+      <w:r>
+        <w:rPr>
+          <w:lang w:val="en-GB"/>
+        </w:rPr>
+        <w:t>ayers.csv</w:t>
       </w:r>
     </w:p>
     <w:p>
@@ -1065,213 +1314,16 @@
         <w:t>Ebenenanzahlen</w:t>
       </w:r>
       <w:proofErr w:type="spellEnd"/>
+      <w:r>
+        <w:t xml:space="preserve"> * 3 Mapping Methoden</w:t>
+      </w:r>
     </w:p>
     <w:p>
       <w:pPr>
         <w:pStyle w:val="berschrift2"/>
       </w:pPr>
       <w:r>
-        <w:t>Dauer</w:t>
-      </w:r>
-      <w:r>
-        <w:t xml:space="preserve"> nach </w:t>
-      </w:r>
-      <w:proofErr w:type="spellStart"/>
-      <w:r>
-        <w:t>Ebenenanzahl</w:t>
-      </w:r>
-      <w:proofErr w:type="spellEnd"/>
-      <w:r>
-        <w:t xml:space="preserve"> </w:t>
-      </w:r>
-      <w:proofErr w:type="gramStart"/>
-      <w:r>
-        <w:t>pro Proband</w:t>
-      </w:r>
-      <w:proofErr w:type="gramEnd"/>
-    </w:p>
-    <w:p/>
-    <w:p>
-      <w:pPr>
-        <w:pStyle w:val="Listenabsatz"/>
-        <w:numPr>
-          <w:ilvl w:val="0"/>
-          <w:numId w:val="4"/>
-        </w:numPr>
-        <w:rPr>
-          <w:lang w:val="en-GB"/>
-        </w:rPr>
-      </w:pPr>
-      <w:r>
-        <w:rPr>
-          <w:lang w:val="en-GB"/>
-        </w:rPr>
-        <w:t>Export/</w:t>
-      </w:r>
-      <w:r>
-        <w:rPr>
-          <w:lang w:val="en-GB"/>
-        </w:rPr>
-        <w:t>times</w:t>
-      </w:r>
-      <w:r>
-        <w:rPr>
-          <w:lang w:val="en-GB"/>
-        </w:rPr>
-        <w:t>_subject_l</w:t>
-      </w:r>
-      <w:r>
-        <w:rPr>
-          <w:lang w:val="en-GB"/>
-        </w:rPr>
-        <w:t>ayers.csv</w:t>
-      </w:r>
-    </w:p>
-    <w:p>
-      <w:pPr>
-        <w:pStyle w:val="Listenabsatz"/>
-        <w:numPr>
-          <w:ilvl w:val="0"/>
-          <w:numId w:val="4"/>
-        </w:numPr>
-        <w:rPr>
-          <w:lang w:val="en-GB"/>
-        </w:rPr>
-      </w:pPr>
-      <w:r>
-        <w:rPr>
-          <w:lang w:val="en-GB"/>
-        </w:rPr>
-        <w:t xml:space="preserve">138 </w:t>
-      </w:r>
-      <w:proofErr w:type="spellStart"/>
-      <w:r>
-        <w:rPr>
-          <w:lang w:val="en-GB"/>
-        </w:rPr>
-        <w:t>Datensätze</w:t>
-      </w:r>
-      <w:proofErr w:type="spellEnd"/>
-      <w:r>
-        <w:rPr>
-          <w:lang w:val="en-GB"/>
-        </w:rPr>
-        <w:t xml:space="preserve">: 6 </w:t>
-      </w:r>
-      <w:proofErr w:type="spellStart"/>
-      <w:r>
-        <w:rPr>
-          <w:lang w:val="en-GB"/>
-        </w:rPr>
-        <w:t>Ebenenanzahlen</w:t>
-      </w:r>
-      <w:proofErr w:type="spellEnd"/>
-      <w:r>
-        <w:rPr>
-          <w:lang w:val="en-GB"/>
-        </w:rPr>
-        <w:t xml:space="preserve"> * 23 </w:t>
-      </w:r>
-      <w:proofErr w:type="spellStart"/>
-      <w:r>
-        <w:rPr>
-          <w:lang w:val="en-GB"/>
-        </w:rPr>
-        <w:t>Probanden</w:t>
-      </w:r>
-      <w:proofErr w:type="spellEnd"/>
-      <w:r>
-        <w:rPr>
-          <w:lang w:val="en-GB"/>
-        </w:rPr>
-        <w:t xml:space="preserve"> </w:t>
-      </w:r>
-    </w:p>
-    <w:p>
-      <w:pPr>
-        <w:pStyle w:val="berschrift2"/>
-      </w:pPr>
-      <w:r>
-        <w:t>Dauer</w:t>
-      </w:r>
-      <w:r>
-        <w:t xml:space="preserve"> nach </w:t>
-      </w:r>
-      <w:proofErr w:type="spellStart"/>
-      <w:r>
-        <w:t>Ebenenanzahl</w:t>
-      </w:r>
-      <w:proofErr w:type="spellEnd"/>
-      <w:r>
-        <w:t xml:space="preserve"> und Mapping Methode</w:t>
-      </w:r>
-    </w:p>
-    <w:p/>
-    <w:p>
-      <w:pPr>
-        <w:pStyle w:val="Listenabsatz"/>
-        <w:numPr>
-          <w:ilvl w:val="0"/>
-          <w:numId w:val="4"/>
-        </w:numPr>
-        <w:rPr>
-          <w:lang w:val="en-GB"/>
-        </w:rPr>
-      </w:pPr>
-      <w:r>
-        <w:rPr>
-          <w:lang w:val="en-GB"/>
-        </w:rPr>
-        <w:t>export/</w:t>
-      </w:r>
-      <w:r>
-        <w:rPr>
-          <w:lang w:val="en-GB"/>
-        </w:rPr>
-        <w:t>times</w:t>
-      </w:r>
-      <w:r>
-        <w:rPr>
-          <w:lang w:val="en-GB"/>
-        </w:rPr>
-        <w:t>_global_mapping_l</w:t>
-      </w:r>
-      <w:r>
-        <w:rPr>
-          <w:lang w:val="en-GB"/>
-        </w:rPr>
-        <w:t>ayers.csv</w:t>
-      </w:r>
-    </w:p>
-    <w:p>
-      <w:pPr>
-        <w:pStyle w:val="Listenabsatz"/>
-        <w:numPr>
-          <w:ilvl w:val="0"/>
-          <w:numId w:val="4"/>
-        </w:numPr>
-      </w:pPr>
-      <w:r>
-        <w:t xml:space="preserve">18 Datensätze: 6 </w:t>
-      </w:r>
-      <w:proofErr w:type="spellStart"/>
-      <w:r>
-        <w:t>Ebenenanzahlen</w:t>
-      </w:r>
-      <w:proofErr w:type="spellEnd"/>
-      <w:r>
-        <w:t xml:space="preserve"> * 3 Mapping Methoden</w:t>
-      </w:r>
-    </w:p>
-    <w:p>
-      <w:pPr>
-        <w:pStyle w:val="berschrift2"/>
-      </w:pPr>
-      <w:r>
-        <w:t>Dauer</w:t>
-      </w:r>
-      <w:r>
-        <w:t xml:space="preserve"> nach </w:t>
+        <w:t xml:space="preserve">Dauer nach </w:t>
       </w:r>
       <w:proofErr w:type="spellStart"/>
       <w:r>
@@ -1444,6 +1496,7 @@
         </w:numPr>
       </w:pPr>
       <w:r>
+        <w:lastRenderedPageBreak/>
         <w:t xml:space="preserve">abhängige Variable: </w:t>
       </w:r>
       <w:r>
@@ -1486,7 +1539,6 @@
         <w:pStyle w:val="berschrift3"/>
       </w:pPr>
       <w:r>
-        <w:lastRenderedPageBreak/>
         <w:t xml:space="preserve">Wackelquote </w:t>
       </w:r>
     </w:p>

</xml_diff>

<commit_message>
feature: times per layers and proband
</commit_message>
<xml_diff>
--- a/doc/Versuchsauswertung Zelasto.docx
+++ b/doc/Versuchsauswertung Zelasto.docx
@@ -636,12 +636,14 @@
       <w:r>
         <w:t xml:space="preserve"> </w:t>
       </w:r>
+      <w:proofErr w:type="gramStart"/>
       <w:r>
         <w:t>pro</w:t>
       </w:r>
       <w:r>
         <w:t xml:space="preserve"> Proband</w:t>
       </w:r>
+      <w:proofErr w:type="gramEnd"/>
     </w:p>
     <w:p>
       <w:r>
@@ -1145,7 +1147,163 @@
       </w:r>
       <w:proofErr w:type="spellEnd"/>
       <w:r>
-        <w:t xml:space="preserve"> pro Proband</w:t>
+        <w:t xml:space="preserve"> </w:t>
+      </w:r>
+      <w:proofErr w:type="gramStart"/>
+      <w:r>
+        <w:t>pro Proband</w:t>
+      </w:r>
+      <w:proofErr w:type="gramEnd"/>
+    </w:p>
+    <w:p>
+      <w:r>
+        <w:drawing>
+          <wp:inline distT="0" distB="0" distL="0" distR="0" wp14:anchorId="3753015A" wp14:editId="059FE0BF">
+            <wp:extent cx="5760720" cy="1518285"/>
+            <wp:effectExtent l="0" t="0" r="0" b="5715"/>
+            <wp:docPr id="11" name="Grafik 11" descr="Ein Bild, das Text, Computer, drinnen, weiß enthält.&#10;&#10;Automatisch generierte Beschreibung"/>
+            <wp:cNvGraphicFramePr>
+              <a:graphicFrameLocks xmlns:a="http://schemas.openxmlformats.org/drawingml/2006/main" noChangeAspect="1"/>
+            </wp:cNvGraphicFramePr>
+            <a:graphic xmlns:a="http://schemas.openxmlformats.org/drawingml/2006/main">
+              <a:graphicData uri="http://schemas.openxmlformats.org/drawingml/2006/picture">
+                <pic:pic xmlns:pic="http://schemas.openxmlformats.org/drawingml/2006/picture">
+                  <pic:nvPicPr>
+                    <pic:cNvPr id="11" name="Grafik 11" descr="Ein Bild, das Text, Computer, drinnen, weiß enthält.&#10;&#10;Automatisch generierte Beschreibung"/>
+                    <pic:cNvPicPr/>
+                  </pic:nvPicPr>
+                  <pic:blipFill>
+                    <a:blip r:embed="rId15"/>
+                    <a:stretch>
+                      <a:fillRect/>
+                    </a:stretch>
+                  </pic:blipFill>
+                  <pic:spPr>
+                    <a:xfrm>
+                      <a:off x="0" y="0"/>
+                      <a:ext cx="5760720" cy="1518285"/>
+                    </a:xfrm>
+                    <a:prstGeom prst="rect">
+                      <a:avLst/>
+                    </a:prstGeom>
+                  </pic:spPr>
+                </pic:pic>
+              </a:graphicData>
+            </a:graphic>
+          </wp:inline>
+        </w:drawing>
+      </w:r>
+    </w:p>
+    <w:p>
+      <w:pPr>
+        <w:pStyle w:val="Listenabsatz"/>
+        <w:numPr>
+          <w:ilvl w:val="0"/>
+          <w:numId w:val="4"/>
+        </w:numPr>
+        <w:rPr>
+          <w:lang w:val="en-GB"/>
+        </w:rPr>
+      </w:pPr>
+      <w:r>
+        <w:rPr>
+          <w:lang w:val="en-GB"/>
+        </w:rPr>
+        <w:t>Export/</w:t>
+      </w:r>
+      <w:r>
+        <w:rPr>
+          <w:lang w:val="en-GB"/>
+        </w:rPr>
+        <w:t>times</w:t>
+      </w:r>
+      <w:r>
+        <w:rPr>
+          <w:lang w:val="en-GB"/>
+        </w:rPr>
+        <w:t>_subject_l</w:t>
+      </w:r>
+      <w:r>
+        <w:rPr>
+          <w:lang w:val="en-GB"/>
+        </w:rPr>
+        <w:t>ayers.csv</w:t>
+      </w:r>
+    </w:p>
+    <w:p>
+      <w:pPr>
+        <w:pStyle w:val="Listenabsatz"/>
+        <w:numPr>
+          <w:ilvl w:val="0"/>
+          <w:numId w:val="4"/>
+        </w:numPr>
+        <w:rPr>
+          <w:lang w:val="en-GB"/>
+        </w:rPr>
+      </w:pPr>
+      <w:r>
+        <w:rPr>
+          <w:lang w:val="en-GB"/>
+        </w:rPr>
+        <w:t xml:space="preserve">138 </w:t>
+      </w:r>
+      <w:proofErr w:type="spellStart"/>
+      <w:r>
+        <w:rPr>
+          <w:lang w:val="en-GB"/>
+        </w:rPr>
+        <w:t>Datensätze</w:t>
+      </w:r>
+      <w:proofErr w:type="spellEnd"/>
+      <w:r>
+        <w:rPr>
+          <w:lang w:val="en-GB"/>
+        </w:rPr>
+        <w:t xml:space="preserve">: 6 </w:t>
+      </w:r>
+      <w:proofErr w:type="spellStart"/>
+      <w:r>
+        <w:rPr>
+          <w:lang w:val="en-GB"/>
+        </w:rPr>
+        <w:t>Ebenenanzahlen</w:t>
+      </w:r>
+      <w:proofErr w:type="spellEnd"/>
+      <w:r>
+        <w:rPr>
+          <w:lang w:val="en-GB"/>
+        </w:rPr>
+        <w:t xml:space="preserve"> * 23 </w:t>
+      </w:r>
+      <w:proofErr w:type="spellStart"/>
+      <w:r>
+        <w:rPr>
+          <w:lang w:val="en-GB"/>
+        </w:rPr>
+        <w:t>Probanden</w:t>
+      </w:r>
+      <w:proofErr w:type="spellEnd"/>
+      <w:r>
+        <w:rPr>
+          <w:lang w:val="en-GB"/>
+        </w:rPr>
+        <w:t xml:space="preserve"> </w:t>
+      </w:r>
+    </w:p>
+    <w:p>
+      <w:pPr>
+        <w:pStyle w:val="berschrift2"/>
+      </w:pPr>
+      <w:r>
+        <w:t xml:space="preserve">Dauer nach </w:t>
+      </w:r>
+      <w:proofErr w:type="spellStart"/>
+      <w:r>
+        <w:t>Ebenenanzahl</w:t>
+      </w:r>
+      <w:proofErr w:type="spellEnd"/>
+      <w:r>
+        <w:t xml:space="preserve"> und Mapping Methode</w:t>
       </w:r>
     </w:p>
     <w:p/>
@@ -1164,7 +1322,7 @@
         <w:rPr>
           <w:lang w:val="en-GB"/>
         </w:rPr>
-        <w:t>Export/</w:t>
+        <w:t>export/</w:t>
       </w:r>
       <w:r>
         <w:rPr>
@@ -1176,7 +1334,7 @@
         <w:rPr>
           <w:lang w:val="en-GB"/>
         </w:rPr>
-        <w:t>_subject_l</w:t>
+        <w:t>_global_mapping_l</w:t>
       </w:r>
       <w:r>
         <w:rPr>
@@ -1192,246 +1350,134 @@
           <w:ilvl w:val="0"/>
           <w:numId w:val="4"/>
         </w:numPr>
-        <w:rPr>
-          <w:lang w:val="en-GB"/>
-        </w:rPr>
-      </w:pPr>
-      <w:r>
-        <w:rPr>
-          <w:lang w:val="en-GB"/>
-        </w:rPr>
-        <w:t xml:space="preserve">138 </w:t>
-      </w:r>
-      <w:proofErr w:type="spellStart"/>
-      <w:r>
-        <w:rPr>
-          <w:lang w:val="en-GB"/>
-        </w:rPr>
-        <w:t>Datensätze</w:t>
-      </w:r>
-      <w:proofErr w:type="spellEnd"/>
-      <w:r>
-        <w:rPr>
-          <w:lang w:val="en-GB"/>
-        </w:rPr>
-        <w:t xml:space="preserve">: 6 </w:t>
-      </w:r>
-      <w:proofErr w:type="spellStart"/>
-      <w:r>
-        <w:rPr>
-          <w:lang w:val="en-GB"/>
-        </w:rPr>
+      </w:pPr>
+      <w:r>
+        <w:t xml:space="preserve">18 Datensätze: 6 </w:t>
+      </w:r>
+      <w:proofErr w:type="spellStart"/>
+      <w:r>
         <w:t>Ebenenanzahlen</w:t>
       </w:r>
       <w:proofErr w:type="spellEnd"/>
       <w:r>
-        <w:rPr>
-          <w:lang w:val="en-GB"/>
-        </w:rPr>
-        <w:t xml:space="preserve"> * 23 </w:t>
-      </w:r>
-      <w:proofErr w:type="spellStart"/>
-      <w:r>
-        <w:rPr>
-          <w:lang w:val="en-GB"/>
-        </w:rPr>
+        <w:t xml:space="preserve"> * 3 Mapping Methoden</w:t>
+      </w:r>
+    </w:p>
+    <w:p>
+      <w:pPr>
+        <w:pStyle w:val="berschrift2"/>
+      </w:pPr>
+      <w:r>
+        <w:t xml:space="preserve">Dauer nach </w:t>
+      </w:r>
+      <w:proofErr w:type="spellStart"/>
+      <w:r>
+        <w:t>Ebenenanzahl</w:t>
+      </w:r>
+      <w:proofErr w:type="spellEnd"/>
+      <w:r>
+        <w:t xml:space="preserve"> und </w:t>
+      </w:r>
+      <w:proofErr w:type="spellStart"/>
+      <w:r>
+        <w:t>MappingMethode</w:t>
+      </w:r>
+      <w:proofErr w:type="spellEnd"/>
+      <w:r>
+        <w:t xml:space="preserve"> und Proband</w:t>
+      </w:r>
+    </w:p>
+    <w:p/>
+    <w:p>
+      <w:pPr>
+        <w:pStyle w:val="Listenabsatz"/>
+        <w:numPr>
+          <w:ilvl w:val="0"/>
+          <w:numId w:val="4"/>
+        </w:numPr>
+        <w:rPr>
+          <w:lang w:val="en-GB"/>
+        </w:rPr>
+      </w:pPr>
+      <w:r>
+        <w:rPr>
+          <w:lang w:val="en-GB"/>
+        </w:rPr>
+        <w:t>export/</w:t>
+      </w:r>
+      <w:r>
+        <w:rPr>
+          <w:lang w:val="en-GB"/>
+        </w:rPr>
+        <w:t>times</w:t>
+      </w:r>
+      <w:r>
+        <w:rPr>
+          <w:lang w:val="en-GB"/>
+        </w:rPr>
+        <w:t>_su</w:t>
+      </w:r>
+      <w:r>
+        <w:rPr>
+          <w:lang w:val="en-GB"/>
+        </w:rPr>
+        <w:t>b</w:t>
+      </w:r>
+      <w:r>
+        <w:rPr>
+          <w:lang w:val="en-GB"/>
+        </w:rPr>
+        <w:t>ject_mapping_l</w:t>
+      </w:r>
+      <w:r>
+        <w:rPr>
+          <w:lang w:val="en-GB"/>
+        </w:rPr>
+        <w:t>ayers.csv</w:t>
+      </w:r>
+    </w:p>
+    <w:p>
+      <w:pPr>
+        <w:pStyle w:val="Listenabsatz"/>
+        <w:numPr>
+          <w:ilvl w:val="0"/>
+          <w:numId w:val="4"/>
+        </w:numPr>
+      </w:pPr>
+      <w:r>
+        <w:t xml:space="preserve">414 Datensätze: 6 </w:t>
+      </w:r>
+      <w:proofErr w:type="spellStart"/>
+      <w:r>
+        <w:t>Eben</w:t>
+      </w:r>
+      <w:r>
+        <w:t>e</w:t>
+      </w:r>
+      <w:r>
+        <w:t>n</w:t>
+      </w:r>
+      <w:r>
+        <w:t>a</w:t>
+      </w:r>
+      <w:r>
+        <w:t>nzahlen</w:t>
+      </w:r>
+      <w:proofErr w:type="spellEnd"/>
+      <w:r>
+        <w:t xml:space="preserve"> * 3 Mapping Methoden * 23 </w:t>
+      </w:r>
+      <w:r>
         <w:t>Probanden</w:t>
       </w:r>
-      <w:proofErr w:type="spellEnd"/>
-      <w:r>
-        <w:rPr>
-          <w:lang w:val="en-GB"/>
-        </w:rPr>
-        <w:t xml:space="preserve"> </w:t>
-      </w:r>
-    </w:p>
-    <w:p>
-      <w:pPr>
-        <w:pStyle w:val="berschrift2"/>
-      </w:pPr>
-      <w:r>
-        <w:t xml:space="preserve">Dauer nach </w:t>
-      </w:r>
-      <w:proofErr w:type="spellStart"/>
-      <w:r>
-        <w:t>Ebenenanzahl</w:t>
-      </w:r>
-      <w:proofErr w:type="spellEnd"/>
-      <w:r>
-        <w:t xml:space="preserve"> und Mapping Methode</w:t>
-      </w:r>
     </w:p>
     <w:p/>
     <w:p>
       <w:pPr>
-        <w:pStyle w:val="Listenabsatz"/>
-        <w:numPr>
-          <w:ilvl w:val="0"/>
-          <w:numId w:val="4"/>
-        </w:numPr>
-        <w:rPr>
-          <w:lang w:val="en-GB"/>
-        </w:rPr>
-      </w:pPr>
-      <w:r>
-        <w:rPr>
-          <w:lang w:val="en-GB"/>
-        </w:rPr>
-        <w:t>export/</w:t>
-      </w:r>
-      <w:r>
-        <w:rPr>
-          <w:lang w:val="en-GB"/>
-        </w:rPr>
-        <w:t>times</w:t>
-      </w:r>
-      <w:r>
-        <w:rPr>
-          <w:lang w:val="en-GB"/>
-        </w:rPr>
-        <w:t>_global_mapping_l</w:t>
-      </w:r>
-      <w:r>
-        <w:rPr>
-          <w:lang w:val="en-GB"/>
-        </w:rPr>
-        <w:t>ayers.csv</w:t>
-      </w:r>
-    </w:p>
-    <w:p>
-      <w:pPr>
-        <w:pStyle w:val="Listenabsatz"/>
-        <w:numPr>
-          <w:ilvl w:val="0"/>
-          <w:numId w:val="4"/>
-        </w:numPr>
-      </w:pPr>
-      <w:r>
-        <w:t xml:space="preserve">18 Datensätze: 6 </w:t>
-      </w:r>
-      <w:proofErr w:type="spellStart"/>
-      <w:r>
-        <w:t>Ebenenanzahlen</w:t>
-      </w:r>
-      <w:proofErr w:type="spellEnd"/>
-      <w:r>
-        <w:t xml:space="preserve"> * 3 Mapping Methoden</w:t>
-      </w:r>
-    </w:p>
-    <w:p>
-      <w:pPr>
-        <w:pStyle w:val="berschrift2"/>
-      </w:pPr>
-      <w:r>
-        <w:t xml:space="preserve">Dauer nach </w:t>
-      </w:r>
-      <w:proofErr w:type="spellStart"/>
-      <w:r>
-        <w:t>Ebenenanzahl</w:t>
-      </w:r>
-      <w:proofErr w:type="spellEnd"/>
-      <w:r>
-        <w:t xml:space="preserve"> und </w:t>
-      </w:r>
-      <w:proofErr w:type="spellStart"/>
-      <w:r>
-        <w:t>MappingMethode</w:t>
-      </w:r>
-      <w:proofErr w:type="spellEnd"/>
-      <w:r>
-        <w:t xml:space="preserve"> und Proband</w:t>
-      </w:r>
-    </w:p>
-    <w:p/>
-    <w:p>
-      <w:pPr>
-        <w:pStyle w:val="Listenabsatz"/>
-        <w:numPr>
-          <w:ilvl w:val="0"/>
-          <w:numId w:val="4"/>
-        </w:numPr>
-        <w:rPr>
-          <w:lang w:val="en-GB"/>
-        </w:rPr>
-      </w:pPr>
-      <w:r>
-        <w:rPr>
-          <w:lang w:val="en-GB"/>
-        </w:rPr>
-        <w:t>export/</w:t>
-      </w:r>
-      <w:r>
-        <w:rPr>
-          <w:lang w:val="en-GB"/>
-        </w:rPr>
-        <w:t>times</w:t>
-      </w:r>
-      <w:r>
-        <w:rPr>
-          <w:lang w:val="en-GB"/>
-        </w:rPr>
-        <w:t>_su</w:t>
-      </w:r>
-      <w:r>
-        <w:rPr>
-          <w:lang w:val="en-GB"/>
-        </w:rPr>
-        <w:t>b</w:t>
-      </w:r>
-      <w:r>
-        <w:rPr>
-          <w:lang w:val="en-GB"/>
-        </w:rPr>
-        <w:t>ject_mapping_l</w:t>
-      </w:r>
-      <w:r>
-        <w:rPr>
-          <w:lang w:val="en-GB"/>
-        </w:rPr>
-        <w:t>ayers.csv</w:t>
-      </w:r>
-    </w:p>
-    <w:p>
-      <w:pPr>
-        <w:pStyle w:val="Listenabsatz"/>
-        <w:numPr>
-          <w:ilvl w:val="0"/>
-          <w:numId w:val="4"/>
-        </w:numPr>
-      </w:pPr>
-      <w:r>
-        <w:t xml:space="preserve">414 Datensätze: 6 </w:t>
-      </w:r>
-      <w:proofErr w:type="spellStart"/>
-      <w:r>
-        <w:t>Eben</w:t>
-      </w:r>
-      <w:r>
-        <w:t>e</w:t>
-      </w:r>
-      <w:r>
-        <w:t>n</w:t>
-      </w:r>
-      <w:r>
-        <w:t>a</w:t>
-      </w:r>
-      <w:r>
-        <w:t>nzahlen</w:t>
-      </w:r>
-      <w:proofErr w:type="spellEnd"/>
-      <w:r>
-        <w:t xml:space="preserve"> * 3 Mapping Methoden * 23 </w:t>
-      </w:r>
-      <w:r>
-        <w:t>Probanden</w:t>
-      </w:r>
-    </w:p>
-    <w:p/>
-    <w:p>
-      <w:pPr>
         <w:pStyle w:val="berschrift1"/>
       </w:pPr>
       <w:r>
+        <w:lastRenderedPageBreak/>
         <w:t>Auswertungsstrategien</w:t>
       </w:r>
     </w:p>
@@ -1496,7 +1542,6 @@
         </w:numPr>
       </w:pPr>
       <w:r>
-        <w:lastRenderedPageBreak/>
         <w:t xml:space="preserve">abhängige Variable: </w:t>
       </w:r>
       <w:r>

</xml_diff>

<commit_message>
feature: completed extractions for time data
</commit_message>
<xml_diff>
--- a/doc/Versuchsauswertung Zelasto.docx
+++ b/doc/Versuchsauswertung Zelasto.docx
@@ -1158,10 +1158,10 @@
     <w:p>
       <w:r>
         <w:drawing>
-          <wp:inline distT="0" distB="0" distL="0" distR="0" wp14:anchorId="3753015A" wp14:editId="059FE0BF">
-            <wp:extent cx="5760720" cy="1518285"/>
-            <wp:effectExtent l="0" t="0" r="0" b="5715"/>
-            <wp:docPr id="11" name="Grafik 11" descr="Ein Bild, das Text, Computer, drinnen, weiß enthält.&#10;&#10;Automatisch generierte Beschreibung"/>
+          <wp:inline distT="0" distB="0" distL="0" distR="0" wp14:anchorId="2D5CF65F" wp14:editId="2E12E6EB">
+            <wp:extent cx="5760720" cy="1434465"/>
+            <wp:effectExtent l="0" t="0" r="0" b="0"/>
+            <wp:docPr id="12" name="Grafik 12"/>
             <wp:cNvGraphicFramePr>
               <a:graphicFrameLocks xmlns:a="http://schemas.openxmlformats.org/drawingml/2006/main" noChangeAspect="1"/>
             </wp:cNvGraphicFramePr>
@@ -1169,7 +1169,7 @@
               <a:graphicData uri="http://schemas.openxmlformats.org/drawingml/2006/picture">
                 <pic:pic xmlns:pic="http://schemas.openxmlformats.org/drawingml/2006/picture">
                   <pic:nvPicPr>
-                    <pic:cNvPr id="11" name="Grafik 11" descr="Ein Bild, das Text, Computer, drinnen, weiß enthält.&#10;&#10;Automatisch generierte Beschreibung"/>
+                    <pic:cNvPr id="1" name=""/>
                     <pic:cNvPicPr/>
                   </pic:nvPicPr>
                   <pic:blipFill>
@@ -1181,7 +1181,7 @@
                   <pic:spPr>
                     <a:xfrm>
                       <a:off x="0" y="0"/>
-                      <a:ext cx="5760720" cy="1518285"/>
+                      <a:ext cx="5760720" cy="1434465"/>
                     </a:xfrm>
                     <a:prstGeom prst="rect">
                       <a:avLst/>
@@ -1295,6 +1295,7 @@
         <w:pStyle w:val="berschrift2"/>
       </w:pPr>
       <w:r>
+        <w:lastRenderedPageBreak/>
         <w:t xml:space="preserve">Dauer nach </w:t>
       </w:r>
       <w:proofErr w:type="spellStart"/>
@@ -1306,178 +1307,253 @@
         <w:t xml:space="preserve"> und Mapping Methode</w:t>
       </w:r>
     </w:p>
+    <w:p>
+      <w:r>
+        <w:drawing>
+          <wp:inline distT="0" distB="0" distL="0" distR="0" wp14:anchorId="5875A924" wp14:editId="7351D35A">
+            <wp:extent cx="5760720" cy="2080895"/>
+            <wp:effectExtent l="0" t="0" r="0" b="0"/>
+            <wp:docPr id="13" name="Grafik 13" descr="Ein Bild, das drinnen enthält.&#10;&#10;Automatisch generierte Beschreibung"/>
+            <wp:cNvGraphicFramePr>
+              <a:graphicFrameLocks xmlns:a="http://schemas.openxmlformats.org/drawingml/2006/main" noChangeAspect="1"/>
+            </wp:cNvGraphicFramePr>
+            <a:graphic xmlns:a="http://schemas.openxmlformats.org/drawingml/2006/main">
+              <a:graphicData uri="http://schemas.openxmlformats.org/drawingml/2006/picture">
+                <pic:pic xmlns:pic="http://schemas.openxmlformats.org/drawingml/2006/picture">
+                  <pic:nvPicPr>
+                    <pic:cNvPr id="13" name="Grafik 13" descr="Ein Bild, das drinnen enthält.&#10;&#10;Automatisch generierte Beschreibung"/>
+                    <pic:cNvPicPr/>
+                  </pic:nvPicPr>
+                  <pic:blipFill>
+                    <a:blip r:embed="rId16"/>
+                    <a:stretch>
+                      <a:fillRect/>
+                    </a:stretch>
+                  </pic:blipFill>
+                  <pic:spPr>
+                    <a:xfrm>
+                      <a:off x="0" y="0"/>
+                      <a:ext cx="5760720" cy="2080895"/>
+                    </a:xfrm>
+                    <a:prstGeom prst="rect">
+                      <a:avLst/>
+                    </a:prstGeom>
+                  </pic:spPr>
+                </pic:pic>
+              </a:graphicData>
+            </a:graphic>
+          </wp:inline>
+        </w:drawing>
+      </w:r>
+    </w:p>
+    <w:p>
+      <w:pPr>
+        <w:pStyle w:val="Listenabsatz"/>
+        <w:numPr>
+          <w:ilvl w:val="0"/>
+          <w:numId w:val="4"/>
+        </w:numPr>
+        <w:rPr>
+          <w:lang w:val="en-GB"/>
+        </w:rPr>
+      </w:pPr>
+      <w:r>
+        <w:rPr>
+          <w:lang w:val="en-GB"/>
+        </w:rPr>
+        <w:t>export/</w:t>
+      </w:r>
+      <w:r>
+        <w:rPr>
+          <w:lang w:val="en-GB"/>
+        </w:rPr>
+        <w:t>times</w:t>
+      </w:r>
+      <w:r>
+        <w:rPr>
+          <w:lang w:val="en-GB"/>
+        </w:rPr>
+        <w:t>_global_mapping_l</w:t>
+      </w:r>
+      <w:r>
+        <w:rPr>
+          <w:lang w:val="en-GB"/>
+        </w:rPr>
+        <w:t>ayers.csv</w:t>
+      </w:r>
+    </w:p>
+    <w:p>
+      <w:pPr>
+        <w:pStyle w:val="Listenabsatz"/>
+        <w:numPr>
+          <w:ilvl w:val="0"/>
+          <w:numId w:val="4"/>
+        </w:numPr>
+      </w:pPr>
+      <w:r>
+        <w:t xml:space="preserve">18 Datensätze: 6 </w:t>
+      </w:r>
+      <w:proofErr w:type="spellStart"/>
+      <w:r>
+        <w:t>Ebenenanzahlen</w:t>
+      </w:r>
+      <w:proofErr w:type="spellEnd"/>
+      <w:r>
+        <w:t xml:space="preserve"> * 3 Mapping Methoden</w:t>
+      </w:r>
+    </w:p>
+    <w:p>
+      <w:pPr>
+        <w:pStyle w:val="berschrift2"/>
+      </w:pPr>
+      <w:r>
+        <w:t xml:space="preserve">Dauer nach </w:t>
+      </w:r>
+      <w:proofErr w:type="spellStart"/>
+      <w:r>
+        <w:t>Ebenenanzahl</w:t>
+      </w:r>
+      <w:proofErr w:type="spellEnd"/>
+      <w:r>
+        <w:t xml:space="preserve"> und </w:t>
+      </w:r>
+      <w:proofErr w:type="spellStart"/>
+      <w:r>
+        <w:t>MappingMethode</w:t>
+      </w:r>
+      <w:proofErr w:type="spellEnd"/>
+      <w:r>
+        <w:t xml:space="preserve"> und Proband</w:t>
+      </w:r>
+    </w:p>
+    <w:p>
+      <w:r>
+        <w:drawing>
+          <wp:inline distT="0" distB="0" distL="0" distR="0" wp14:anchorId="787AEA20" wp14:editId="06B433CF">
+            <wp:extent cx="5760720" cy="1315085"/>
+            <wp:effectExtent l="0" t="0" r="0" b="0"/>
+            <wp:docPr id="14" name="Grafik 14"/>
+            <wp:cNvGraphicFramePr>
+              <a:graphicFrameLocks xmlns:a="http://schemas.openxmlformats.org/drawingml/2006/main" noChangeAspect="1"/>
+            </wp:cNvGraphicFramePr>
+            <a:graphic xmlns:a="http://schemas.openxmlformats.org/drawingml/2006/main">
+              <a:graphicData uri="http://schemas.openxmlformats.org/drawingml/2006/picture">
+                <pic:pic xmlns:pic="http://schemas.openxmlformats.org/drawingml/2006/picture">
+                  <pic:nvPicPr>
+                    <pic:cNvPr id="1" name=""/>
+                    <pic:cNvPicPr/>
+                  </pic:nvPicPr>
+                  <pic:blipFill>
+                    <a:blip r:embed="rId17"/>
+                    <a:stretch>
+                      <a:fillRect/>
+                    </a:stretch>
+                  </pic:blipFill>
+                  <pic:spPr>
+                    <a:xfrm>
+                      <a:off x="0" y="0"/>
+                      <a:ext cx="5760720" cy="1315085"/>
+                    </a:xfrm>
+                    <a:prstGeom prst="rect">
+                      <a:avLst/>
+                    </a:prstGeom>
+                  </pic:spPr>
+                </pic:pic>
+              </a:graphicData>
+            </a:graphic>
+          </wp:inline>
+        </w:drawing>
+      </w:r>
+    </w:p>
+    <w:p>
+      <w:pPr>
+        <w:pStyle w:val="Listenabsatz"/>
+        <w:numPr>
+          <w:ilvl w:val="0"/>
+          <w:numId w:val="4"/>
+        </w:numPr>
+        <w:rPr>
+          <w:lang w:val="en-GB"/>
+        </w:rPr>
+      </w:pPr>
+      <w:r>
+        <w:rPr>
+          <w:lang w:val="en-GB"/>
+        </w:rPr>
+        <w:t>export/</w:t>
+      </w:r>
+      <w:r>
+        <w:rPr>
+          <w:lang w:val="en-GB"/>
+        </w:rPr>
+        <w:t>times</w:t>
+      </w:r>
+      <w:r>
+        <w:rPr>
+          <w:lang w:val="en-GB"/>
+        </w:rPr>
+        <w:t>_su</w:t>
+      </w:r>
+      <w:r>
+        <w:rPr>
+          <w:lang w:val="en-GB"/>
+        </w:rPr>
+        <w:t>b</w:t>
+      </w:r>
+      <w:r>
+        <w:rPr>
+          <w:lang w:val="en-GB"/>
+        </w:rPr>
+        <w:t>ject_mapping_l</w:t>
+      </w:r>
+      <w:r>
+        <w:rPr>
+          <w:lang w:val="en-GB"/>
+        </w:rPr>
+        <w:t>ayers.csv</w:t>
+      </w:r>
+    </w:p>
+    <w:p>
+      <w:pPr>
+        <w:pStyle w:val="Listenabsatz"/>
+        <w:numPr>
+          <w:ilvl w:val="0"/>
+          <w:numId w:val="4"/>
+        </w:numPr>
+      </w:pPr>
+      <w:r>
+        <w:t xml:space="preserve">414 Datensätze: 6 </w:t>
+      </w:r>
+      <w:proofErr w:type="spellStart"/>
+      <w:r>
+        <w:t>Eben</w:t>
+      </w:r>
+      <w:r>
+        <w:t>e</w:t>
+      </w:r>
+      <w:r>
+        <w:t>n</w:t>
+      </w:r>
+      <w:r>
+        <w:t>a</w:t>
+      </w:r>
+      <w:r>
+        <w:t>nzahlen</w:t>
+      </w:r>
+      <w:proofErr w:type="spellEnd"/>
+      <w:r>
+        <w:t xml:space="preserve"> * 3 Mapping Methoden * 23 </w:t>
+      </w:r>
+      <w:r>
+        <w:t>Probanden</w:t>
+      </w:r>
+    </w:p>
     <w:p/>
     <w:p>
       <w:pPr>
-        <w:pStyle w:val="Listenabsatz"/>
-        <w:numPr>
-          <w:ilvl w:val="0"/>
-          <w:numId w:val="4"/>
-        </w:numPr>
-        <w:rPr>
-          <w:lang w:val="en-GB"/>
-        </w:rPr>
-      </w:pPr>
-      <w:r>
-        <w:rPr>
-          <w:lang w:val="en-GB"/>
-        </w:rPr>
-        <w:t>export/</w:t>
-      </w:r>
-      <w:r>
-        <w:rPr>
-          <w:lang w:val="en-GB"/>
-        </w:rPr>
-        <w:t>times</w:t>
-      </w:r>
-      <w:r>
-        <w:rPr>
-          <w:lang w:val="en-GB"/>
-        </w:rPr>
-        <w:t>_global_mapping_l</w:t>
-      </w:r>
-      <w:r>
-        <w:rPr>
-          <w:lang w:val="en-GB"/>
-        </w:rPr>
-        <w:t>ayers.csv</w:t>
-      </w:r>
-    </w:p>
-    <w:p>
-      <w:pPr>
-        <w:pStyle w:val="Listenabsatz"/>
-        <w:numPr>
-          <w:ilvl w:val="0"/>
-          <w:numId w:val="4"/>
-        </w:numPr>
-      </w:pPr>
-      <w:r>
-        <w:t xml:space="preserve">18 Datensätze: 6 </w:t>
-      </w:r>
-      <w:proofErr w:type="spellStart"/>
-      <w:r>
-        <w:t>Ebenenanzahlen</w:t>
-      </w:r>
-      <w:proofErr w:type="spellEnd"/>
-      <w:r>
-        <w:t xml:space="preserve"> * 3 Mapping Methoden</w:t>
-      </w:r>
-    </w:p>
-    <w:p>
-      <w:pPr>
-        <w:pStyle w:val="berschrift2"/>
-      </w:pPr>
-      <w:r>
-        <w:t xml:space="preserve">Dauer nach </w:t>
-      </w:r>
-      <w:proofErr w:type="spellStart"/>
-      <w:r>
-        <w:t>Ebenenanzahl</w:t>
-      </w:r>
-      <w:proofErr w:type="spellEnd"/>
-      <w:r>
-        <w:t xml:space="preserve"> und </w:t>
-      </w:r>
-      <w:proofErr w:type="spellStart"/>
-      <w:r>
-        <w:t>MappingMethode</w:t>
-      </w:r>
-      <w:proofErr w:type="spellEnd"/>
-      <w:r>
-        <w:t xml:space="preserve"> und Proband</w:t>
-      </w:r>
-    </w:p>
-    <w:p/>
-    <w:p>
-      <w:pPr>
-        <w:pStyle w:val="Listenabsatz"/>
-        <w:numPr>
-          <w:ilvl w:val="0"/>
-          <w:numId w:val="4"/>
-        </w:numPr>
-        <w:rPr>
-          <w:lang w:val="en-GB"/>
-        </w:rPr>
-      </w:pPr>
-      <w:r>
-        <w:rPr>
-          <w:lang w:val="en-GB"/>
-        </w:rPr>
-        <w:t>export/</w:t>
-      </w:r>
-      <w:r>
-        <w:rPr>
-          <w:lang w:val="en-GB"/>
-        </w:rPr>
-        <w:t>times</w:t>
-      </w:r>
-      <w:r>
-        <w:rPr>
-          <w:lang w:val="en-GB"/>
-        </w:rPr>
-        <w:t>_su</w:t>
-      </w:r>
-      <w:r>
-        <w:rPr>
-          <w:lang w:val="en-GB"/>
-        </w:rPr>
-        <w:t>b</w:t>
-      </w:r>
-      <w:r>
-        <w:rPr>
-          <w:lang w:val="en-GB"/>
-        </w:rPr>
-        <w:t>ject_mapping_l</w:t>
-      </w:r>
-      <w:r>
-        <w:rPr>
-          <w:lang w:val="en-GB"/>
-        </w:rPr>
-        <w:t>ayers.csv</w:t>
-      </w:r>
-    </w:p>
-    <w:p>
-      <w:pPr>
-        <w:pStyle w:val="Listenabsatz"/>
-        <w:numPr>
-          <w:ilvl w:val="0"/>
-          <w:numId w:val="4"/>
-        </w:numPr>
-      </w:pPr>
-      <w:r>
-        <w:t xml:space="preserve">414 Datensätze: 6 </w:t>
-      </w:r>
-      <w:proofErr w:type="spellStart"/>
-      <w:r>
-        <w:t>Eben</w:t>
-      </w:r>
-      <w:r>
-        <w:t>e</w:t>
-      </w:r>
-      <w:r>
-        <w:t>n</w:t>
-      </w:r>
-      <w:r>
-        <w:t>a</w:t>
-      </w:r>
-      <w:r>
-        <w:t>nzahlen</w:t>
-      </w:r>
-      <w:proofErr w:type="spellEnd"/>
-      <w:r>
-        <w:t xml:space="preserve"> * 3 Mapping Methoden * 23 </w:t>
-      </w:r>
-      <w:r>
-        <w:t>Probanden</w:t>
-      </w:r>
-    </w:p>
-    <w:p/>
-    <w:p>
-      <w:pPr>
         <w:pStyle w:val="berschrift1"/>
       </w:pPr>
       <w:r>
-        <w:lastRenderedPageBreak/>
         <w:t>Auswertungsstrategien</w:t>
       </w:r>
     </w:p>

</xml_diff>

<commit_message>
fix: markers / times feature: plot optimizations
</commit_message>
<xml_diff>
--- a/doc/Versuchsauswertung Zelasto.docx
+++ b/doc/Versuchsauswertung Zelasto.docx
@@ -55,7 +55,7 @@
                     <pic:cNvPicPr/>
                   </pic:nvPicPr>
                   <pic:blipFill>
-                    <a:blip r:embed="rId5"/>
+                    <a:blip r:embed="rId6"/>
                     <a:stretch>
                       <a:fillRect/>
                     </a:stretch>
@@ -144,7 +144,7 @@
                     <pic:cNvPicPr/>
                   </pic:nvPicPr>
                   <pic:blipFill>
-                    <a:blip r:embed="rId6"/>
+                    <a:blip r:embed="rId7"/>
                     <a:stretch>
                       <a:fillRect/>
                     </a:stretch>
@@ -241,7 +241,7 @@
                     <pic:cNvPicPr/>
                   </pic:nvPicPr>
                   <pic:blipFill>
-                    <a:blip r:embed="rId7"/>
+                    <a:blip r:embed="rId8"/>
                     <a:stretch>
                       <a:fillRect/>
                     </a:stretch>
@@ -383,7 +383,7 @@
                     <pic:cNvPicPr/>
                   </pic:nvPicPr>
                   <pic:blipFill>
-                    <a:blip r:embed="rId8"/>
+                    <a:blip r:embed="rId9"/>
                     <a:stretch>
                       <a:fillRect/>
                     </a:stretch>
@@ -471,7 +471,7 @@
                     <pic:cNvPicPr/>
                   </pic:nvPicPr>
                   <pic:blipFill>
-                    <a:blip r:embed="rId9"/>
+                    <a:blip r:embed="rId10"/>
                     <a:stretch>
                       <a:fillRect/>
                     </a:stretch>
@@ -561,7 +561,7 @@
                     <pic:cNvPicPr/>
                   </pic:nvPicPr>
                   <pic:blipFill>
-                    <a:blip r:embed="rId10"/>
+                    <a:blip r:embed="rId11"/>
                     <a:stretch>
                       <a:fillRect/>
                     </a:stretch>
@@ -636,12 +636,14 @@
       <w:r>
         <w:t xml:space="preserve"> </w:t>
       </w:r>
+      <w:proofErr w:type="gramStart"/>
       <w:r>
         <w:t>pro</w:t>
       </w:r>
       <w:r>
         <w:t xml:space="preserve"> Proband</w:t>
       </w:r>
+      <w:proofErr w:type="gramEnd"/>
     </w:p>
     <w:p>
       <w:r>
@@ -664,7 +666,7 @@
                     <pic:cNvPicPr/>
                   </pic:nvPicPr>
                   <pic:blipFill>
-                    <a:blip r:embed="rId11"/>
+                    <a:blip r:embed="rId12"/>
                     <a:stretch>
                       <a:fillRect/>
                     </a:stretch>
@@ -812,7 +814,7 @@
                     <pic:cNvPicPr/>
                   </pic:nvPicPr>
                   <pic:blipFill>
-                    <a:blip r:embed="rId12"/>
+                    <a:blip r:embed="rId13"/>
                     <a:stretch>
                       <a:fillRect/>
                     </a:stretch>
@@ -923,7 +925,7 @@
                     <pic:cNvPicPr/>
                   </pic:nvPicPr>
                   <pic:blipFill>
-                    <a:blip r:embed="rId13"/>
+                    <a:blip r:embed="rId14"/>
                     <a:stretch>
                       <a:fillRect/>
                     </a:stretch>
@@ -1045,116 +1047,14 @@
     </w:p>
     <w:p>
       <w:r>
+        <w:rPr>
+          <w:noProof/>
+        </w:rPr>
         <w:drawing>
           <wp:inline distT="0" distB="0" distL="0" distR="0" wp14:anchorId="738B2FB8" wp14:editId="55B9EFA4">
             <wp:extent cx="5760720" cy="875665"/>
             <wp:effectExtent l="0" t="0" r="0" b="635"/>
             <wp:docPr id="10" name="Grafik 10"/>
-            <wp:cNvGraphicFramePr>
-              <a:graphicFrameLocks xmlns:a="http://schemas.openxmlformats.org/drawingml/2006/main" noChangeAspect="1"/>
-            </wp:cNvGraphicFramePr>
-            <a:graphic xmlns:a="http://schemas.openxmlformats.org/drawingml/2006/main">
-              <a:graphicData uri="http://schemas.openxmlformats.org/drawingml/2006/picture">
-                <pic:pic xmlns:pic="http://schemas.openxmlformats.org/drawingml/2006/picture">
-                  <pic:nvPicPr>
-                    <pic:cNvPr id="1" name=""/>
-                    <pic:cNvPicPr/>
-                  </pic:nvPicPr>
-                  <pic:blipFill>
-                    <a:blip r:embed="rId14"/>
-                    <a:stretch>
-                      <a:fillRect/>
-                    </a:stretch>
-                  </pic:blipFill>
-                  <pic:spPr>
-                    <a:xfrm>
-                      <a:off x="0" y="0"/>
-                      <a:ext cx="5760720" cy="875665"/>
-                    </a:xfrm>
-                    <a:prstGeom prst="rect">
-                      <a:avLst/>
-                    </a:prstGeom>
-                  </pic:spPr>
-                </pic:pic>
-              </a:graphicData>
-            </a:graphic>
-          </wp:inline>
-        </w:drawing>
-      </w:r>
-    </w:p>
-    <w:p>
-      <w:pPr>
-        <w:pStyle w:val="Listenabsatz"/>
-        <w:numPr>
-          <w:ilvl w:val="0"/>
-          <w:numId w:val="4"/>
-        </w:numPr>
-        <w:rPr>
-          <w:lang w:val="en-GB"/>
-        </w:rPr>
-      </w:pPr>
-      <w:r>
-        <w:rPr>
-          <w:lang w:val="en-GB"/>
-        </w:rPr>
-        <w:t>export/</w:t>
-      </w:r>
-      <w:r>
-        <w:rPr>
-          <w:lang w:val="en-GB"/>
-        </w:rPr>
-        <w:t>times</w:t>
-      </w:r>
-      <w:r>
-        <w:rPr>
-          <w:lang w:val="en-GB"/>
-        </w:rPr>
-        <w:t>_global_layers.csv</w:t>
-      </w:r>
-    </w:p>
-    <w:p>
-      <w:pPr>
-        <w:pStyle w:val="Listenabsatz"/>
-        <w:numPr>
-          <w:ilvl w:val="0"/>
-          <w:numId w:val="4"/>
-        </w:numPr>
-      </w:pPr>
-      <w:r>
-        <w:t xml:space="preserve">6 </w:t>
-      </w:r>
-      <w:r>
-        <w:t xml:space="preserve">Datensätze: 6 </w:t>
-      </w:r>
-      <w:proofErr w:type="spellStart"/>
-      <w:r>
-        <w:t>Ebenenanzahlen</w:t>
-      </w:r>
-      <w:proofErr w:type="spellEnd"/>
-    </w:p>
-    <w:p>
-      <w:pPr>
-        <w:pStyle w:val="berschrift2"/>
-      </w:pPr>
-      <w:r>
-        <w:t xml:space="preserve">Dauer nach </w:t>
-      </w:r>
-      <w:proofErr w:type="spellStart"/>
-      <w:r>
-        <w:t>Ebenenanzahl</w:t>
-      </w:r>
-      <w:proofErr w:type="spellEnd"/>
-      <w:r>
-        <w:t xml:space="preserve"> pro Proband</w:t>
-      </w:r>
-    </w:p>
-    <w:p>
-      <w:r>
-        <w:drawing>
-          <wp:inline distT="0" distB="0" distL="0" distR="0" wp14:anchorId="2D5CF65F" wp14:editId="2E12E6EB">
-            <wp:extent cx="5760720" cy="1434465"/>
-            <wp:effectExtent l="0" t="0" r="0" b="0"/>
-            <wp:docPr id="12" name="Grafik 12"/>
             <wp:cNvGraphicFramePr>
               <a:graphicFrameLocks xmlns:a="http://schemas.openxmlformats.org/drawingml/2006/main" noChangeAspect="1"/>
             </wp:cNvGraphicFramePr>
@@ -1174,7 +1074,7 @@
                   <pic:spPr>
                     <a:xfrm>
                       <a:off x="0" y="0"/>
-                      <a:ext cx="5760720" cy="1434465"/>
+                      <a:ext cx="5760720" cy="875665"/>
                     </a:xfrm>
                     <a:prstGeom prst="rect">
                       <a:avLst/>
@@ -1202,7 +1102,7 @@
         <w:rPr>
           <w:lang w:val="en-GB"/>
         </w:rPr>
-        <w:t>Export/</w:t>
+        <w:t>export/</w:t>
       </w:r>
       <w:r>
         <w:rPr>
@@ -1214,13 +1114,7 @@
         <w:rPr>
           <w:lang w:val="en-GB"/>
         </w:rPr>
-        <w:t>_subject_l</w:t>
-      </w:r>
-      <w:r>
-        <w:rPr>
-          <w:lang w:val="en-GB"/>
-        </w:rPr>
-        <w:t>ayers.csv</w:t>
+        <w:t>_global_layers.csv</w:t>
       </w:r>
     </w:p>
     <w:p>
@@ -1230,83 +1124,50 @@
           <w:ilvl w:val="0"/>
           <w:numId w:val="4"/>
         </w:numPr>
-        <w:rPr>
-          <w:lang w:val="en-GB"/>
-        </w:rPr>
-      </w:pPr>
-      <w:r>
-        <w:rPr>
-          <w:lang w:val="en-GB"/>
-        </w:rPr>
-        <w:t xml:space="preserve">138 </w:t>
-      </w:r>
-      <w:proofErr w:type="spellStart"/>
-      <w:r>
-        <w:rPr>
-          <w:lang w:val="en-GB"/>
-        </w:rPr>
-        <w:t>Datensätze</w:t>
-      </w:r>
-      <w:proofErr w:type="spellEnd"/>
-      <w:r>
-        <w:rPr>
-          <w:lang w:val="en-GB"/>
-        </w:rPr>
-        <w:t xml:space="preserve">: 6 </w:t>
-      </w:r>
-      <w:proofErr w:type="spellStart"/>
-      <w:r>
-        <w:rPr>
-          <w:lang w:val="en-GB"/>
-        </w:rPr>
+      </w:pPr>
+      <w:r>
+        <w:t xml:space="preserve">6 </w:t>
+      </w:r>
+      <w:r>
+        <w:t xml:space="preserve">Datensätze: 6 </w:t>
+      </w:r>
+      <w:proofErr w:type="spellStart"/>
+      <w:r>
         <w:t>Ebenenanzahlen</w:t>
       </w:r>
       <w:proofErr w:type="spellEnd"/>
-      <w:r>
-        <w:rPr>
-          <w:lang w:val="en-GB"/>
-        </w:rPr>
-        <w:t xml:space="preserve"> * 23 </w:t>
-      </w:r>
-      <w:proofErr w:type="spellStart"/>
-      <w:r>
-        <w:rPr>
-          <w:lang w:val="en-GB"/>
-        </w:rPr>
-        <w:t>Probanden</w:t>
-      </w:r>
-      <w:proofErr w:type="spellEnd"/>
-      <w:r>
-        <w:rPr>
-          <w:lang w:val="en-GB"/>
-        </w:rPr>
+    </w:p>
+    <w:p>
+      <w:pPr>
+        <w:pStyle w:val="berschrift2"/>
+      </w:pPr>
+      <w:r>
+        <w:t xml:space="preserve">Dauer nach </w:t>
+      </w:r>
+      <w:proofErr w:type="spellStart"/>
+      <w:r>
+        <w:t>Ebenenanzahl</w:t>
+      </w:r>
+      <w:proofErr w:type="spellEnd"/>
+      <w:r>
         <w:t xml:space="preserve"> </w:t>
       </w:r>
-    </w:p>
-    <w:p>
-      <w:pPr>
-        <w:pStyle w:val="berschrift2"/>
-      </w:pPr>
-      <w:r>
-        <w:lastRenderedPageBreak/>
-        <w:t xml:space="preserve">Dauer nach </w:t>
-      </w:r>
-      <w:proofErr w:type="spellStart"/>
-      <w:r>
-        <w:t>Ebenenanzahl</w:t>
-      </w:r>
-      <w:proofErr w:type="spellEnd"/>
-      <w:r>
-        <w:t xml:space="preserve"> und Mapping Methode</w:t>
-      </w:r>
-    </w:p>
-    <w:p>
-      <w:r>
+      <w:proofErr w:type="gramStart"/>
+      <w:r>
+        <w:t>pro Proband</w:t>
+      </w:r>
+      <w:proofErr w:type="gramEnd"/>
+    </w:p>
+    <w:p>
+      <w:r>
+        <w:rPr>
+          <w:noProof/>
+        </w:rPr>
         <w:drawing>
-          <wp:inline distT="0" distB="0" distL="0" distR="0" wp14:anchorId="030E9001" wp14:editId="15105096">
-            <wp:extent cx="5760720" cy="2177415"/>
+          <wp:inline distT="0" distB="0" distL="0" distR="0" wp14:anchorId="2D5CF65F" wp14:editId="2E12E6EB">
+            <wp:extent cx="5760720" cy="1434465"/>
             <wp:effectExtent l="0" t="0" r="0" b="0"/>
-            <wp:docPr id="15" name="Grafik 15"/>
+            <wp:docPr id="12" name="Grafik 12"/>
             <wp:cNvGraphicFramePr>
               <a:graphicFrameLocks xmlns:a="http://schemas.openxmlformats.org/drawingml/2006/main" noChangeAspect="1"/>
             </wp:cNvGraphicFramePr>
@@ -1326,7 +1187,7 @@
                   <pic:spPr>
                     <a:xfrm>
                       <a:off x="0" y="0"/>
-                      <a:ext cx="5760720" cy="2177415"/>
+                      <a:ext cx="5760720" cy="1434465"/>
                     </a:xfrm>
                     <a:prstGeom prst="rect">
                       <a:avLst/>
@@ -1354,7 +1215,7 @@
         <w:rPr>
           <w:lang w:val="en-GB"/>
         </w:rPr>
-        <w:t>export/</w:t>
+        <w:t>Export/</w:t>
       </w:r>
       <w:r>
         <w:rPr>
@@ -1366,7 +1227,7 @@
         <w:rPr>
           <w:lang w:val="en-GB"/>
         </w:rPr>
-        <w:t>_global_mapping_l</w:t>
+        <w:t>_subject_l</w:t>
       </w:r>
       <w:r>
         <w:rPr>
@@ -1382,17 +1243,57 @@
           <w:ilvl w:val="0"/>
           <w:numId w:val="4"/>
         </w:numPr>
-      </w:pPr>
-      <w:r>
-        <w:t xml:space="preserve">18 Datensätze: 6 </w:t>
-      </w:r>
-      <w:proofErr w:type="spellStart"/>
-      <w:r>
+        <w:rPr>
+          <w:lang w:val="en-GB"/>
+        </w:rPr>
+      </w:pPr>
+      <w:r>
+        <w:rPr>
+          <w:lang w:val="en-GB"/>
+        </w:rPr>
+        <w:t xml:space="preserve">138 </w:t>
+      </w:r>
+      <w:proofErr w:type="spellStart"/>
+      <w:r>
+        <w:rPr>
+          <w:lang w:val="en-GB"/>
+        </w:rPr>
+        <w:t>Datensätze</w:t>
+      </w:r>
+      <w:proofErr w:type="spellEnd"/>
+      <w:r>
+        <w:rPr>
+          <w:lang w:val="en-GB"/>
+        </w:rPr>
+        <w:t xml:space="preserve">: 6 </w:t>
+      </w:r>
+      <w:proofErr w:type="spellStart"/>
+      <w:r>
+        <w:rPr>
+          <w:lang w:val="en-GB"/>
+        </w:rPr>
         <w:t>Ebenenanzahlen</w:t>
       </w:r>
       <w:proofErr w:type="spellEnd"/>
       <w:r>
-        <w:t xml:space="preserve"> * 3 Mapping Methoden</w:t>
+        <w:rPr>
+          <w:lang w:val="en-GB"/>
+        </w:rPr>
+        <w:t xml:space="preserve"> * 23 </w:t>
+      </w:r>
+      <w:proofErr w:type="spellStart"/>
+      <w:r>
+        <w:rPr>
+          <w:lang w:val="en-GB"/>
+        </w:rPr>
+        <w:t>Probanden</w:t>
+      </w:r>
+      <w:proofErr w:type="spellEnd"/>
+      <w:r>
+        <w:rPr>
+          <w:lang w:val="en-GB"/>
+        </w:rPr>
+        <w:t xml:space="preserve"> </w:t>
       </w:r>
     </w:p>
     <w:p>
@@ -1400,6 +1301,7 @@
         <w:pStyle w:val="berschrift2"/>
       </w:pPr>
       <w:r>
+        <w:lastRenderedPageBreak/>
         <w:t xml:space="preserve">Dauer nach </w:t>
       </w:r>
       <w:proofErr w:type="spellStart"/>
@@ -1408,24 +1310,19 @@
       </w:r>
       <w:proofErr w:type="spellEnd"/>
       <w:r>
-        <w:t xml:space="preserve"> und </w:t>
-      </w:r>
-      <w:proofErr w:type="spellStart"/>
-      <w:r>
-        <w:t>MappingMethode</w:t>
-      </w:r>
-      <w:proofErr w:type="spellEnd"/>
-      <w:r>
-        <w:t xml:space="preserve"> und Proband</w:t>
-      </w:r>
-    </w:p>
-    <w:p>
-      <w:r>
+        <w:t xml:space="preserve"> und Mapping Methode</w:t>
+      </w:r>
+    </w:p>
+    <w:p>
+      <w:r>
+        <w:rPr>
+          <w:noProof/>
+        </w:rPr>
         <w:drawing>
-          <wp:inline distT="0" distB="0" distL="0" distR="0" wp14:anchorId="787AEA20" wp14:editId="06B433CF">
-            <wp:extent cx="5760720" cy="1315085"/>
+          <wp:inline distT="0" distB="0" distL="0" distR="0" wp14:anchorId="030E9001" wp14:editId="15105096">
+            <wp:extent cx="5760720" cy="2177415"/>
             <wp:effectExtent l="0" t="0" r="0" b="0"/>
-            <wp:docPr id="14" name="Grafik 14"/>
+            <wp:docPr id="15" name="Grafik 15"/>
             <wp:cNvGraphicFramePr>
               <a:graphicFrameLocks xmlns:a="http://schemas.openxmlformats.org/drawingml/2006/main" noChangeAspect="1"/>
             </wp:cNvGraphicFramePr>
@@ -1445,6 +1342,128 @@
                   <pic:spPr>
                     <a:xfrm>
                       <a:off x="0" y="0"/>
+                      <a:ext cx="5760720" cy="2177415"/>
+                    </a:xfrm>
+                    <a:prstGeom prst="rect">
+                      <a:avLst/>
+                    </a:prstGeom>
+                  </pic:spPr>
+                </pic:pic>
+              </a:graphicData>
+            </a:graphic>
+          </wp:inline>
+        </w:drawing>
+      </w:r>
+    </w:p>
+    <w:p>
+      <w:pPr>
+        <w:pStyle w:val="Listenabsatz"/>
+        <w:numPr>
+          <w:ilvl w:val="0"/>
+          <w:numId w:val="4"/>
+        </w:numPr>
+        <w:rPr>
+          <w:lang w:val="en-GB"/>
+        </w:rPr>
+      </w:pPr>
+      <w:r>
+        <w:rPr>
+          <w:lang w:val="en-GB"/>
+        </w:rPr>
+        <w:t>export/</w:t>
+      </w:r>
+      <w:r>
+        <w:rPr>
+          <w:lang w:val="en-GB"/>
+        </w:rPr>
+        <w:t>times</w:t>
+      </w:r>
+      <w:r>
+        <w:rPr>
+          <w:lang w:val="en-GB"/>
+        </w:rPr>
+        <w:t>_global_mapping_l</w:t>
+      </w:r>
+      <w:r>
+        <w:rPr>
+          <w:lang w:val="en-GB"/>
+        </w:rPr>
+        <w:t>ayers.csv</w:t>
+      </w:r>
+    </w:p>
+    <w:p>
+      <w:pPr>
+        <w:pStyle w:val="Listenabsatz"/>
+        <w:numPr>
+          <w:ilvl w:val="0"/>
+          <w:numId w:val="4"/>
+        </w:numPr>
+      </w:pPr>
+      <w:r>
+        <w:t xml:space="preserve">18 Datensätze: 6 </w:t>
+      </w:r>
+      <w:proofErr w:type="spellStart"/>
+      <w:r>
+        <w:t>Ebenenanzahlen</w:t>
+      </w:r>
+      <w:proofErr w:type="spellEnd"/>
+      <w:r>
+        <w:t xml:space="preserve"> * 3 Mapping Methoden</w:t>
+      </w:r>
+    </w:p>
+    <w:p>
+      <w:pPr>
+        <w:pStyle w:val="berschrift2"/>
+      </w:pPr>
+      <w:r>
+        <w:t xml:space="preserve">Dauer nach </w:t>
+      </w:r>
+      <w:proofErr w:type="spellStart"/>
+      <w:r>
+        <w:t>Ebenenanzahl</w:t>
+      </w:r>
+      <w:proofErr w:type="spellEnd"/>
+      <w:r>
+        <w:t xml:space="preserve"> und </w:t>
+      </w:r>
+      <w:proofErr w:type="spellStart"/>
+      <w:r>
+        <w:t>MappingMethode</w:t>
+      </w:r>
+      <w:proofErr w:type="spellEnd"/>
+      <w:r>
+        <w:t xml:space="preserve"> und Proband</w:t>
+      </w:r>
+    </w:p>
+    <w:p>
+      <w:r>
+        <w:rPr>
+          <w:noProof/>
+        </w:rPr>
+        <w:drawing>
+          <wp:inline distT="0" distB="0" distL="0" distR="0" wp14:anchorId="787AEA20" wp14:editId="06B433CF">
+            <wp:extent cx="5760720" cy="1315085"/>
+            <wp:effectExtent l="0" t="0" r="0" b="0"/>
+            <wp:docPr id="14" name="Grafik 14"/>
+            <wp:cNvGraphicFramePr>
+              <a:graphicFrameLocks xmlns:a="http://schemas.openxmlformats.org/drawingml/2006/main" noChangeAspect="1"/>
+            </wp:cNvGraphicFramePr>
+            <a:graphic xmlns:a="http://schemas.openxmlformats.org/drawingml/2006/main">
+              <a:graphicData uri="http://schemas.openxmlformats.org/drawingml/2006/picture">
+                <pic:pic xmlns:pic="http://schemas.openxmlformats.org/drawingml/2006/picture">
+                  <pic:nvPicPr>
+                    <pic:cNvPr id="1" name=""/>
+                    <pic:cNvPicPr/>
+                  </pic:nvPicPr>
+                  <pic:blipFill>
+                    <a:blip r:embed="rId18"/>
+                    <a:stretch>
+                      <a:fillRect/>
+                    </a:stretch>
+                  </pic:blipFill>
+                  <pic:spPr>
+                    <a:xfrm>
+                      <a:off x="0" y="0"/>
                       <a:ext cx="5760720" cy="1315085"/>
                     </a:xfrm>
                     <a:prstGeom prst="rect">
@@ -1995,7 +2014,6 @@
         <w:t>Komplexe Korrelationen</w:t>
       </w:r>
     </w:p>
-    <w:p/>
     <w:p>
       <w:pPr>
         <w:pStyle w:val="Listenabsatz"/>
@@ -2003,12 +2021,51 @@
           <w:ilvl w:val="0"/>
           <w:numId w:val="1"/>
         </w:numPr>
-      </w:pPr>
-      <w:r>
+        <w:rPr>
+          <w:lang w:val="en-GB"/>
+        </w:rPr>
+      </w:pPr>
+      <w:hyperlink r:id="rId19" w:history="1">
+        <w:r>
+          <w:rPr>
+            <w:rStyle w:val="Hyperlink"/>
+            <w:lang w:val="en-GB"/>
+          </w:rPr>
+          <w:t xml:space="preserve">AVI </w:t>
+        </w:r>
+        <w:proofErr w:type="gramStart"/>
+        <w:r>
+          <w:rPr>
+            <w:rStyle w:val="Hyperlink"/>
+            <w:lang w:val="en-GB"/>
+          </w:rPr>
+          <w:t>2022 :</w:t>
+        </w:r>
+        <w:proofErr w:type="gramEnd"/>
+        <w:r>
+          <w:rPr>
+            <w:rStyle w:val="Hyperlink"/>
+            <w:lang w:val="en-GB"/>
+          </w:rPr>
+          <w:t xml:space="preserve"> International Conference on Advanced Visual Interfaces (AVI) 2022 (wikicfp.com)</w:t>
+        </w:r>
+        <w:proofErr w:type="spellStart"/>
+      </w:hyperlink>
+      <w:r>
+        <w:rPr>
+          <w:lang w:val="en-GB"/>
+        </w:rPr>
         <w:t>Ergebnisse</w:t>
       </w:r>
-    </w:p>
-    <w:p/>
+      <w:proofErr w:type="spellEnd"/>
+    </w:p>
+    <w:p>
+      <w:pPr>
+        <w:rPr>
+          <w:lang w:val="en-GB"/>
+        </w:rPr>
+      </w:pPr>
+    </w:p>
     <w:p>
       <w:pPr>
         <w:pStyle w:val="berschrift2"/>
@@ -3137,6 +3194,18 @@
       <w:szCs w:val="24"/>
     </w:rPr>
   </w:style>
+  <w:style w:type="character" w:styleId="Hyperlink">
+    <w:name w:val="Hyperlink"/>
+    <w:basedOn w:val="Absatz-Standardschriftart"/>
+    <w:uiPriority w:val="99"/>
+    <w:semiHidden/>
+    <w:unhideWhenUsed/>
+    <w:rsid w:val="00E97D0F"/>
+    <w:rPr>
+      <w:color w:val="0000FF"/>
+      <w:u w:val="single"/>
+    </w:rPr>
+  </w:style>
 </w:styles>
 </file>
 
@@ -3433,4 +3502,16 @@
     </a:ext>
   </a:extLst>
 </a:theme>
+</file>
+
+<file path=customXml/item1.xml><?xml version="1.0" encoding="utf-8"?>
+<b:Sources xmlns:b="http://schemas.openxmlformats.org/officeDocument/2006/bibliography" xmlns="http://schemas.openxmlformats.org/officeDocument/2006/bibliography" SelectedStyle="\APASixthEditionOfficeOnline.xsl" StyleName="APA" Version="6"/>
+</file>
+
+<file path=customXml/itemProps1.xml><?xml version="1.0" encoding="utf-8"?>
+<ds:datastoreItem xmlns:ds="http://schemas.openxmlformats.org/officeDocument/2006/customXml" ds:itemID="{3DED0AC9-A1BA-4374-A2CA-D1241575FF4D}">
+  <ds:schemaRefs>
+    <ds:schemaRef ds:uri="http://schemas.openxmlformats.org/officeDocument/2006/bibliography"/>
+  </ds:schemaRefs>
+</ds:datastoreItem>
 </file>
</xml_diff>

<commit_message>
feature: documantation SPSS stats
</commit_message>
<xml_diff>
--- a/doc/Versuchsauswertung Zelasto.docx
+++ b/doc/Versuchsauswertung Zelasto.docx
@@ -1560,12 +1560,341 @@
         <w:t>Probanden</w:t>
       </w:r>
     </w:p>
-    <w:p/>
     <w:p>
       <w:pPr>
         <w:pStyle w:val="berschrift1"/>
       </w:pPr>
       <w:r>
+        <w:t>SPSS-Einstellungen</w:t>
+      </w:r>
+    </w:p>
+    <w:p>
+      <w:pPr>
+        <w:pStyle w:val="Listenabsatz"/>
+        <w:numPr>
+          <w:ilvl w:val="0"/>
+          <w:numId w:val="4"/>
+        </w:numPr>
+      </w:pPr>
+      <w:r>
+        <w:t>Uni</w:t>
+      </w:r>
+      <w:r>
+        <w:t>variate ANOVA:</w:t>
+      </w:r>
+    </w:p>
+    <w:p>
+      <w:pPr>
+        <w:pStyle w:val="Listenabsatz"/>
+        <w:numPr>
+          <w:ilvl w:val="1"/>
+          <w:numId w:val="4"/>
+        </w:numPr>
+      </w:pPr>
+      <w:r>
+        <w:t>Optionen:</w:t>
+      </w:r>
+    </w:p>
+    <w:p>
+      <w:pPr>
+        <w:pStyle w:val="Listenabsatz"/>
+        <w:numPr>
+          <w:ilvl w:val="2"/>
+          <w:numId w:val="4"/>
+        </w:numPr>
+      </w:pPr>
+      <w:r>
+        <w:t>Deskriptive Statistiken</w:t>
+      </w:r>
+    </w:p>
+    <w:p>
+      <w:pPr>
+        <w:pStyle w:val="Listenabsatz"/>
+        <w:numPr>
+          <w:ilvl w:val="2"/>
+          <w:numId w:val="4"/>
+        </w:numPr>
+      </w:pPr>
+      <w:r>
+        <w:t>Schätzungen der Effektgröße</w:t>
+      </w:r>
+    </w:p>
+    <w:p>
+      <w:pPr>
+        <w:pStyle w:val="Listenabsatz"/>
+        <w:numPr>
+          <w:ilvl w:val="2"/>
+          <w:numId w:val="4"/>
+        </w:numPr>
+      </w:pPr>
+      <w:r>
+        <w:t xml:space="preserve">Homogenitätstests </w:t>
+      </w:r>
+    </w:p>
+    <w:p>
+      <w:pPr>
+        <w:pStyle w:val="Listenabsatz"/>
+        <w:numPr>
+          <w:ilvl w:val="2"/>
+          <w:numId w:val="4"/>
+        </w:numPr>
+      </w:pPr>
+      <w:r>
+        <w:t>Diagramme der Streubreite</w:t>
+      </w:r>
+    </w:p>
+    <w:p>
+      <w:pPr>
+        <w:jc w:val="center"/>
+      </w:pPr>
+      <w:r>
+        <w:drawing>
+          <wp:inline distT="0" distB="0" distL="0" distR="0" wp14:anchorId="3ACAD365" wp14:editId="0910AF1F">
+            <wp:extent cx="2560642" cy="2247900"/>
+            <wp:effectExtent l="0" t="0" r="0" b="0"/>
+            <wp:docPr id="17" name="Grafik 17" descr="Ein Bild, das Text enthält.&#10;&#10;Automatisch generierte Beschreibung"/>
+            <wp:cNvGraphicFramePr>
+              <a:graphicFrameLocks xmlns:a="http://schemas.openxmlformats.org/drawingml/2006/main" noChangeAspect="1"/>
+            </wp:cNvGraphicFramePr>
+            <a:graphic xmlns:a="http://schemas.openxmlformats.org/drawingml/2006/main">
+              <a:graphicData uri="http://schemas.openxmlformats.org/drawingml/2006/picture">
+                <pic:pic xmlns:pic="http://schemas.openxmlformats.org/drawingml/2006/picture">
+                  <pic:nvPicPr>
+                    <pic:cNvPr id="17" name="Grafik 17" descr="Ein Bild, das Text enthält.&#10;&#10;Automatisch generierte Beschreibung"/>
+                    <pic:cNvPicPr/>
+                  </pic:nvPicPr>
+                  <pic:blipFill>
+                    <a:blip r:embed="rId19"/>
+                    <a:stretch>
+                      <a:fillRect/>
+                    </a:stretch>
+                  </pic:blipFill>
+                  <pic:spPr>
+                    <a:xfrm>
+                      <a:off x="0" y="0"/>
+                      <a:ext cx="2613766" cy="2294535"/>
+                    </a:xfrm>
+                    <a:prstGeom prst="rect">
+                      <a:avLst/>
+                    </a:prstGeom>
+                  </pic:spPr>
+                </pic:pic>
+              </a:graphicData>
+            </a:graphic>
+          </wp:inline>
+        </w:drawing>
+      </w:r>
+    </w:p>
+    <w:p>
+      <w:pPr>
+        <w:pStyle w:val="Listenabsatz"/>
+        <w:numPr>
+          <w:ilvl w:val="1"/>
+          <w:numId w:val="4"/>
+        </w:numPr>
+      </w:pPr>
+      <w:r>
+        <w:lastRenderedPageBreak/>
+        <w:t>Diagramme:</w:t>
+      </w:r>
+    </w:p>
+    <w:p>
+      <w:pPr>
+        <w:pStyle w:val="Listenabsatz"/>
+        <w:numPr>
+          <w:ilvl w:val="2"/>
+          <w:numId w:val="4"/>
+        </w:numPr>
+      </w:pPr>
+      <w:r>
+        <w:t>Jeweils eines für die Abhängigen Variablen</w:t>
+      </w:r>
+    </w:p>
+    <w:p>
+      <w:pPr>
+        <w:pStyle w:val="Listenabsatz"/>
+        <w:numPr>
+          <w:ilvl w:val="2"/>
+          <w:numId w:val="4"/>
+        </w:numPr>
+      </w:pPr>
+      <w:r>
+        <w:t>Balkendiagramm</w:t>
+      </w:r>
+    </w:p>
+    <w:p>
+      <w:pPr>
+        <w:pStyle w:val="Listenabsatz"/>
+        <w:numPr>
+          <w:ilvl w:val="2"/>
+          <w:numId w:val="4"/>
+        </w:numPr>
+      </w:pPr>
+      <w:r>
+        <w:t>Fehlerbalken einschließen (Konfidenzintervall)</w:t>
+      </w:r>
+    </w:p>
+    <w:p>
+      <w:pPr>
+        <w:pStyle w:val="Listenabsatz"/>
+        <w:numPr>
+          <w:ilvl w:val="2"/>
+          <w:numId w:val="4"/>
+        </w:numPr>
+      </w:pPr>
+      <w:r>
+        <w:t>Bezugslinie für Gesamtintervall einschließen</w:t>
+      </w:r>
+    </w:p>
+    <w:p>
+      <w:pPr>
+        <w:jc w:val="center"/>
+      </w:pPr>
+      <w:r>
+        <w:drawing>
+          <wp:inline distT="0" distB="0" distL="0" distR="0" wp14:anchorId="61448847" wp14:editId="1CBA4AF4">
+            <wp:extent cx="1479550" cy="2405771"/>
+            <wp:effectExtent l="0" t="0" r="6350" b="0"/>
+            <wp:docPr id="16" name="Grafik 16" descr="Ein Bild, das Text enthält.&#10;&#10;Automatisch generierte Beschreibung"/>
+            <wp:cNvGraphicFramePr>
+              <a:graphicFrameLocks xmlns:a="http://schemas.openxmlformats.org/drawingml/2006/main" noChangeAspect="1"/>
+            </wp:cNvGraphicFramePr>
+            <a:graphic xmlns:a="http://schemas.openxmlformats.org/drawingml/2006/main">
+              <a:graphicData uri="http://schemas.openxmlformats.org/drawingml/2006/picture">
+                <pic:pic xmlns:pic="http://schemas.openxmlformats.org/drawingml/2006/picture">
+                  <pic:nvPicPr>
+                    <pic:cNvPr id="16" name="Grafik 16" descr="Ein Bild, das Text enthält.&#10;&#10;Automatisch generierte Beschreibung"/>
+                    <pic:cNvPicPr/>
+                  </pic:nvPicPr>
+                  <pic:blipFill>
+                    <a:blip r:embed="rId20"/>
+                    <a:stretch>
+                      <a:fillRect/>
+                    </a:stretch>
+                  </pic:blipFill>
+                  <pic:spPr>
+                    <a:xfrm>
+                      <a:off x="0" y="0"/>
+                      <a:ext cx="1491093" cy="2424540"/>
+                    </a:xfrm>
+                    <a:prstGeom prst="rect">
+                      <a:avLst/>
+                    </a:prstGeom>
+                  </pic:spPr>
+                </pic:pic>
+              </a:graphicData>
+            </a:graphic>
+          </wp:inline>
+        </w:drawing>
+      </w:r>
+    </w:p>
+    <w:p>
+      <w:pPr>
+        <w:pStyle w:val="Listenabsatz"/>
+        <w:numPr>
+          <w:ilvl w:val="1"/>
+          <w:numId w:val="4"/>
+        </w:numPr>
+      </w:pPr>
+      <w:r>
+        <w:t>Geschätzte Randmittel:</w:t>
+      </w:r>
+    </w:p>
+    <w:p>
+      <w:pPr>
+        <w:pStyle w:val="Listenabsatz"/>
+        <w:numPr>
+          <w:ilvl w:val="2"/>
+          <w:numId w:val="4"/>
+        </w:numPr>
+      </w:pPr>
+      <w:r>
+        <w:t>Für alle Faktoren und Interaktionen</w:t>
+      </w:r>
+    </w:p>
+    <w:p>
+      <w:pPr>
+        <w:pStyle w:val="Listenabsatz"/>
+        <w:numPr>
+          <w:ilvl w:val="2"/>
+          <w:numId w:val="4"/>
+        </w:numPr>
+      </w:pPr>
+      <w:r>
+        <w:t>Haupteffekte vergleichen</w:t>
+      </w:r>
+    </w:p>
+    <w:p>
+      <w:pPr>
+        <w:pStyle w:val="Listenabsatz"/>
+        <w:numPr>
+          <w:ilvl w:val="2"/>
+          <w:numId w:val="4"/>
+        </w:numPr>
+      </w:pPr>
+      <w:r>
+        <w:t>Einfache Haupteffekte vergleichen</w:t>
+      </w:r>
+    </w:p>
+    <w:p>
+      <w:pPr>
+        <w:pStyle w:val="Listenabsatz"/>
+        <w:numPr>
+          <w:ilvl w:val="2"/>
+          <w:numId w:val="4"/>
+        </w:numPr>
+      </w:pPr>
+      <w:r>
+        <w:t>Anpassung des Konfidenzintervalls: LSD (klein)</w:t>
+      </w:r>
+    </w:p>
+    <w:p>
+      <w:pPr>
+        <w:jc w:val="center"/>
+      </w:pPr>
+      <w:r>
+        <w:drawing>
+          <wp:inline distT="0" distB="0" distL="0" distR="0" wp14:anchorId="4D5D021D" wp14:editId="233331D3">
+            <wp:extent cx="2146300" cy="1154843"/>
+            <wp:effectExtent l="0" t="0" r="6350" b="7620"/>
+            <wp:docPr id="13" name="Grafik 13" descr="Ein Bild, das Text enthält.&#10;&#10;Automatisch generierte Beschreibung"/>
+            <wp:cNvGraphicFramePr>
+              <a:graphicFrameLocks xmlns:a="http://schemas.openxmlformats.org/drawingml/2006/main" noChangeAspect="1"/>
+            </wp:cNvGraphicFramePr>
+            <a:graphic xmlns:a="http://schemas.openxmlformats.org/drawingml/2006/main">
+              <a:graphicData uri="http://schemas.openxmlformats.org/drawingml/2006/picture">
+                <pic:pic xmlns:pic="http://schemas.openxmlformats.org/drawingml/2006/picture">
+                  <pic:nvPicPr>
+                    <pic:cNvPr id="13" name="Grafik 13" descr="Ein Bild, das Text enthält.&#10;&#10;Automatisch generierte Beschreibung"/>
+                    <pic:cNvPicPr/>
+                  </pic:nvPicPr>
+                  <pic:blipFill>
+                    <a:blip r:embed="rId21"/>
+                    <a:stretch>
+                      <a:fillRect/>
+                    </a:stretch>
+                  </pic:blipFill>
+                  <pic:spPr>
+                    <a:xfrm>
+                      <a:off x="0" y="0"/>
+                      <a:ext cx="2156741" cy="1160461"/>
+                    </a:xfrm>
+                    <a:prstGeom prst="rect">
+                      <a:avLst/>
+                    </a:prstGeom>
+                  </pic:spPr>
+                </pic:pic>
+              </a:graphicData>
+            </a:graphic>
+          </wp:inline>
+        </w:drawing>
+      </w:r>
+    </w:p>
+    <w:p>
+      <w:pPr>
+        <w:pStyle w:val="berschrift1"/>
+      </w:pPr>
+      <w:r>
         <w:t>Auswertungsstrategien</w:t>
       </w:r>
     </w:p>
@@ -1641,6 +1970,9 @@
       <w:r>
         <w:t>Gesamtanzahl</w:t>
       </w:r>
+      <w:r>
+        <w:t xml:space="preserve"> pro Versuch (0 / 0.2 / 0.4 / 0.6 / 0.8 / 1.0)</w:t>
+      </w:r>
     </w:p>
     <w:p>
       <w:pPr>
@@ -1669,6 +2001,793 @@
     </w:p>
     <w:p>
       <w:pPr>
+        <w:pStyle w:val="Listenabsatz"/>
+        <w:numPr>
+          <w:ilvl w:val="0"/>
+          <w:numId w:val="2"/>
+        </w:numPr>
+      </w:pPr>
+      <w:r>
+        <w:t>Import:</w:t>
+      </w:r>
+    </w:p>
+    <w:p>
+      <w:pPr>
+        <w:pStyle w:val="Listenabsatz"/>
+        <w:numPr>
+          <w:ilvl w:val="1"/>
+          <w:numId w:val="2"/>
+        </w:numPr>
+        <w:rPr>
+          <w:lang w:val="en-GB"/>
+        </w:rPr>
+      </w:pPr>
+      <w:r>
+        <w:rPr>
+          <w:lang w:val="en-GB"/>
+        </w:rPr>
+        <w:t>export/rate</w:t>
+      </w:r>
+      <w:r>
+        <w:rPr>
+          <w:lang w:val="en-GB"/>
+        </w:rPr>
+        <w:t>s</w:t>
+      </w:r>
+      <w:r>
+        <w:rPr>
+          <w:lang w:val="en-GB"/>
+        </w:rPr>
+        <w:t>_su</w:t>
+      </w:r>
+      <w:r>
+        <w:rPr>
+          <w:lang w:val="en-GB"/>
+        </w:rPr>
+        <w:t>b</w:t>
+      </w:r>
+      <w:r>
+        <w:rPr>
+          <w:lang w:val="en-GB"/>
+        </w:rPr>
+        <w:t>ject_mapping_l</w:t>
+      </w:r>
+      <w:r>
+        <w:rPr>
+          <w:lang w:val="en-GB"/>
+        </w:rPr>
+        <w:t>ayers.csv</w:t>
+      </w:r>
+    </w:p>
+    <w:p>
+      <w:pPr>
+        <w:pStyle w:val="Listenabsatz"/>
+        <w:numPr>
+          <w:ilvl w:val="1"/>
+          <w:numId w:val="2"/>
+        </w:numPr>
+        <w:rPr>
+          <w:lang w:val="en-GB"/>
+        </w:rPr>
+      </w:pPr>
+      <w:proofErr w:type="spellStart"/>
+      <w:r>
+        <w:rPr>
+          <w:lang w:val="en-GB"/>
+        </w:rPr>
+        <w:t>Variablen</w:t>
+      </w:r>
+      <w:proofErr w:type="spellEnd"/>
+      <w:r>
+        <w:rPr>
+          <w:lang w:val="en-GB"/>
+        </w:rPr>
+        <w:t xml:space="preserve">: </w:t>
+      </w:r>
+    </w:p>
+    <w:p>
+      <w:pPr>
+        <w:pStyle w:val="Listenabsatz"/>
+        <w:numPr>
+          <w:ilvl w:val="2"/>
+          <w:numId w:val="2"/>
+        </w:numPr>
+        <w:rPr>
+          <w:lang w:val="en-GB"/>
+        </w:rPr>
+      </w:pPr>
+      <w:r>
+        <w:rPr>
+          <w:lang w:val="en-GB"/>
+        </w:rPr>
+        <w:t>V1/Proband/</w:t>
+      </w:r>
+      <w:proofErr w:type="spellStart"/>
+      <w:r>
+        <w:rPr>
+          <w:lang w:val="en-GB"/>
+        </w:rPr>
+        <w:t>MappingMet</w:t>
+      </w:r>
+      <w:r>
+        <w:rPr>
+          <w:lang w:val="en-GB"/>
+        </w:rPr>
+        <w:t>h</w:t>
+      </w:r>
+      <w:r>
+        <w:rPr>
+          <w:lang w:val="en-GB"/>
+        </w:rPr>
+        <w:t>od</w:t>
+      </w:r>
+      <w:proofErr w:type="spellEnd"/>
+      <w:r>
+        <w:rPr>
+          <w:lang w:val="en-GB"/>
+        </w:rPr>
+        <w:t>: Nominal</w:t>
+      </w:r>
+    </w:p>
+    <w:p>
+      <w:pPr>
+        <w:pStyle w:val="Listenabsatz"/>
+        <w:numPr>
+          <w:ilvl w:val="2"/>
+          <w:numId w:val="2"/>
+        </w:numPr>
+        <w:rPr>
+          <w:lang w:val="en-GB"/>
+        </w:rPr>
+      </w:pPr>
+      <w:proofErr w:type="spellStart"/>
+      <w:r>
+        <w:rPr>
+          <w:lang w:val="en-GB"/>
+        </w:rPr>
+        <w:t>NumLayers</w:t>
+      </w:r>
+      <w:proofErr w:type="spellEnd"/>
+      <w:r>
+        <w:rPr>
+          <w:lang w:val="en-GB"/>
+        </w:rPr>
+        <w:t>: Ordinal</w:t>
+      </w:r>
+    </w:p>
+    <w:p>
+      <w:pPr>
+        <w:pStyle w:val="Listenabsatz"/>
+        <w:numPr>
+          <w:ilvl w:val="2"/>
+          <w:numId w:val="2"/>
+        </w:numPr>
+        <w:rPr>
+          <w:lang w:val="en-GB"/>
+        </w:rPr>
+      </w:pPr>
+      <w:r>
+        <w:rPr>
+          <w:lang w:val="en-GB"/>
+        </w:rPr>
+        <w:t xml:space="preserve">Rest: </w:t>
+      </w:r>
+      <w:proofErr w:type="spellStart"/>
+      <w:r>
+        <w:rPr>
+          <w:lang w:val="en-GB"/>
+        </w:rPr>
+        <w:t>Metrisch</w:t>
+      </w:r>
+      <w:proofErr w:type="spellEnd"/>
+    </w:p>
+    <w:p>
+      <w:pPr>
+        <w:jc w:val="center"/>
+        <w:rPr>
+          <w:lang w:val="en-GB"/>
+        </w:rPr>
+      </w:pPr>
+      <w:r>
+        <w:rPr>
+          <w:lang w:val="en-GB"/>
+        </w:rPr>
+        <w:lastRenderedPageBreak/>
+        <w:drawing>
+          <wp:inline distT="0" distB="0" distL="0" distR="0" wp14:anchorId="2270C22E" wp14:editId="42EC996F">
+            <wp:extent cx="2235200" cy="1707560"/>
+            <wp:effectExtent l="0" t="0" r="0" b="6985"/>
+            <wp:docPr id="18" name="Grafik 18"/>
+            <wp:cNvGraphicFramePr>
+              <a:graphicFrameLocks xmlns:a="http://schemas.openxmlformats.org/drawingml/2006/main" noChangeAspect="1"/>
+            </wp:cNvGraphicFramePr>
+            <a:graphic xmlns:a="http://schemas.openxmlformats.org/drawingml/2006/main">
+              <a:graphicData uri="http://schemas.openxmlformats.org/drawingml/2006/picture">
+                <pic:pic xmlns:pic="http://schemas.openxmlformats.org/drawingml/2006/picture">
+                  <pic:nvPicPr>
+                    <pic:cNvPr id="1" name=""/>
+                    <pic:cNvPicPr/>
+                  </pic:nvPicPr>
+                  <pic:blipFill>
+                    <a:blip r:embed="rId22"/>
+                    <a:stretch>
+                      <a:fillRect/>
+                    </a:stretch>
+                  </pic:blipFill>
+                  <pic:spPr>
+                    <a:xfrm>
+                      <a:off x="0" y="0"/>
+                      <a:ext cx="2244613" cy="1714751"/>
+                    </a:xfrm>
+                    <a:prstGeom prst="rect">
+                      <a:avLst/>
+                    </a:prstGeom>
+                  </pic:spPr>
+                </pic:pic>
+              </a:graphicData>
+            </a:graphic>
+          </wp:inline>
+        </w:drawing>
+      </w:r>
+    </w:p>
+    <w:p>
+      <w:pPr>
+        <w:pStyle w:val="Listenabsatz"/>
+        <w:numPr>
+          <w:ilvl w:val="0"/>
+          <w:numId w:val="2"/>
+        </w:numPr>
+        <w:rPr>
+          <w:lang w:val="en-GB"/>
+        </w:rPr>
+      </w:pPr>
+      <w:r>
+        <w:rPr>
+          <w:lang w:val="en-GB"/>
+        </w:rPr>
+        <w:t>Export:</w:t>
+      </w:r>
+    </w:p>
+    <w:p>
+      <w:pPr>
+        <w:pStyle w:val="Listenabsatz"/>
+        <w:numPr>
+          <w:ilvl w:val="1"/>
+          <w:numId w:val="2"/>
+        </w:numPr>
+        <w:rPr>
+          <w:lang w:val="en-GB"/>
+        </w:rPr>
+      </w:pPr>
+      <w:proofErr w:type="spellStart"/>
+      <w:r>
+        <w:rPr>
+          <w:lang w:val="en-GB"/>
+        </w:rPr>
+        <w:t>d</w:t>
+      </w:r>
+      <w:r>
+        <w:rPr>
+          <w:lang w:val="en-GB"/>
+        </w:rPr>
+        <w:t>ata_rates_subject</w:t>
+      </w:r>
+      <w:r>
+        <w:rPr>
+          <w:lang w:val="en-GB"/>
+        </w:rPr>
+        <w:t>_mapping_layers.sav</w:t>
+      </w:r>
+      <w:proofErr w:type="spellEnd"/>
+    </w:p>
+    <w:p>
+      <w:pPr>
+        <w:pStyle w:val="Listenabsatz"/>
+        <w:numPr>
+          <w:ilvl w:val="1"/>
+          <w:numId w:val="2"/>
+        </w:numPr>
+        <w:rPr>
+          <w:lang w:val="en-GB"/>
+        </w:rPr>
+      </w:pPr>
+      <w:proofErr w:type="spellStart"/>
+      <w:r>
+        <w:rPr>
+          <w:lang w:val="en-GB"/>
+        </w:rPr>
+        <w:t>results_rates_subject_mapping_layers</w:t>
+      </w:r>
+      <w:r>
+        <w:rPr>
+          <w:lang w:val="en-GB"/>
+        </w:rPr>
+        <w:t>.spv</w:t>
+      </w:r>
+      <w:proofErr w:type="spellEnd"/>
+    </w:p>
+    <w:p>
+      <w:pPr>
+        <w:pStyle w:val="Listenabsatz"/>
+        <w:numPr>
+          <w:ilvl w:val="0"/>
+          <w:numId w:val="2"/>
+        </w:numPr>
+        <w:rPr>
+          <w:lang w:val="en-GB"/>
+        </w:rPr>
+      </w:pPr>
+      <w:r>
+        <w:rPr>
+          <w:lang w:val="en-GB"/>
+        </w:rPr>
+        <w:t xml:space="preserve">ANOVA </w:t>
+      </w:r>
+      <w:proofErr w:type="spellStart"/>
+      <w:r>
+        <w:rPr>
+          <w:lang w:val="en-GB"/>
+        </w:rPr>
+        <w:t>für</w:t>
+      </w:r>
+      <w:proofErr w:type="spellEnd"/>
+      <w:r>
+        <w:rPr>
+          <w:lang w:val="en-GB"/>
+        </w:rPr>
+        <w:t>:</w:t>
+      </w:r>
+    </w:p>
+    <w:p>
+      <w:pPr>
+        <w:pStyle w:val="Listenabsatz"/>
+        <w:numPr>
+          <w:ilvl w:val="1"/>
+          <w:numId w:val="2"/>
+        </w:numPr>
+        <w:rPr>
+          <w:lang w:val="en-GB"/>
+        </w:rPr>
+      </w:pPr>
+      <w:proofErr w:type="spellStart"/>
+      <w:r>
+        <w:rPr>
+          <w:lang w:val="en-GB"/>
+        </w:rPr>
+        <w:t>Completed_Abs</w:t>
+      </w:r>
+      <w:proofErr w:type="spellEnd"/>
+      <w:r>
+        <w:rPr>
+          <w:lang w:val="en-GB"/>
+        </w:rPr>
+        <w:t xml:space="preserve">, </w:t>
+      </w:r>
+      <w:proofErr w:type="spellStart"/>
+      <w:r>
+        <w:rPr>
+          <w:lang w:val="en-GB"/>
+        </w:rPr>
+        <w:t>Completed_Rel</w:t>
+      </w:r>
+      <w:proofErr w:type="spellEnd"/>
+      <w:r>
+        <w:rPr>
+          <w:lang w:val="en-GB"/>
+        </w:rPr>
+        <w:t xml:space="preserve"> (</w:t>
+      </w:r>
+      <w:proofErr w:type="spellStart"/>
+      <w:r>
+        <w:rPr>
+          <w:lang w:val="en-GB"/>
+        </w:rPr>
+        <w:t>kein</w:t>
+      </w:r>
+      <w:proofErr w:type="spellEnd"/>
+      <w:r>
+        <w:rPr>
+          <w:lang w:val="en-GB"/>
+        </w:rPr>
+        <w:t xml:space="preserve"> </w:t>
+      </w:r>
+      <w:proofErr w:type="spellStart"/>
+      <w:r>
+        <w:rPr>
+          <w:lang w:val="en-GB"/>
+        </w:rPr>
+        <w:t>Unterschied</w:t>
+      </w:r>
+      <w:proofErr w:type="spellEnd"/>
+      <w:r>
+        <w:rPr>
+          <w:lang w:val="en-GB"/>
+        </w:rPr>
+        <w:t>)</w:t>
+      </w:r>
+    </w:p>
+    <w:p>
+      <w:pPr>
+        <w:pStyle w:val="Listenabsatz"/>
+        <w:numPr>
+          <w:ilvl w:val="1"/>
+          <w:numId w:val="2"/>
+        </w:numPr>
+        <w:rPr>
+          <w:lang w:val="en-GB"/>
+        </w:rPr>
+      </w:pPr>
+      <w:proofErr w:type="spellStart"/>
+      <w:r>
+        <w:rPr>
+          <w:lang w:val="en-GB"/>
+        </w:rPr>
+        <w:t>Terminated_Abs</w:t>
+      </w:r>
+      <w:proofErr w:type="spellEnd"/>
+      <w:r>
+        <w:rPr>
+          <w:lang w:val="en-GB"/>
+        </w:rPr>
+        <w:t>,</w:t>
+      </w:r>
+    </w:p>
+    <w:p>
+      <w:pPr>
+        <w:pStyle w:val="Listenabsatz"/>
+        <w:numPr>
+          <w:ilvl w:val="1"/>
+          <w:numId w:val="2"/>
+        </w:numPr>
+        <w:rPr>
+          <w:lang w:val="en-GB"/>
+        </w:rPr>
+      </w:pPr>
+      <w:proofErr w:type="spellStart"/>
+      <w:r>
+        <w:rPr>
+          <w:lang w:val="en-GB"/>
+        </w:rPr>
+        <w:t>Failed_Abs</w:t>
+      </w:r>
+      <w:proofErr w:type="spellEnd"/>
+    </w:p>
+    <w:p>
+      <w:pPr>
+        <w:pStyle w:val="Listenabsatz"/>
+        <w:numPr>
+          <w:ilvl w:val="0"/>
+          <w:numId w:val="2"/>
+        </w:numPr>
+        <w:rPr>
+          <w:lang w:val="en-GB"/>
+        </w:rPr>
+      </w:pPr>
+      <w:proofErr w:type="spellStart"/>
+      <w:r>
+        <w:rPr>
+          <w:lang w:val="en-GB"/>
+        </w:rPr>
+        <w:t>Ergebnis</w:t>
+      </w:r>
+      <w:proofErr w:type="spellEnd"/>
+      <w:r>
+        <w:rPr>
+          <w:lang w:val="en-GB"/>
+        </w:rPr>
+        <w:t>:</w:t>
+      </w:r>
+    </w:p>
+    <w:p>
+      <w:pPr>
+        <w:pStyle w:val="Listenabsatz"/>
+        <w:numPr>
+          <w:ilvl w:val="1"/>
+          <w:numId w:val="2"/>
+        </w:numPr>
+      </w:pPr>
+      <w:r>
+        <w:t xml:space="preserve">Signifikanter Effekt: </w:t>
+      </w:r>
+      <w:proofErr w:type="spellStart"/>
+      <w:r>
+        <w:t>MappingMethod</w:t>
+      </w:r>
+      <w:proofErr w:type="spellEnd"/>
+      <w:r>
+        <w:t xml:space="preserve"> (&lt;0,001)</w:t>
+      </w:r>
+      <w:r>
+        <w:t xml:space="preserve"> </w:t>
+      </w:r>
+    </w:p>
+    <w:p>
+      <w:pPr>
+        <w:pStyle w:val="Listenabsatz"/>
+        <w:numPr>
+          <w:ilvl w:val="1"/>
+          <w:numId w:val="2"/>
+        </w:numPr>
+      </w:pPr>
+      <w:proofErr w:type="spellStart"/>
+      <w:r>
+        <w:t>Widening</w:t>
+      </w:r>
+      <w:proofErr w:type="spellEnd"/>
+      <w:r>
+        <w:t xml:space="preserve"> mit stärkstem Effekt (&lt;0,001 vs. </w:t>
+      </w:r>
+      <w:proofErr w:type="spellStart"/>
+      <w:r>
+        <w:t>direct</w:t>
+      </w:r>
+      <w:proofErr w:type="spellEnd"/>
+      <w:r>
+        <w:t xml:space="preserve"> und </w:t>
+      </w:r>
+      <w:proofErr w:type="spellStart"/>
+      <w:r>
+        <w:t>densening</w:t>
+      </w:r>
+      <w:proofErr w:type="spellEnd"/>
+      <w:r>
+        <w:t>)</w:t>
+      </w:r>
+      <w:r>
+        <w:t xml:space="preserve"> </w:t>
+      </w:r>
+    </w:p>
+    <w:p>
+      <w:pPr>
+        <w:pStyle w:val="Listenabsatz"/>
+        <w:numPr>
+          <w:ilvl w:val="1"/>
+          <w:numId w:val="2"/>
+        </w:numPr>
+      </w:pPr>
+      <w:proofErr w:type="spellStart"/>
+      <w:r>
+        <w:t>Widening</w:t>
+      </w:r>
+      <w:proofErr w:type="spellEnd"/>
+      <w:r>
+        <w:t xml:space="preserve"> deutlich unterdurchschnittlich</w:t>
+      </w:r>
+    </w:p>
+    <w:p>
+      <w:pPr>
+        <w:pStyle w:val="Listenabsatz"/>
+        <w:numPr>
+          <w:ilvl w:val="1"/>
+          <w:numId w:val="2"/>
+        </w:numPr>
+      </w:pPr>
+      <w:proofErr w:type="spellStart"/>
+      <w:r>
+        <w:t>Direct</w:t>
+      </w:r>
+      <w:proofErr w:type="spellEnd"/>
+      <w:r>
+        <w:t xml:space="preserve"> / </w:t>
+      </w:r>
+      <w:proofErr w:type="spellStart"/>
+      <w:r>
+        <w:t>Densening</w:t>
+      </w:r>
+      <w:proofErr w:type="spellEnd"/>
+      <w:r>
+        <w:t xml:space="preserve">: kein signifikanter </w:t>
+      </w:r>
+      <w:proofErr w:type="gramStart"/>
+      <w:r>
+        <w:t>Effekt !</w:t>
+      </w:r>
+      <w:proofErr w:type="gramEnd"/>
+    </w:p>
+    <w:p>
+      <w:pPr>
+        <w:pStyle w:val="Listenabsatz"/>
+        <w:numPr>
+          <w:ilvl w:val="1"/>
+          <w:numId w:val="2"/>
+        </w:numPr>
+      </w:pPr>
+      <w:proofErr w:type="spellStart"/>
+      <w:r>
+        <w:t>NumLayers</w:t>
+      </w:r>
+      <w:proofErr w:type="spellEnd"/>
+      <w:r>
+        <w:t>: kein Effekt (</w:t>
+      </w:r>
+      <w:proofErr w:type="spellStart"/>
+      <w:r>
+        <w:t>Sig</w:t>
+      </w:r>
+      <w:proofErr w:type="spellEnd"/>
+      <w:r>
+        <w:t>: 0,117)</w:t>
+      </w:r>
+    </w:p>
+    <w:p>
+      <w:pPr>
+        <w:pStyle w:val="Listenabsatz"/>
+        <w:numPr>
+          <w:ilvl w:val="1"/>
+          <w:numId w:val="2"/>
+        </w:numPr>
+      </w:pPr>
+      <w:proofErr w:type="spellStart"/>
+      <w:r>
+        <w:t>MappingMethod</w:t>
+      </w:r>
+      <w:proofErr w:type="spellEnd"/>
+      <w:r>
+        <w:t xml:space="preserve"> * </w:t>
+      </w:r>
+      <w:proofErr w:type="spellStart"/>
+      <w:r>
+        <w:t>NumLayers</w:t>
+      </w:r>
+      <w:proofErr w:type="spellEnd"/>
+      <w:r>
+        <w:t>: kein Effekt (</w:t>
+      </w:r>
+      <w:proofErr w:type="gramStart"/>
+      <w:r>
+        <w:t>Sig.:,</w:t>
+      </w:r>
+      <w:proofErr w:type="gramEnd"/>
+      <w:r>
+        <w:t>951) !</w:t>
+      </w:r>
+    </w:p>
+    <w:p>
+      <w:pPr>
+        <w:pStyle w:val="Listenabsatz"/>
+        <w:numPr>
+          <w:ilvl w:val="1"/>
+          <w:numId w:val="2"/>
+        </w:numPr>
+      </w:pPr>
+      <w:r>
+        <w:t>Aber: unterschiedlich starke Ausprägung des Effekts bei verschiedenen Layer-Anzahlen:</w:t>
+      </w:r>
+    </w:p>
+    <w:p>
+      <w:pPr>
+        <w:pStyle w:val="Listenabsatz"/>
+        <w:numPr>
+          <w:ilvl w:val="2"/>
+          <w:numId w:val="2"/>
+        </w:numPr>
+      </w:pPr>
+      <w:r>
+        <w:t>6 Ebenen: Effekt nicht signifikant (</w:t>
+      </w:r>
+      <w:proofErr w:type="spellStart"/>
+      <w:r>
+        <w:t>Sig</w:t>
+      </w:r>
+      <w:proofErr w:type="spellEnd"/>
+      <w:r>
+        <w:t>. 0.5)</w:t>
+      </w:r>
+    </w:p>
+    <w:p>
+      <w:pPr>
+        <w:pStyle w:val="Listenabsatz"/>
+        <w:numPr>
+          <w:ilvl w:val="2"/>
+          <w:numId w:val="2"/>
+        </w:numPr>
+      </w:pPr>
+      <w:r>
+        <w:t xml:space="preserve">9, 15,18 Ebenen: Effekt </w:t>
+      </w:r>
+      <w:proofErr w:type="spellStart"/>
+      <w:r>
+        <w:t>hochsignifkant</w:t>
+      </w:r>
+      <w:proofErr w:type="spellEnd"/>
+      <w:r>
+        <w:t xml:space="preserve"> (</w:t>
+      </w:r>
+      <w:proofErr w:type="spellStart"/>
+      <w:r>
+        <w:t>Sig</w:t>
+      </w:r>
+      <w:proofErr w:type="spellEnd"/>
+      <w:r>
+        <w:t>. 0,007 / 0,006 / 0,009)</w:t>
+      </w:r>
+    </w:p>
+    <w:p>
+      <w:pPr>
+        <w:pStyle w:val="Listenabsatz"/>
+        <w:numPr>
+          <w:ilvl w:val="2"/>
+          <w:numId w:val="2"/>
+        </w:numPr>
+      </w:pPr>
+      <w:r>
+        <w:t>12 / 21 Ebenen: weniger stark: (0,03 / 0,028)</w:t>
+      </w:r>
+    </w:p>
+    <w:p>
+      <w:pPr>
+        <w:pStyle w:val="Listenabsatz"/>
+        <w:numPr>
+          <w:ilvl w:val="2"/>
+          <w:numId w:val="2"/>
+        </w:numPr>
+      </w:pPr>
+      <w:r>
+        <w:t>ABER: dieser Zusammenhang ist statistisch nicht signifikant (s.o.)</w:t>
+      </w:r>
+    </w:p>
+    <w:p>
+      <w:pPr>
+        <w:pStyle w:val="Listenabsatz"/>
+        <w:numPr>
+          <w:ilvl w:val="1"/>
+          <w:numId w:val="2"/>
+        </w:numPr>
+        <w:rPr>
+          <w:lang w:val="en-GB"/>
+        </w:rPr>
+      </w:pPr>
+      <w:proofErr w:type="spellStart"/>
+      <w:r>
+        <w:rPr>
+          <w:lang w:val="en-GB"/>
+        </w:rPr>
+        <w:t>Levene</w:t>
+      </w:r>
+      <w:proofErr w:type="spellEnd"/>
+      <w:r>
+        <w:rPr>
+          <w:lang w:val="en-GB"/>
+        </w:rPr>
+        <w:t xml:space="preserve">-Test: </w:t>
+      </w:r>
+      <w:proofErr w:type="spellStart"/>
+      <w:r>
+        <w:rPr>
+          <w:lang w:val="en-GB"/>
+        </w:rPr>
+        <w:t>Nullhypothese</w:t>
+      </w:r>
+      <w:proofErr w:type="spellEnd"/>
+      <w:r>
+        <w:rPr>
+          <w:lang w:val="en-GB"/>
+        </w:rPr>
+        <w:t xml:space="preserve"> </w:t>
+      </w:r>
+      <w:proofErr w:type="spellStart"/>
+      <w:r>
+        <w:rPr>
+          <w:lang w:val="en-GB"/>
+        </w:rPr>
+        <w:t>erfüllt</w:t>
+      </w:r>
+      <w:proofErr w:type="spellEnd"/>
+      <w:r>
+        <w:rPr>
+          <w:lang w:val="en-GB"/>
+        </w:rPr>
+        <w:t xml:space="preserve"> (S</w:t>
+      </w:r>
+      <w:r>
+        <w:rPr>
+          <w:lang w:val="en-GB"/>
+        </w:rPr>
+        <w:t>ig &gt; 0,8)</w:t>
+      </w:r>
+    </w:p>
+    <w:p>
+      <w:pPr>
         <w:pStyle w:val="berschrift3"/>
       </w:pPr>
       <w:r>
@@ -1759,6 +2878,378 @@
     </w:p>
     <w:p>
       <w:pPr>
+        <w:pStyle w:val="Listenabsatz"/>
+        <w:numPr>
+          <w:ilvl w:val="0"/>
+          <w:numId w:val="2"/>
+        </w:numPr>
+      </w:pPr>
+      <w:r>
+        <w:t>Import/Export: s.o.</w:t>
+      </w:r>
+    </w:p>
+    <w:p>
+      <w:pPr>
+        <w:pStyle w:val="Listenabsatz"/>
+        <w:numPr>
+          <w:ilvl w:val="0"/>
+          <w:numId w:val="2"/>
+        </w:numPr>
+      </w:pPr>
+      <w:r>
+        <w:t>Ergebnis:</w:t>
+      </w:r>
+    </w:p>
+    <w:p>
+      <w:pPr>
+        <w:pStyle w:val="Listenabsatz"/>
+        <w:numPr>
+          <w:ilvl w:val="1"/>
+          <w:numId w:val="2"/>
+        </w:numPr>
+      </w:pPr>
+      <w:r>
+        <w:t xml:space="preserve">Signifikanter Effekt: </w:t>
+      </w:r>
+      <w:proofErr w:type="spellStart"/>
+      <w:r>
+        <w:t>MappingMethod</w:t>
+      </w:r>
+      <w:proofErr w:type="spellEnd"/>
+      <w:r>
+        <w:t xml:space="preserve"> (&lt;0,001) </w:t>
+      </w:r>
+    </w:p>
+    <w:p>
+      <w:pPr>
+        <w:pStyle w:val="Listenabsatz"/>
+        <w:numPr>
+          <w:ilvl w:val="1"/>
+          <w:numId w:val="2"/>
+        </w:numPr>
+      </w:pPr>
+      <w:proofErr w:type="spellStart"/>
+      <w:r>
+        <w:t>Widening</w:t>
+      </w:r>
+      <w:proofErr w:type="spellEnd"/>
+      <w:r>
+        <w:t xml:space="preserve"> mit stärkstem Effekt (&lt;0,001 vs. </w:t>
+      </w:r>
+      <w:proofErr w:type="spellStart"/>
+      <w:r>
+        <w:t>direct</w:t>
+      </w:r>
+      <w:proofErr w:type="spellEnd"/>
+      <w:r>
+        <w:t xml:space="preserve"> und </w:t>
+      </w:r>
+      <w:proofErr w:type="spellStart"/>
+      <w:r>
+        <w:t>densening</w:t>
+      </w:r>
+      <w:proofErr w:type="spellEnd"/>
+      <w:r>
+        <w:t xml:space="preserve">) </w:t>
+      </w:r>
+    </w:p>
+    <w:p>
+      <w:pPr>
+        <w:pStyle w:val="Listenabsatz"/>
+        <w:numPr>
+          <w:ilvl w:val="1"/>
+          <w:numId w:val="2"/>
+        </w:numPr>
+      </w:pPr>
+      <w:proofErr w:type="spellStart"/>
+      <w:r>
+        <w:t>Widening</w:t>
+      </w:r>
+      <w:proofErr w:type="spellEnd"/>
+      <w:r>
+        <w:t xml:space="preserve"> deutlich </w:t>
+      </w:r>
+      <w:proofErr w:type="spellStart"/>
+      <w:r>
+        <w:t>überdsuchschnittlich</w:t>
+      </w:r>
+      <w:proofErr w:type="spellEnd"/>
+    </w:p>
+    <w:p>
+      <w:pPr>
+        <w:pStyle w:val="Listenabsatz"/>
+        <w:numPr>
+          <w:ilvl w:val="1"/>
+          <w:numId w:val="2"/>
+        </w:numPr>
+      </w:pPr>
+      <w:proofErr w:type="spellStart"/>
+      <w:r>
+        <w:t>Direct</w:t>
+      </w:r>
+      <w:proofErr w:type="spellEnd"/>
+      <w:r>
+        <w:t xml:space="preserve"> / </w:t>
+      </w:r>
+      <w:proofErr w:type="spellStart"/>
+      <w:r>
+        <w:t>Densening</w:t>
+      </w:r>
+      <w:proofErr w:type="spellEnd"/>
+      <w:r>
+        <w:t xml:space="preserve">: kein signifikanter </w:t>
+      </w:r>
+      <w:proofErr w:type="gramStart"/>
+      <w:r>
+        <w:t>Effekt !</w:t>
+      </w:r>
+      <w:proofErr w:type="gramEnd"/>
+    </w:p>
+    <w:p>
+      <w:pPr>
+        <w:pStyle w:val="Listenabsatz"/>
+        <w:numPr>
+          <w:ilvl w:val="1"/>
+          <w:numId w:val="2"/>
+        </w:numPr>
+      </w:pPr>
+      <w:proofErr w:type="spellStart"/>
+      <w:r>
+        <w:t>MappingMethod</w:t>
+      </w:r>
+      <w:proofErr w:type="spellEnd"/>
+      <w:r>
+        <w:t xml:space="preserve"> * </w:t>
+      </w:r>
+      <w:proofErr w:type="spellStart"/>
+      <w:r>
+        <w:t>NumLayers</w:t>
+      </w:r>
+      <w:proofErr w:type="spellEnd"/>
+      <w:r>
+        <w:t>: kein Effekt (</w:t>
+      </w:r>
+      <w:proofErr w:type="gramStart"/>
+      <w:r>
+        <w:t>Sig.:,</w:t>
+      </w:r>
+      <w:proofErr w:type="gramEnd"/>
+      <w:r>
+        <w:t>9</w:t>
+      </w:r>
+      <w:r>
+        <w:t>4</w:t>
+      </w:r>
+      <w:r>
+        <w:t>) !</w:t>
+      </w:r>
+    </w:p>
+    <w:p>
+      <w:pPr>
+        <w:pStyle w:val="Listenabsatz"/>
+        <w:numPr>
+          <w:ilvl w:val="1"/>
+          <w:numId w:val="2"/>
+        </w:numPr>
+      </w:pPr>
+      <w:r>
+        <w:t>Aber: unterschiedlich starke Ausprägung des Effekts bei verschiedenen Layer-Anzahlen:</w:t>
+      </w:r>
+    </w:p>
+    <w:p>
+      <w:pPr>
+        <w:pStyle w:val="Listenabsatz"/>
+        <w:numPr>
+          <w:ilvl w:val="2"/>
+          <w:numId w:val="2"/>
+        </w:numPr>
+      </w:pPr>
+      <w:r>
+        <w:t xml:space="preserve">6 </w:t>
+      </w:r>
+      <w:r>
+        <w:t xml:space="preserve">/ 21 </w:t>
+      </w:r>
+      <w:r>
+        <w:t>Ebenen: Effekt nicht signifikant (</w:t>
+      </w:r>
+      <w:proofErr w:type="spellStart"/>
+      <w:r>
+        <w:t>Sig</w:t>
+      </w:r>
+      <w:proofErr w:type="spellEnd"/>
+      <w:r>
+        <w:t>. 0</w:t>
+      </w:r>
+      <w:r>
+        <w:t>,67 / 0,28</w:t>
+      </w:r>
+      <w:r>
+        <w:t>)</w:t>
+      </w:r>
+    </w:p>
+    <w:p>
+      <w:pPr>
+        <w:pStyle w:val="Listenabsatz"/>
+        <w:numPr>
+          <w:ilvl w:val="2"/>
+          <w:numId w:val="2"/>
+        </w:numPr>
+      </w:pPr>
+      <w:r>
+        <w:t xml:space="preserve">9: Effekt </w:t>
+      </w:r>
+      <w:proofErr w:type="spellStart"/>
+      <w:r>
+        <w:t>hochsignifkant</w:t>
+      </w:r>
+      <w:proofErr w:type="spellEnd"/>
+      <w:r>
+        <w:t xml:space="preserve"> (</w:t>
+      </w:r>
+      <w:proofErr w:type="spellStart"/>
+      <w:r>
+        <w:t>Sig</w:t>
+      </w:r>
+      <w:proofErr w:type="spellEnd"/>
+      <w:r>
+        <w:t>. 0,00</w:t>
+      </w:r>
+      <w:r>
+        <w:t>8</w:t>
+      </w:r>
+      <w:r>
+        <w:t>)</w:t>
+      </w:r>
+    </w:p>
+    <w:p>
+      <w:pPr>
+        <w:pStyle w:val="Listenabsatz"/>
+        <w:numPr>
+          <w:ilvl w:val="2"/>
+          <w:numId w:val="2"/>
+        </w:numPr>
+      </w:pPr>
+      <w:r>
+        <w:t xml:space="preserve">12 </w:t>
+      </w:r>
+      <w:r>
+        <w:t xml:space="preserve">/ 15 / </w:t>
+      </w:r>
+      <w:proofErr w:type="gramStart"/>
+      <w:r>
+        <w:t xml:space="preserve">18 </w:t>
+      </w:r>
+      <w:r>
+        <w:t xml:space="preserve"> Ebenen</w:t>
+      </w:r>
+      <w:proofErr w:type="gramEnd"/>
+      <w:r>
+        <w:t>: weniger stark: (</w:t>
+      </w:r>
+      <w:r>
+        <w:t xml:space="preserve">0,072 / </w:t>
+      </w:r>
+      <w:r>
+        <w:t>0,03</w:t>
+      </w:r>
+      <w:r>
+        <w:t>5</w:t>
+      </w:r>
+      <w:r>
+        <w:t xml:space="preserve"> / 0,0</w:t>
+      </w:r>
+      <w:r>
+        <w:t>35</w:t>
+      </w:r>
+      <w:r>
+        <w:t>)</w:t>
+      </w:r>
+    </w:p>
+    <w:p>
+      <w:pPr>
+        <w:pStyle w:val="Listenabsatz"/>
+        <w:numPr>
+          <w:ilvl w:val="2"/>
+          <w:numId w:val="2"/>
+        </w:numPr>
+      </w:pPr>
+      <w:r>
+        <w:lastRenderedPageBreak/>
+        <w:t>ABER: dieser Zusammenhang ist statistisch nicht signifikant (s.o.)</w:t>
+      </w:r>
+    </w:p>
+    <w:p>
+      <w:pPr>
+        <w:pStyle w:val="Listenabsatz"/>
+        <w:numPr>
+          <w:ilvl w:val="1"/>
+          <w:numId w:val="2"/>
+        </w:numPr>
+        <w:rPr>
+          <w:lang w:val="en-GB"/>
+        </w:rPr>
+      </w:pPr>
+      <w:proofErr w:type="spellStart"/>
+      <w:r>
+        <w:rPr>
+          <w:lang w:val="en-GB"/>
+        </w:rPr>
+        <w:t>Levene</w:t>
+      </w:r>
+      <w:proofErr w:type="spellEnd"/>
+      <w:r>
+        <w:rPr>
+          <w:lang w:val="en-GB"/>
+        </w:rPr>
+        <w:t xml:space="preserve">-Test: </w:t>
+      </w:r>
+      <w:proofErr w:type="spellStart"/>
+      <w:r>
+        <w:rPr>
+          <w:lang w:val="en-GB"/>
+        </w:rPr>
+        <w:t>Nullhypothese</w:t>
+      </w:r>
+      <w:proofErr w:type="spellEnd"/>
+      <w:r>
+        <w:rPr>
+          <w:lang w:val="en-GB"/>
+        </w:rPr>
+        <w:t xml:space="preserve"> </w:t>
+      </w:r>
+      <w:proofErr w:type="spellStart"/>
+      <w:r>
+        <w:rPr>
+          <w:lang w:val="en-GB"/>
+        </w:rPr>
+        <w:t>erfüllt</w:t>
+      </w:r>
+      <w:proofErr w:type="spellEnd"/>
+      <w:r>
+        <w:rPr>
+          <w:lang w:val="en-GB"/>
+        </w:rPr>
+        <w:t xml:space="preserve"> (S</w:t>
+      </w:r>
+      <w:r>
+        <w:rPr>
+          <w:lang w:val="en-GB"/>
+        </w:rPr>
+        <w:t>ig &gt; 0,8)</w:t>
+      </w:r>
+    </w:p>
+    <w:p>
+      <w:pPr>
+        <w:pStyle w:val="Listenabsatz"/>
+        <w:numPr>
+          <w:ilvl w:val="1"/>
+          <w:numId w:val="2"/>
+        </w:numPr>
+      </w:pPr>
+    </w:p>
+    <w:p>
+      <w:pPr>
         <w:pStyle w:val="berschrift3"/>
       </w:pPr>
       <w:r>
@@ -1847,12 +3338,168 @@
     <w:p>
       <w:pPr>
         <w:pStyle w:val="Listenabsatz"/>
-      </w:pPr>
-    </w:p>
-    <w:p>
-      <w:pPr>
-        <w:pStyle w:val="Listenabsatz"/>
-      </w:pPr>
+        <w:numPr>
+          <w:ilvl w:val="0"/>
+          <w:numId w:val="2"/>
+        </w:numPr>
+      </w:pPr>
+      <w:r>
+        <w:t>Import/Export: s.o.</w:t>
+      </w:r>
+    </w:p>
+    <w:p>
+      <w:pPr>
+        <w:pStyle w:val="Listenabsatz"/>
+        <w:numPr>
+          <w:ilvl w:val="0"/>
+          <w:numId w:val="2"/>
+        </w:numPr>
+      </w:pPr>
+      <w:r>
+        <w:t>Ergebnis:</w:t>
+      </w:r>
+    </w:p>
+    <w:p>
+      <w:pPr>
+        <w:pStyle w:val="Listenabsatz"/>
+        <w:numPr>
+          <w:ilvl w:val="1"/>
+          <w:numId w:val="2"/>
+        </w:numPr>
+        <w:rPr>
+          <w:lang w:val="en-GB"/>
+        </w:rPr>
+      </w:pPr>
+      <w:proofErr w:type="spellStart"/>
+      <w:r>
+        <w:rPr>
+          <w:lang w:val="en-GB"/>
+        </w:rPr>
+        <w:t>NumLayers</w:t>
+      </w:r>
+      <w:proofErr w:type="spellEnd"/>
+      <w:r>
+        <w:rPr>
+          <w:lang w:val="en-GB"/>
+        </w:rPr>
+        <w:t xml:space="preserve"> FAST </w:t>
+      </w:r>
+      <w:proofErr w:type="spellStart"/>
+      <w:r>
+        <w:rPr>
+          <w:lang w:val="en-GB"/>
+        </w:rPr>
+        <w:t>signifikant</w:t>
+      </w:r>
+      <w:proofErr w:type="spellEnd"/>
+      <w:r>
+        <w:rPr>
+          <w:lang w:val="en-GB"/>
+        </w:rPr>
+        <w:t xml:space="preserve"> </w:t>
+      </w:r>
+      <w:proofErr w:type="spellStart"/>
+      <w:r>
+        <w:rPr>
+          <w:lang w:val="en-GB"/>
+        </w:rPr>
+        <w:t>bei</w:t>
+      </w:r>
+      <w:proofErr w:type="spellEnd"/>
+      <w:r>
+        <w:rPr>
+          <w:lang w:val="en-GB"/>
+        </w:rPr>
+        <w:t xml:space="preserve"> </w:t>
+      </w:r>
+      <w:proofErr w:type="spellStart"/>
+      <w:r>
+        <w:rPr>
+          <w:lang w:val="en-GB"/>
+        </w:rPr>
+        <w:t>Failed_A</w:t>
+      </w:r>
+      <w:r>
+        <w:rPr>
+          <w:lang w:val="en-GB"/>
+        </w:rPr>
+        <w:t>bs</w:t>
+      </w:r>
+      <w:proofErr w:type="spellEnd"/>
+      <w:r>
+        <w:rPr>
+          <w:lang w:val="en-GB"/>
+        </w:rPr>
+        <w:t xml:space="preserve"> (Sig 0.055)</w:t>
+      </w:r>
+    </w:p>
+    <w:p>
+      <w:pPr>
+        <w:pStyle w:val="Listenabsatz"/>
+        <w:numPr>
+          <w:ilvl w:val="1"/>
+          <w:numId w:val="2"/>
+        </w:numPr>
+      </w:pPr>
+      <w:r>
+        <w:rPr>
+          <w:lang w:val="en-GB"/>
+        </w:rPr>
+        <w:t xml:space="preserve">Problem: </w:t>
+      </w:r>
+      <w:proofErr w:type="spellStart"/>
+      <w:r>
+        <w:rPr>
+          <w:lang w:val="en-GB"/>
+        </w:rPr>
+        <w:t>Levene</w:t>
+      </w:r>
+      <w:proofErr w:type="spellEnd"/>
+      <w:r>
+        <w:rPr>
+          <w:lang w:val="en-GB"/>
+        </w:rPr>
+        <w:t xml:space="preserve">-Test </w:t>
+      </w:r>
+      <w:proofErr w:type="spellStart"/>
+      <w:r>
+        <w:rPr>
+          <w:lang w:val="en-GB"/>
+        </w:rPr>
+        <w:t>bei</w:t>
+      </w:r>
+      <w:proofErr w:type="spellEnd"/>
+      <w:r>
+        <w:rPr>
+          <w:lang w:val="en-GB"/>
+        </w:rPr>
+        <w:t xml:space="preserve"> </w:t>
+      </w:r>
+      <w:proofErr w:type="spellStart"/>
+      <w:r>
+        <w:rPr>
+          <w:lang w:val="en-GB"/>
+        </w:rPr>
+        <w:t>Failed_Abs</w:t>
+      </w:r>
+      <w:proofErr w:type="spellEnd"/>
+      <w:r>
+        <w:rPr>
+          <w:lang w:val="en-GB"/>
+        </w:rPr>
+        <w:t xml:space="preserve"> Sig. </w:t>
+      </w:r>
+      <w:r>
+        <w:t>&lt; 0,001, d.h. zu große S</w:t>
+      </w:r>
+      <w:r>
+        <w:t>treuung, Aussagen sind nicht „</w:t>
+      </w:r>
+      <w:proofErr w:type="gramStart"/>
+      <w:r>
+        <w:t>vertrauenswürdig“</w:t>
+      </w:r>
+      <w:proofErr w:type="gramEnd"/>
     </w:p>
     <w:p>
       <w:pPr>
@@ -1925,6 +3572,173 @@
         <w:t>Ebenenanordnung</w:t>
       </w:r>
       <w:proofErr w:type="spellEnd"/>
+    </w:p>
+    <w:p>
+      <w:pPr>
+        <w:pStyle w:val="Listenabsatz"/>
+        <w:numPr>
+          <w:ilvl w:val="0"/>
+          <w:numId w:val="2"/>
+        </w:numPr>
+      </w:pPr>
+      <w:r>
+        <w:t>Import:</w:t>
+      </w:r>
+    </w:p>
+    <w:p>
+      <w:pPr>
+        <w:pStyle w:val="Listenabsatz"/>
+        <w:numPr>
+          <w:ilvl w:val="1"/>
+          <w:numId w:val="2"/>
+        </w:numPr>
+        <w:rPr>
+          <w:lang w:val="en-GB"/>
+        </w:rPr>
+      </w:pPr>
+      <w:r>
+        <w:rPr>
+          <w:lang w:val="en-GB"/>
+        </w:rPr>
+        <w:t>export/</w:t>
+      </w:r>
+      <w:r>
+        <w:rPr>
+          <w:lang w:val="en-GB"/>
+        </w:rPr>
+        <w:t>times</w:t>
+      </w:r>
+      <w:r>
+        <w:rPr>
+          <w:lang w:val="en-GB"/>
+        </w:rPr>
+        <w:t>.csv</w:t>
+      </w:r>
+    </w:p>
+    <w:p>
+      <w:pPr>
+        <w:pStyle w:val="Listenabsatz"/>
+        <w:numPr>
+          <w:ilvl w:val="1"/>
+          <w:numId w:val="2"/>
+        </w:numPr>
+        <w:rPr>
+          <w:lang w:val="en-GB"/>
+        </w:rPr>
+      </w:pPr>
+      <w:proofErr w:type="spellStart"/>
+      <w:r>
+        <w:rPr>
+          <w:lang w:val="en-GB"/>
+        </w:rPr>
+        <w:t>Variablen</w:t>
+      </w:r>
+      <w:proofErr w:type="spellEnd"/>
+      <w:r>
+        <w:rPr>
+          <w:lang w:val="en-GB"/>
+        </w:rPr>
+        <w:t xml:space="preserve">: </w:t>
+      </w:r>
+    </w:p>
+    <w:p>
+      <w:pPr>
+        <w:pStyle w:val="Listenabsatz"/>
+        <w:numPr>
+          <w:ilvl w:val="2"/>
+          <w:numId w:val="2"/>
+        </w:numPr>
+        <w:rPr>
+          <w:lang w:val="en-GB"/>
+        </w:rPr>
+      </w:pPr>
+      <w:r>
+        <w:rPr>
+          <w:lang w:val="en-GB"/>
+        </w:rPr>
+        <w:t>V1/Proband/</w:t>
+      </w:r>
+      <w:proofErr w:type="spellStart"/>
+      <w:r>
+        <w:rPr>
+          <w:lang w:val="en-GB"/>
+        </w:rPr>
+        <w:t>MappingMethod</w:t>
+      </w:r>
+      <w:proofErr w:type="spellEnd"/>
+      <w:r>
+        <w:rPr>
+          <w:lang w:val="en-GB"/>
+        </w:rPr>
+        <w:t>/Block/Task/Trial/Target</w:t>
+      </w:r>
+      <w:r>
+        <w:rPr>
+          <w:lang w:val="en-GB"/>
+        </w:rPr>
+        <w:t>: Nominal</w:t>
+      </w:r>
+    </w:p>
+    <w:p>
+      <w:pPr>
+        <w:pStyle w:val="Listenabsatz"/>
+        <w:numPr>
+          <w:ilvl w:val="2"/>
+          <w:numId w:val="2"/>
+        </w:numPr>
+        <w:rPr>
+          <w:lang w:val="en-GB"/>
+        </w:rPr>
+      </w:pPr>
+      <w:proofErr w:type="spellStart"/>
+      <w:r>
+        <w:rPr>
+          <w:lang w:val="en-GB"/>
+        </w:rPr>
+        <w:t>NumLayers</w:t>
+      </w:r>
+      <w:proofErr w:type="spellEnd"/>
+      <w:r>
+        <w:rPr>
+          <w:lang w:val="en-GB"/>
+        </w:rPr>
+        <w:t>: Ordinal</w:t>
+      </w:r>
+    </w:p>
+    <w:p>
+      <w:pPr>
+        <w:pStyle w:val="Listenabsatz"/>
+        <w:numPr>
+          <w:ilvl w:val="2"/>
+          <w:numId w:val="2"/>
+        </w:numPr>
+        <w:rPr>
+          <w:lang w:val="en-GB"/>
+        </w:rPr>
+      </w:pPr>
+      <w:r>
+        <w:rPr>
+          <w:lang w:val="en-GB"/>
+        </w:rPr>
+        <w:t xml:space="preserve">Rest: </w:t>
+      </w:r>
+      <w:proofErr w:type="spellStart"/>
+      <w:r>
+        <w:rPr>
+          <w:lang w:val="en-GB"/>
+        </w:rPr>
+        <w:t>Metrisch</w:t>
+      </w:r>
+      <w:proofErr w:type="spellEnd"/>
+    </w:p>
+    <w:p>
+      <w:pPr>
+        <w:pStyle w:val="Listenabsatz"/>
+        <w:numPr>
+          <w:ilvl w:val="1"/>
+          <w:numId w:val="2"/>
+        </w:numPr>
+      </w:pPr>
     </w:p>
     <w:p>
       <w:pPr>
@@ -2025,7 +3839,7 @@
           <w:lang w:val="en-GB"/>
         </w:rPr>
       </w:pPr>
-      <w:hyperlink r:id="rId19" w:history="1">
+      <w:hyperlink r:id="rId23" w:history="1">
         <w:r>
           <w:rPr>
             <w:rStyle w:val="Hyperlink"/>
@@ -2205,7 +4019,7 @@
         <w:rFonts w:ascii="Courier New" w:hAnsi="Courier New" w:cs="Courier New" w:hint="default"/>
       </w:rPr>
     </w:lvl>
-    <w:lvl w:ilvl="2" w:tplc="04070005" w:tentative="1">
+    <w:lvl w:ilvl="2" w:tplc="04070005">
       <w:start w:val="1"/>
       <w:numFmt w:val="bullet"/>
       <w:lvlText w:val=""/>
@@ -2217,7 +4031,7 @@
         <w:rFonts w:ascii="Wingdings" w:hAnsi="Wingdings" w:hint="default"/>
       </w:rPr>
     </w:lvl>
-    <w:lvl w:ilvl="3" w:tplc="04070001" w:tentative="1">
+    <w:lvl w:ilvl="3" w:tplc="04070001">
       <w:start w:val="1"/>
       <w:numFmt w:val="bullet"/>
       <w:lvlText w:val=""/>
@@ -2407,7 +4221,7 @@
         <w:rFonts w:ascii="Courier New" w:hAnsi="Courier New" w:cs="Courier New" w:hint="default"/>
       </w:rPr>
     </w:lvl>
-    <w:lvl w:ilvl="2" w:tplc="04070005" w:tentative="1">
+    <w:lvl w:ilvl="2" w:tplc="04070005">
       <w:start w:val="1"/>
       <w:numFmt w:val="bullet"/>
       <w:lvlText w:val=""/>

</xml_diff>

<commit_message>
feature: more spss stuff
</commit_message>
<xml_diff>
--- a/doc/Versuchsauswertung Zelasto.docx
+++ b/doc/Versuchsauswertung Zelasto.docx
@@ -1648,6 +1648,9 @@
         <w:jc w:val="center"/>
       </w:pPr>
       <w:r>
+        <w:rPr>
+          <w:noProof/>
+        </w:rPr>
         <w:drawing>
           <wp:inline distT="0" distB="0" distL="0" distR="0" wp14:anchorId="3ACAD365" wp14:editId="0910AF1F">
             <wp:extent cx="2560642" cy="2247900"/>
@@ -1751,6 +1754,9 @@
         <w:jc w:val="center"/>
       </w:pPr>
       <w:r>
+        <w:rPr>
+          <w:noProof/>
+        </w:rPr>
         <w:drawing>
           <wp:inline distT="0" distB="0" distL="0" distR="0" wp14:anchorId="61448847" wp14:editId="1CBA4AF4">
             <wp:extent cx="1479550" cy="2405771"/>
@@ -1853,6 +1859,9 @@
         <w:jc w:val="center"/>
       </w:pPr>
       <w:r>
+        <w:rPr>
+          <w:noProof/>
+        </w:rPr>
         <w:drawing>
           <wp:inline distT="0" distB="0" distL="0" distR="0" wp14:anchorId="4D5D021D" wp14:editId="233331D3">
             <wp:extent cx="2146300" cy="1154843"/>
@@ -2190,6 +2199,7 @@
       </w:pPr>
       <w:r>
         <w:rPr>
+          <w:noProof/>
           <w:lang w:val="en-GB"/>
         </w:rPr>
         <w:lastRenderedPageBreak/>
@@ -2264,6 +2274,20 @@
         <w:rPr>
           <w:lang w:val="en-GB"/>
         </w:rPr>
+        <w:t>spss</w:t>
+      </w:r>
+      <w:proofErr w:type="spellEnd"/>
+      <w:r>
+        <w:rPr>
+          <w:lang w:val="en-GB"/>
+        </w:rPr>
+        <w:t>/</w:t>
+      </w:r>
+      <w:proofErr w:type="spellStart"/>
+      <w:r>
+        <w:rPr>
+          <w:lang w:val="en-GB"/>
+        </w:rPr>
         <w:t>d</w:t>
       </w:r>
       <w:r>
@@ -2296,6 +2320,20 @@
         <w:rPr>
           <w:lang w:val="en-GB"/>
         </w:rPr>
+        <w:t>spss</w:t>
+      </w:r>
+      <w:proofErr w:type="spellEnd"/>
+      <w:r>
+        <w:rPr>
+          <w:lang w:val="en-GB"/>
+        </w:rPr>
+        <w:t>/</w:t>
+      </w:r>
+      <w:proofErr w:type="spellStart"/>
+      <w:r>
+        <w:rPr>
+          <w:lang w:val="en-GB"/>
+        </w:rPr>
         <w:t>results_rates_subject_mapping_layers</w:t>
       </w:r>
       <w:r>
@@ -2791,6 +2829,505 @@
         <w:pStyle w:val="berschrift3"/>
       </w:pPr>
       <w:r>
+        <w:t>Erfolgsquote als Messwiederholung</w:t>
+      </w:r>
+      <w:r>
+        <w:t xml:space="preserve"> </w:t>
+      </w:r>
+    </w:p>
+    <w:p>
+      <w:pPr>
+        <w:pStyle w:val="Listenabsatz"/>
+        <w:numPr>
+          <w:ilvl w:val="0"/>
+          <w:numId w:val="2"/>
+        </w:numPr>
+        <w:rPr>
+          <w:lang w:val="en-GB"/>
+        </w:rPr>
+      </w:pPr>
+      <w:r>
+        <w:rPr>
+          <w:lang w:val="en-GB"/>
+        </w:rPr>
+        <w:t>Export:</w:t>
+      </w:r>
+    </w:p>
+    <w:p>
+      <w:pPr>
+        <w:pStyle w:val="Listenabsatz"/>
+        <w:numPr>
+          <w:ilvl w:val="1"/>
+          <w:numId w:val="2"/>
+        </w:numPr>
+        <w:rPr>
+          <w:lang w:val="en-GB"/>
+        </w:rPr>
+      </w:pPr>
+      <w:proofErr w:type="spellStart"/>
+      <w:r>
+        <w:rPr>
+          <w:lang w:val="en-GB"/>
+        </w:rPr>
+        <w:t>spss</w:t>
+      </w:r>
+      <w:proofErr w:type="spellEnd"/>
+      <w:r>
+        <w:rPr>
+          <w:lang w:val="en-GB"/>
+        </w:rPr>
+        <w:t>/</w:t>
+      </w:r>
+      <w:proofErr w:type="spellStart"/>
+      <w:r>
+        <w:rPr>
+          <w:lang w:val="en-GB"/>
+        </w:rPr>
+        <w:t>data_rates_</w:t>
+      </w:r>
+      <w:r>
+        <w:rPr>
+          <w:lang w:val="en-GB"/>
+        </w:rPr>
+        <w:t>repeat</w:t>
+      </w:r>
+      <w:r>
+        <w:rPr>
+          <w:lang w:val="en-GB"/>
+        </w:rPr>
+        <w:t>.sav</w:t>
+      </w:r>
+      <w:proofErr w:type="spellEnd"/>
+    </w:p>
+    <w:p>
+      <w:pPr>
+        <w:pStyle w:val="Listenabsatz"/>
+        <w:numPr>
+          <w:ilvl w:val="1"/>
+          <w:numId w:val="2"/>
+        </w:numPr>
+        <w:rPr>
+          <w:lang w:val="en-GB"/>
+        </w:rPr>
+      </w:pPr>
+      <w:proofErr w:type="spellStart"/>
+      <w:r>
+        <w:rPr>
+          <w:lang w:val="en-GB"/>
+        </w:rPr>
+        <w:t>spss</w:t>
+      </w:r>
+      <w:proofErr w:type="spellEnd"/>
+      <w:r>
+        <w:rPr>
+          <w:lang w:val="en-GB"/>
+        </w:rPr>
+        <w:t>/</w:t>
+      </w:r>
+      <w:proofErr w:type="spellStart"/>
+      <w:r>
+        <w:rPr>
+          <w:lang w:val="en-GB"/>
+        </w:rPr>
+        <w:t>results_rates_</w:t>
+      </w:r>
+      <w:r>
+        <w:rPr>
+          <w:lang w:val="en-GB"/>
+        </w:rPr>
+        <w:t>repeat</w:t>
+      </w:r>
+      <w:r>
+        <w:rPr>
+          <w:lang w:val="en-GB"/>
+        </w:rPr>
+        <w:t>.spv</w:t>
+      </w:r>
+      <w:proofErr w:type="spellEnd"/>
+    </w:p>
+    <w:p>
+      <w:pPr>
+        <w:pStyle w:val="Listenabsatz"/>
+        <w:numPr>
+          <w:ilvl w:val="0"/>
+          <w:numId w:val="2"/>
+        </w:numPr>
+        <w:rPr>
+          <w:lang w:val="en-GB"/>
+        </w:rPr>
+      </w:pPr>
+      <w:proofErr w:type="spellStart"/>
+      <w:r>
+        <w:rPr>
+          <w:lang w:val="en-GB"/>
+        </w:rPr>
+        <w:t>Ergebnis</w:t>
+      </w:r>
+      <w:proofErr w:type="spellEnd"/>
+      <w:r>
+        <w:rPr>
+          <w:lang w:val="en-GB"/>
+        </w:rPr>
+        <w:t>:</w:t>
+      </w:r>
+    </w:p>
+    <w:p>
+      <w:pPr>
+        <w:pStyle w:val="Listenabsatz"/>
+        <w:numPr>
+          <w:ilvl w:val="1"/>
+          <w:numId w:val="2"/>
+        </w:numPr>
+      </w:pPr>
+      <w:proofErr w:type="gramStart"/>
+      <w:r>
+        <w:t xml:space="preserve">Im wesentlichen </w:t>
+      </w:r>
+      <w:r>
+        <w:t>B</w:t>
+      </w:r>
+      <w:r>
+        <w:t>estätigung</w:t>
+      </w:r>
+      <w:proofErr w:type="gramEnd"/>
+      <w:r>
+        <w:t xml:space="preserve"> für o</w:t>
+      </w:r>
+      <w:r>
+        <w:t>bige Ergebnisse</w:t>
+      </w:r>
+    </w:p>
+    <w:p>
+      <w:pPr>
+        <w:pStyle w:val="Listenabsatz"/>
+        <w:numPr>
+          <w:ilvl w:val="1"/>
+          <w:numId w:val="2"/>
+        </w:numPr>
+      </w:pPr>
+      <w:proofErr w:type="spellStart"/>
+      <w:r>
+        <w:t>MappingMethod</w:t>
+      </w:r>
+      <w:proofErr w:type="spellEnd"/>
+      <w:r>
+        <w:t>: signifikant (&lt;0,001)</w:t>
+      </w:r>
+    </w:p>
+    <w:p>
+      <w:pPr>
+        <w:pStyle w:val="Listenabsatz"/>
+        <w:numPr>
+          <w:ilvl w:val="1"/>
+          <w:numId w:val="2"/>
+        </w:numPr>
+      </w:pPr>
+      <w:r>
+        <w:t xml:space="preserve">Aber auch </w:t>
+      </w:r>
+      <w:proofErr w:type="spellStart"/>
+      <w:r>
+        <w:t>NumLayers</w:t>
+      </w:r>
+      <w:proofErr w:type="spellEnd"/>
+      <w:r>
+        <w:t xml:space="preserve"> (0,003)</w:t>
+      </w:r>
+      <w:r>
+        <w:t xml:space="preserve"> </w:t>
+      </w:r>
+    </w:p>
+    <w:p>
+      <w:pPr>
+        <w:pStyle w:val="Listenabsatz"/>
+        <w:numPr>
+          <w:ilvl w:val="1"/>
+          <w:numId w:val="2"/>
+        </w:numPr>
+      </w:pPr>
+      <w:r>
+        <w:t>Im Detail: 6 -21 schwach (0,01), 9-21 hoch (&lt;0,001) signifikant</w:t>
+      </w:r>
+    </w:p>
+    <w:p>
+      <w:pPr>
+        <w:pStyle w:val="Listenabsatz"/>
+        <w:numPr>
+          <w:ilvl w:val="1"/>
+          <w:numId w:val="2"/>
+        </w:numPr>
+      </w:pPr>
+      <w:r>
+        <w:t>ABER: Box-test (0,001) und Levene-Tests (</w:t>
+      </w:r>
+      <w:r>
+        <w:t>fast durchgängig &lt;0,001) zeigen Probleme bei der Datenlage auf</w:t>
+      </w:r>
+    </w:p>
+    <w:p>
+      <w:pPr>
+        <w:pStyle w:val="Listenabsatz"/>
+        <w:numPr>
+          <w:ilvl w:val="1"/>
+          <w:numId w:val="2"/>
+        </w:numPr>
+      </w:pPr>
+    </w:p>
+    <w:p>
+      <w:r>
+        <w:lastRenderedPageBreak/>
+        <w:drawing>
+          <wp:inline distT="0" distB="0" distL="0" distR="0" wp14:anchorId="44BAE635" wp14:editId="75C51595">
+            <wp:extent cx="2648319" cy="1561785"/>
+            <wp:effectExtent l="0" t="0" r="0" b="635"/>
+            <wp:docPr id="27" name="Grafik 27"/>
+            <wp:cNvGraphicFramePr>
+              <a:graphicFrameLocks xmlns:a="http://schemas.openxmlformats.org/drawingml/2006/main" noChangeAspect="1"/>
+            </wp:cNvGraphicFramePr>
+            <a:graphic xmlns:a="http://schemas.openxmlformats.org/drawingml/2006/main">
+              <a:graphicData uri="http://schemas.openxmlformats.org/drawingml/2006/picture">
+                <pic:pic xmlns:pic="http://schemas.openxmlformats.org/drawingml/2006/picture">
+                  <pic:nvPicPr>
+                    <pic:cNvPr id="1" name=""/>
+                    <pic:cNvPicPr/>
+                  </pic:nvPicPr>
+                  <pic:blipFill>
+                    <a:blip r:embed="rId23"/>
+                    <a:stretch>
+                      <a:fillRect/>
+                    </a:stretch>
+                  </pic:blipFill>
+                  <pic:spPr>
+                    <a:xfrm>
+                      <a:off x="0" y="0"/>
+                      <a:ext cx="2663658" cy="1570831"/>
+                    </a:xfrm>
+                    <a:prstGeom prst="rect">
+                      <a:avLst/>
+                    </a:prstGeom>
+                  </pic:spPr>
+                </pic:pic>
+              </a:graphicData>
+            </a:graphic>
+          </wp:inline>
+        </w:drawing>
+      </w:r>
+      <w:r>
+        <w:t xml:space="preserve">     </w:t>
+      </w:r>
+      <w:r>
+        <w:drawing>
+          <wp:inline distT="0" distB="0" distL="0" distR="0" wp14:anchorId="1F71E334" wp14:editId="3ED8F3CE">
+            <wp:extent cx="2638425" cy="1555950"/>
+            <wp:effectExtent l="0" t="0" r="0" b="6350"/>
+            <wp:docPr id="28" name="Grafik 28"/>
+            <wp:cNvGraphicFramePr>
+              <a:graphicFrameLocks xmlns:a="http://schemas.openxmlformats.org/drawingml/2006/main" noChangeAspect="1"/>
+            </wp:cNvGraphicFramePr>
+            <a:graphic xmlns:a="http://schemas.openxmlformats.org/drawingml/2006/main">
+              <a:graphicData uri="http://schemas.openxmlformats.org/drawingml/2006/picture">
+                <pic:pic xmlns:pic="http://schemas.openxmlformats.org/drawingml/2006/picture">
+                  <pic:nvPicPr>
+                    <pic:cNvPr id="1" name=""/>
+                    <pic:cNvPicPr/>
+                  </pic:nvPicPr>
+                  <pic:blipFill>
+                    <a:blip r:embed="rId24"/>
+                    <a:stretch>
+                      <a:fillRect/>
+                    </a:stretch>
+                  </pic:blipFill>
+                  <pic:spPr>
+                    <a:xfrm>
+                      <a:off x="0" y="0"/>
+                      <a:ext cx="2659051" cy="1568114"/>
+                    </a:xfrm>
+                    <a:prstGeom prst="rect">
+                      <a:avLst/>
+                    </a:prstGeom>
+                  </pic:spPr>
+                </pic:pic>
+              </a:graphicData>
+            </a:graphic>
+          </wp:inline>
+        </w:drawing>
+      </w:r>
+    </w:p>
+    <w:p>
+      <w:pPr>
+        <w:pStyle w:val="berschrift3"/>
+      </w:pPr>
+      <w:r>
+        <w:t>ANOVA über Gesamtergebnis (Erfolgsquote pro Task)</w:t>
+      </w:r>
+    </w:p>
+    <w:p>
+      <w:pPr>
+        <w:pStyle w:val="Listenabsatz"/>
+        <w:numPr>
+          <w:ilvl w:val="0"/>
+          <w:numId w:val="2"/>
+        </w:numPr>
+        <w:rPr>
+          <w:lang w:val="en-GB"/>
+        </w:rPr>
+      </w:pPr>
+      <w:r>
+        <w:rPr>
+          <w:lang w:val="en-GB"/>
+        </w:rPr>
+        <w:t>Export:</w:t>
+      </w:r>
+    </w:p>
+    <w:p>
+      <w:pPr>
+        <w:pStyle w:val="Listenabsatz"/>
+        <w:numPr>
+          <w:ilvl w:val="1"/>
+          <w:numId w:val="2"/>
+        </w:numPr>
+        <w:rPr>
+          <w:lang w:val="en-GB"/>
+        </w:rPr>
+      </w:pPr>
+      <w:proofErr w:type="spellStart"/>
+      <w:r>
+        <w:rPr>
+          <w:lang w:val="en-GB"/>
+        </w:rPr>
+        <w:t>spss</w:t>
+      </w:r>
+      <w:proofErr w:type="spellEnd"/>
+      <w:r>
+        <w:rPr>
+          <w:lang w:val="en-GB"/>
+        </w:rPr>
+        <w:t>/</w:t>
+      </w:r>
+      <w:proofErr w:type="spellStart"/>
+      <w:r>
+        <w:rPr>
+          <w:lang w:val="en-GB"/>
+        </w:rPr>
+        <w:t>data_rates_repeat.sav</w:t>
+      </w:r>
+      <w:proofErr w:type="spellEnd"/>
+    </w:p>
+    <w:p>
+      <w:pPr>
+        <w:pStyle w:val="Listenabsatz"/>
+        <w:numPr>
+          <w:ilvl w:val="1"/>
+          <w:numId w:val="2"/>
+        </w:numPr>
+        <w:rPr>
+          <w:lang w:val="en-GB"/>
+        </w:rPr>
+      </w:pPr>
+      <w:proofErr w:type="spellStart"/>
+      <w:r>
+        <w:rPr>
+          <w:lang w:val="en-GB"/>
+        </w:rPr>
+        <w:t>spss</w:t>
+      </w:r>
+      <w:proofErr w:type="spellEnd"/>
+      <w:r>
+        <w:rPr>
+          <w:lang w:val="en-GB"/>
+        </w:rPr>
+        <w:t>/</w:t>
+      </w:r>
+      <w:proofErr w:type="spellStart"/>
+      <w:r>
+        <w:rPr>
+          <w:lang w:val="en-GB"/>
+        </w:rPr>
+        <w:t>results_rates_</w:t>
+      </w:r>
+      <w:r>
+        <w:rPr>
+          <w:lang w:val="en-GB"/>
+        </w:rPr>
+        <w:t>repeat.spv</w:t>
+      </w:r>
+      <w:proofErr w:type="spellEnd"/>
+    </w:p>
+    <w:p>
+      <w:pPr>
+        <w:pStyle w:val="Listenabsatz"/>
+        <w:numPr>
+          <w:ilvl w:val="0"/>
+          <w:numId w:val="2"/>
+        </w:numPr>
+      </w:pPr>
+      <w:r>
+        <w:t>Ergebnis ähnlich zur Messwiederholung</w:t>
+      </w:r>
+    </w:p>
+    <w:p>
+      <w:pPr>
+        <w:pStyle w:val="Listenabsatz"/>
+        <w:numPr>
+          <w:ilvl w:val="1"/>
+          <w:numId w:val="2"/>
+        </w:numPr>
+      </w:pPr>
+      <w:proofErr w:type="spellStart"/>
+      <w:r>
+        <w:t>MappingMethod</w:t>
+      </w:r>
+      <w:proofErr w:type="spellEnd"/>
+      <w:r>
+        <w:t>: signifikant (&lt;0,001)</w:t>
+      </w:r>
+    </w:p>
+    <w:p>
+      <w:pPr>
+        <w:pStyle w:val="Listenabsatz"/>
+        <w:numPr>
+          <w:ilvl w:val="1"/>
+          <w:numId w:val="2"/>
+        </w:numPr>
+      </w:pPr>
+      <w:r>
+        <w:t xml:space="preserve">Aber auch </w:t>
+      </w:r>
+      <w:proofErr w:type="spellStart"/>
+      <w:r>
+        <w:t>NumLayers</w:t>
+      </w:r>
+      <w:proofErr w:type="spellEnd"/>
+      <w:r>
+        <w:t xml:space="preserve"> (0,003) </w:t>
+      </w:r>
+    </w:p>
+    <w:p>
+      <w:pPr>
+        <w:pStyle w:val="Listenabsatz"/>
+        <w:numPr>
+          <w:ilvl w:val="1"/>
+          <w:numId w:val="2"/>
+        </w:numPr>
+      </w:pPr>
+      <w:r>
+        <w:t>R-Q</w:t>
+      </w:r>
+      <w:r>
+        <w:t>u</w:t>
+      </w:r>
+      <w:r>
+        <w:t>adrat: 0,08</w:t>
+      </w:r>
+      <w:r>
+        <w:t>3 = mittelmäßig starker Effekt</w:t>
+      </w:r>
+    </w:p>
+    <w:p>
+      <w:pPr>
+        <w:pStyle w:val="berschrift3"/>
+      </w:pPr>
+      <w:r>
         <w:t xml:space="preserve">Wackelquote </w:t>
       </w:r>
     </w:p>
@@ -3035,13 +3572,7 @@
       </w:r>
       <w:proofErr w:type="gramEnd"/>
       <w:r>
-        <w:t>9</w:t>
-      </w:r>
-      <w:r>
-        <w:t>4</w:t>
-      </w:r>
-      <w:r>
-        <w:t>) !</w:t>
+        <w:t>94) !</w:t>
       </w:r>
     </w:p>
     <w:p>
@@ -3065,13 +3596,7 @@
         </w:numPr>
       </w:pPr>
       <w:r>
-        <w:t xml:space="preserve">6 </w:t>
-      </w:r>
-      <w:r>
-        <w:t xml:space="preserve">/ 21 </w:t>
-      </w:r>
-      <w:r>
-        <w:t>Ebenen: Effekt nicht signifikant (</w:t>
+        <w:t>6 / 21 Ebenen: Effekt nicht signifikant (</w:t>
       </w:r>
       <w:proofErr w:type="spellStart"/>
       <w:r>
@@ -3079,13 +3604,7 @@
       </w:r>
       <w:proofErr w:type="spellEnd"/>
       <w:r>
-        <w:t>. 0</w:t>
-      </w:r>
-      <w:r>
-        <w:t>,67 / 0,28</w:t>
-      </w:r>
-      <w:r>
-        <w:t>)</w:t>
+        <w:t>. 0,67 / 0,28)</w:t>
       </w:r>
     </w:p>
     <w:p>
@@ -3113,13 +3632,7 @@
       </w:r>
       <w:proofErr w:type="spellEnd"/>
       <w:r>
-        <w:t>. 0,00</w:t>
-      </w:r>
-      <w:r>
-        <w:t>8</w:t>
-      </w:r>
-      <w:r>
-        <w:t>)</w:t>
+        <w:t>. 0,008)</w:t>
       </w:r>
     </w:p>
     <w:p>
@@ -3131,39 +3644,15 @@
         </w:numPr>
       </w:pPr>
       <w:r>
-        <w:t xml:space="preserve">12 </w:t>
-      </w:r>
-      <w:r>
-        <w:t xml:space="preserve">/ 15 / </w:t>
+        <w:t xml:space="preserve">12 / 15 / </w:t>
       </w:r>
       <w:proofErr w:type="gramStart"/>
       <w:r>
-        <w:t xml:space="preserve">18 </w:t>
-      </w:r>
-      <w:r>
-        <w:t xml:space="preserve"> Ebenen</w:t>
+        <w:t>18  Ebenen</w:t>
       </w:r>
       <w:proofErr w:type="gramEnd"/>
       <w:r>
-        <w:t>: weniger stark: (</w:t>
-      </w:r>
-      <w:r>
-        <w:t xml:space="preserve">0,072 / </w:t>
-      </w:r>
-      <w:r>
-        <w:t>0,03</w:t>
-      </w:r>
-      <w:r>
-        <w:t>5</w:t>
-      </w:r>
-      <w:r>
-        <w:t xml:space="preserve"> / 0,0</w:t>
-      </w:r>
-      <w:r>
-        <w:t>35</w:t>
-      </w:r>
-      <w:r>
-        <w:t>)</w:t>
+        <w:t>: weniger stark: (0,072 / 0,035 / 0,035)</w:t>
       </w:r>
     </w:p>
     <w:p>
@@ -3175,570 +3664,2202 @@
         </w:numPr>
       </w:pPr>
       <w:r>
+        <w:t>ABER: dieser Zusammenhang ist statistisch nicht signifikant (s.o.)</w:t>
+      </w:r>
+    </w:p>
+    <w:p>
+      <w:pPr>
+        <w:pStyle w:val="Listenabsatz"/>
+        <w:numPr>
+          <w:ilvl w:val="1"/>
+          <w:numId w:val="2"/>
+        </w:numPr>
+        <w:rPr>
+          <w:lang w:val="en-GB"/>
+        </w:rPr>
+      </w:pPr>
+      <w:proofErr w:type="spellStart"/>
+      <w:r>
+        <w:rPr>
+          <w:lang w:val="en-GB"/>
+        </w:rPr>
+        <w:t>Levene</w:t>
+      </w:r>
+      <w:proofErr w:type="spellEnd"/>
+      <w:r>
+        <w:rPr>
+          <w:lang w:val="en-GB"/>
+        </w:rPr>
+        <w:t xml:space="preserve">-Test: </w:t>
+      </w:r>
+      <w:proofErr w:type="spellStart"/>
+      <w:r>
+        <w:rPr>
+          <w:lang w:val="en-GB"/>
+        </w:rPr>
+        <w:t>Nullhypothese</w:t>
+      </w:r>
+      <w:proofErr w:type="spellEnd"/>
+      <w:r>
+        <w:rPr>
+          <w:lang w:val="en-GB"/>
+        </w:rPr>
+        <w:t xml:space="preserve"> </w:t>
+      </w:r>
+      <w:proofErr w:type="spellStart"/>
+      <w:r>
+        <w:rPr>
+          <w:lang w:val="en-GB"/>
+        </w:rPr>
+        <w:t>erfüllt</w:t>
+      </w:r>
+      <w:proofErr w:type="spellEnd"/>
+      <w:r>
+        <w:rPr>
+          <w:lang w:val="en-GB"/>
+        </w:rPr>
+        <w:t xml:space="preserve"> (S</w:t>
+      </w:r>
+      <w:r>
+        <w:rPr>
+          <w:lang w:val="en-GB"/>
+        </w:rPr>
+        <w:t>ig &gt; 0,8)</w:t>
+      </w:r>
+    </w:p>
+    <w:p>
+      <w:pPr>
+        <w:pStyle w:val="Listenabsatz"/>
+        <w:numPr>
+          <w:ilvl w:val="1"/>
+          <w:numId w:val="2"/>
+        </w:numPr>
+      </w:pPr>
+    </w:p>
+    <w:p>
+      <w:pPr>
+        <w:pStyle w:val="berschrift3"/>
+      </w:pPr>
+      <w:r>
+        <w:t xml:space="preserve">Fundquote </w:t>
+      </w:r>
+    </w:p>
+    <w:p>
+      <w:pPr>
+        <w:pStyle w:val="Listenabsatz"/>
+        <w:numPr>
+          <w:ilvl w:val="0"/>
+          <w:numId w:val="2"/>
+        </w:numPr>
+      </w:pPr>
+      <w:r>
+        <w:t xml:space="preserve">falsche Ebene vs. </w:t>
+      </w:r>
+      <w:r>
+        <w:t>g</w:t>
+      </w:r>
+      <w:r>
+        <w:t>ehalten oder gewackelt</w:t>
+      </w:r>
+    </w:p>
+    <w:p>
+      <w:pPr>
+        <w:pStyle w:val="Listenabsatz"/>
+        <w:numPr>
+          <w:ilvl w:val="0"/>
+          <w:numId w:val="2"/>
+        </w:numPr>
+      </w:pPr>
+      <w:r>
+        <w:t>zweifaktorielle ANOVA</w:t>
+      </w:r>
+    </w:p>
+    <w:p>
+      <w:pPr>
+        <w:pStyle w:val="Listenabsatz"/>
+        <w:numPr>
+          <w:ilvl w:val="1"/>
+          <w:numId w:val="2"/>
+        </w:numPr>
+      </w:pPr>
+      <w:r>
+        <w:t xml:space="preserve">abhängige Variable: </w:t>
+      </w:r>
+      <w:r>
+        <w:t>falsche Ebene</w:t>
+      </w:r>
+      <w:r>
+        <w:t xml:space="preserve"> /</w:t>
+      </w:r>
+      <w:r>
+        <w:t xml:space="preserve"> </w:t>
+      </w:r>
+      <w:r>
+        <w:t>Gesamtanzahl</w:t>
+      </w:r>
+    </w:p>
+    <w:p>
+      <w:pPr>
+        <w:pStyle w:val="Listenabsatz"/>
+        <w:numPr>
+          <w:ilvl w:val="1"/>
+          <w:numId w:val="2"/>
+        </w:numPr>
+      </w:pPr>
+      <w:r>
+        <w:t xml:space="preserve">Gruppenvariablen: </w:t>
+      </w:r>
+      <w:proofErr w:type="spellStart"/>
+      <w:r>
+        <w:t>Ebenenanzahl</w:t>
+      </w:r>
+      <w:proofErr w:type="spellEnd"/>
+      <w:r>
+        <w:t xml:space="preserve">, </w:t>
+      </w:r>
+      <w:proofErr w:type="spellStart"/>
+      <w:r>
+        <w:t>Ebenenanordnung</w:t>
+      </w:r>
+      <w:proofErr w:type="spellEnd"/>
+    </w:p>
+    <w:p>
+      <w:pPr>
+        <w:pStyle w:val="Listenabsatz"/>
+        <w:numPr>
+          <w:ilvl w:val="0"/>
+          <w:numId w:val="2"/>
+        </w:numPr>
+      </w:pPr>
+      <w:r>
+        <w:t>Import/Export: s.o.</w:t>
+      </w:r>
+    </w:p>
+    <w:p>
+      <w:pPr>
+        <w:pStyle w:val="Listenabsatz"/>
+        <w:numPr>
+          <w:ilvl w:val="0"/>
+          <w:numId w:val="2"/>
+        </w:numPr>
+      </w:pPr>
+      <w:r>
+        <w:t>Ergebnis:</w:t>
+      </w:r>
+    </w:p>
+    <w:p>
+      <w:pPr>
+        <w:pStyle w:val="Listenabsatz"/>
+        <w:numPr>
+          <w:ilvl w:val="1"/>
+          <w:numId w:val="2"/>
+        </w:numPr>
+        <w:rPr>
+          <w:lang w:val="en-GB"/>
+        </w:rPr>
+      </w:pPr>
+      <w:proofErr w:type="spellStart"/>
+      <w:r>
+        <w:rPr>
+          <w:lang w:val="en-GB"/>
+        </w:rPr>
+        <w:t>NumLayers</w:t>
+      </w:r>
+      <w:proofErr w:type="spellEnd"/>
+      <w:r>
+        <w:rPr>
+          <w:lang w:val="en-GB"/>
+        </w:rPr>
+        <w:t xml:space="preserve"> FAST </w:t>
+      </w:r>
+      <w:proofErr w:type="spellStart"/>
+      <w:r>
+        <w:rPr>
+          <w:lang w:val="en-GB"/>
+        </w:rPr>
+        <w:t>signifikant</w:t>
+      </w:r>
+      <w:proofErr w:type="spellEnd"/>
+      <w:r>
+        <w:rPr>
+          <w:lang w:val="en-GB"/>
+        </w:rPr>
+        <w:t xml:space="preserve"> </w:t>
+      </w:r>
+      <w:proofErr w:type="spellStart"/>
+      <w:r>
+        <w:rPr>
+          <w:lang w:val="en-GB"/>
+        </w:rPr>
+        <w:t>bei</w:t>
+      </w:r>
+      <w:proofErr w:type="spellEnd"/>
+      <w:r>
+        <w:rPr>
+          <w:lang w:val="en-GB"/>
+        </w:rPr>
+        <w:t xml:space="preserve"> </w:t>
+      </w:r>
+      <w:proofErr w:type="spellStart"/>
+      <w:r>
+        <w:rPr>
+          <w:lang w:val="en-GB"/>
+        </w:rPr>
+        <w:t>Failed_A</w:t>
+      </w:r>
+      <w:r>
+        <w:rPr>
+          <w:lang w:val="en-GB"/>
+        </w:rPr>
+        <w:t>bs</w:t>
+      </w:r>
+      <w:proofErr w:type="spellEnd"/>
+      <w:r>
+        <w:rPr>
+          <w:lang w:val="en-GB"/>
+        </w:rPr>
+        <w:t xml:space="preserve"> (Sig 0.055)</w:t>
+      </w:r>
+    </w:p>
+    <w:p>
+      <w:pPr>
+        <w:pStyle w:val="Listenabsatz"/>
+        <w:numPr>
+          <w:ilvl w:val="1"/>
+          <w:numId w:val="2"/>
+        </w:numPr>
+      </w:pPr>
+      <w:r>
+        <w:rPr>
+          <w:lang w:val="en-GB"/>
+        </w:rPr>
+        <w:t xml:space="preserve">Problem: </w:t>
+      </w:r>
+      <w:proofErr w:type="spellStart"/>
+      <w:r>
+        <w:rPr>
+          <w:lang w:val="en-GB"/>
+        </w:rPr>
+        <w:t>Levene</w:t>
+      </w:r>
+      <w:proofErr w:type="spellEnd"/>
+      <w:r>
+        <w:rPr>
+          <w:lang w:val="en-GB"/>
+        </w:rPr>
+        <w:t xml:space="preserve">-Test </w:t>
+      </w:r>
+      <w:proofErr w:type="spellStart"/>
+      <w:r>
+        <w:rPr>
+          <w:lang w:val="en-GB"/>
+        </w:rPr>
+        <w:t>bei</w:t>
+      </w:r>
+      <w:proofErr w:type="spellEnd"/>
+      <w:r>
+        <w:rPr>
+          <w:lang w:val="en-GB"/>
+        </w:rPr>
+        <w:t xml:space="preserve"> </w:t>
+      </w:r>
+      <w:proofErr w:type="spellStart"/>
+      <w:r>
+        <w:rPr>
+          <w:lang w:val="en-GB"/>
+        </w:rPr>
+        <w:t>Failed_Abs</w:t>
+      </w:r>
+      <w:proofErr w:type="spellEnd"/>
+      <w:r>
+        <w:rPr>
+          <w:lang w:val="en-GB"/>
+        </w:rPr>
+        <w:t xml:space="preserve"> Sig. </w:t>
+      </w:r>
+      <w:r>
+        <w:t>&lt; 0,001, d.h. zu große S</w:t>
+      </w:r>
+      <w:r>
+        <w:t>treuung, Aussagen sind nicht „</w:t>
+      </w:r>
+      <w:proofErr w:type="gramStart"/>
+      <w:r>
+        <w:t>vertrauenswürdig“</w:t>
+      </w:r>
+      <w:proofErr w:type="gramEnd"/>
+    </w:p>
+    <w:p>
+      <w:pPr>
+        <w:pStyle w:val="berschrift3"/>
+      </w:pPr>
+      <w:r>
         <w:lastRenderedPageBreak/>
-        <w:t>ABER: dieser Zusammenhang ist statistisch nicht signifikant (s.o.)</w:t>
-      </w:r>
-    </w:p>
-    <w:p>
-      <w:pPr>
-        <w:pStyle w:val="Listenabsatz"/>
-        <w:numPr>
-          <w:ilvl w:val="1"/>
-          <w:numId w:val="2"/>
-        </w:numPr>
-        <w:rPr>
-          <w:lang w:val="en-GB"/>
-        </w:rPr>
-      </w:pPr>
-      <w:proofErr w:type="spellStart"/>
-      <w:r>
-        <w:rPr>
-          <w:lang w:val="en-GB"/>
-        </w:rPr>
-        <w:t>Levene</w:t>
-      </w:r>
-      <w:proofErr w:type="spellEnd"/>
-      <w:r>
-        <w:rPr>
-          <w:lang w:val="en-GB"/>
-        </w:rPr>
-        <w:t xml:space="preserve">-Test: </w:t>
-      </w:r>
-      <w:proofErr w:type="spellStart"/>
-      <w:r>
-        <w:rPr>
-          <w:lang w:val="en-GB"/>
-        </w:rPr>
-        <w:t>Nullhypothese</w:t>
-      </w:r>
-      <w:proofErr w:type="spellEnd"/>
-      <w:r>
-        <w:rPr>
-          <w:lang w:val="en-GB"/>
+        <w:t>Durchschnittliche Geschwindigkeit</w:t>
+      </w:r>
+      <w:r>
+        <w:t xml:space="preserve"> – </w:t>
+      </w:r>
+      <w:r>
+        <w:t>ANOVA</w:t>
+      </w:r>
+    </w:p>
+    <w:p>
+      <w:pPr>
+        <w:pStyle w:val="Listenabsatz"/>
+        <w:numPr>
+          <w:ilvl w:val="0"/>
+          <w:numId w:val="2"/>
+        </w:numPr>
+      </w:pPr>
+      <w:r>
+        <w:t>Gesamtversuchsdauer pro Task</w:t>
+      </w:r>
+    </w:p>
+    <w:p>
+      <w:pPr>
+        <w:pStyle w:val="Listenabsatz"/>
+        <w:numPr>
+          <w:ilvl w:val="0"/>
+          <w:numId w:val="2"/>
+        </w:numPr>
+      </w:pPr>
+      <w:r>
+        <w:t>zweifaktorielle ANOVA</w:t>
+      </w:r>
+    </w:p>
+    <w:p>
+      <w:pPr>
+        <w:pStyle w:val="Listenabsatz"/>
+        <w:numPr>
+          <w:ilvl w:val="1"/>
+          <w:numId w:val="2"/>
+        </w:numPr>
+      </w:pPr>
+      <w:r>
+        <w:t>abhängige Variable: Dauer</w:t>
+      </w:r>
+    </w:p>
+    <w:p>
+      <w:pPr>
+        <w:pStyle w:val="Listenabsatz"/>
+        <w:numPr>
+          <w:ilvl w:val="1"/>
+          <w:numId w:val="2"/>
+        </w:numPr>
+      </w:pPr>
+      <w:r>
+        <w:t xml:space="preserve">Gruppenvariablen: </w:t>
+      </w:r>
+      <w:proofErr w:type="spellStart"/>
+      <w:r>
+        <w:t>Ebenenanzahl</w:t>
+      </w:r>
+      <w:proofErr w:type="spellEnd"/>
+      <w:r>
+        <w:t xml:space="preserve">, </w:t>
+      </w:r>
+      <w:proofErr w:type="spellStart"/>
+      <w:r>
+        <w:t>Ebenenanordnung</w:t>
+      </w:r>
+      <w:proofErr w:type="spellEnd"/>
+    </w:p>
+    <w:p>
+      <w:pPr>
+        <w:pStyle w:val="Listenabsatz"/>
+        <w:numPr>
+          <w:ilvl w:val="0"/>
+          <w:numId w:val="2"/>
+        </w:numPr>
+      </w:pPr>
+      <w:r>
+        <w:t>Import:</w:t>
+      </w:r>
+    </w:p>
+    <w:p>
+      <w:pPr>
+        <w:pStyle w:val="Listenabsatz"/>
+        <w:numPr>
+          <w:ilvl w:val="1"/>
+          <w:numId w:val="2"/>
+        </w:numPr>
+        <w:rPr>
+          <w:lang w:val="en-GB"/>
+        </w:rPr>
+      </w:pPr>
+      <w:r>
+        <w:rPr>
+          <w:lang w:val="en-GB"/>
+        </w:rPr>
+        <w:t>export/</w:t>
+      </w:r>
+      <w:r>
+        <w:rPr>
+          <w:lang w:val="en-GB"/>
+        </w:rPr>
+        <w:t>times</w:t>
+      </w:r>
+      <w:r>
+        <w:rPr>
+          <w:lang w:val="en-GB"/>
+        </w:rPr>
+        <w:t>_repeat</w:t>
+      </w:r>
+      <w:r>
+        <w:rPr>
+          <w:lang w:val="en-GB"/>
+        </w:rPr>
+        <w:t>.csv</w:t>
+      </w:r>
+    </w:p>
+    <w:p>
+      <w:pPr>
+        <w:pStyle w:val="Listenabsatz"/>
+        <w:numPr>
+          <w:ilvl w:val="1"/>
+          <w:numId w:val="2"/>
+        </w:numPr>
+        <w:rPr>
+          <w:lang w:val="en-GB"/>
+        </w:rPr>
+      </w:pPr>
+      <w:proofErr w:type="spellStart"/>
+      <w:r>
+        <w:rPr>
+          <w:lang w:val="en-GB"/>
+        </w:rPr>
+        <w:t>Variablen</w:t>
+      </w:r>
+      <w:proofErr w:type="spellEnd"/>
+      <w:r>
+        <w:rPr>
+          <w:lang w:val="en-GB"/>
+        </w:rPr>
+        <w:t xml:space="preserve">: </w:t>
+      </w:r>
+    </w:p>
+    <w:p>
+      <w:pPr>
+        <w:pStyle w:val="Listenabsatz"/>
+        <w:numPr>
+          <w:ilvl w:val="2"/>
+          <w:numId w:val="2"/>
+        </w:numPr>
+        <w:rPr>
+          <w:lang w:val="en-GB"/>
+        </w:rPr>
+      </w:pPr>
+      <w:r>
+        <w:rPr>
+          <w:lang w:val="en-GB"/>
+        </w:rPr>
+        <w:t>V1/Proband/</w:t>
+      </w:r>
+      <w:proofErr w:type="spellStart"/>
+      <w:r>
+        <w:rPr>
+          <w:lang w:val="en-GB"/>
+        </w:rPr>
+        <w:t>MappingMethod</w:t>
+      </w:r>
+      <w:proofErr w:type="spellEnd"/>
+      <w:r>
+        <w:rPr>
+          <w:lang w:val="en-GB"/>
+        </w:rPr>
+        <w:t>/Block/Task/Trial/Target</w:t>
+      </w:r>
+      <w:r>
+        <w:rPr>
+          <w:lang w:val="en-GB"/>
+        </w:rPr>
+        <w:t>: Nominal</w:t>
+      </w:r>
+    </w:p>
+    <w:p>
+      <w:pPr>
+        <w:pStyle w:val="Listenabsatz"/>
+        <w:numPr>
+          <w:ilvl w:val="2"/>
+          <w:numId w:val="2"/>
+        </w:numPr>
+        <w:rPr>
+          <w:lang w:val="en-GB"/>
+        </w:rPr>
+      </w:pPr>
+      <w:proofErr w:type="spellStart"/>
+      <w:r>
+        <w:rPr>
+          <w:lang w:val="en-GB"/>
+        </w:rPr>
+        <w:t>NumLayers</w:t>
+      </w:r>
+      <w:proofErr w:type="spellEnd"/>
+      <w:r>
+        <w:rPr>
+          <w:lang w:val="en-GB"/>
+        </w:rPr>
+        <w:t>: Ordinal</w:t>
+      </w:r>
+    </w:p>
+    <w:p>
+      <w:pPr>
+        <w:pStyle w:val="Listenabsatz"/>
+        <w:numPr>
+          <w:ilvl w:val="2"/>
+          <w:numId w:val="2"/>
+        </w:numPr>
+        <w:rPr>
+          <w:lang w:val="en-GB"/>
+        </w:rPr>
+      </w:pPr>
+      <w:r>
+        <w:rPr>
+          <w:lang w:val="en-GB"/>
+        </w:rPr>
+        <w:t xml:space="preserve">Rest: </w:t>
+      </w:r>
+      <w:proofErr w:type="spellStart"/>
+      <w:r>
+        <w:rPr>
+          <w:lang w:val="en-GB"/>
+        </w:rPr>
+        <w:t>Metrisch</w:t>
+      </w:r>
+      <w:proofErr w:type="spellEnd"/>
+    </w:p>
+    <w:p>
+      <w:pPr>
+        <w:pStyle w:val="Listenabsatz"/>
+        <w:numPr>
+          <w:ilvl w:val="0"/>
+          <w:numId w:val="2"/>
+        </w:numPr>
+        <w:rPr>
+          <w:lang w:val="en-GB"/>
+        </w:rPr>
+      </w:pPr>
+      <w:proofErr w:type="spellStart"/>
+      <w:r>
+        <w:rPr>
+          <w:lang w:val="en-GB"/>
+        </w:rPr>
+        <w:t>Ergebnisse</w:t>
+      </w:r>
+      <w:proofErr w:type="spellEnd"/>
+      <w:r>
+        <w:rPr>
+          <w:lang w:val="en-GB"/>
+        </w:rPr>
+        <w:t>:</w:t>
+      </w:r>
+    </w:p>
+    <w:p>
+      <w:pPr>
+        <w:pStyle w:val="Listenabsatz"/>
+        <w:numPr>
+          <w:ilvl w:val="1"/>
+          <w:numId w:val="2"/>
+        </w:numPr>
+      </w:pPr>
+      <w:r>
+        <w:t>Levene-Test: Mittelwert -</w:t>
+      </w:r>
+      <w:proofErr w:type="gramStart"/>
+      <w:r>
+        <w:t>signifikant ?</w:t>
+      </w:r>
+      <w:proofErr w:type="gramEnd"/>
+    </w:p>
+    <w:p>
+      <w:pPr>
+        <w:pStyle w:val="Listenabsatz"/>
+        <w:numPr>
+          <w:ilvl w:val="1"/>
+          <w:numId w:val="2"/>
+        </w:numPr>
+      </w:pPr>
+      <w:r>
+        <w:t xml:space="preserve">Zwischensubjekteffekt: </w:t>
+      </w:r>
+      <w:proofErr w:type="spellStart"/>
+      <w:r>
+        <w:t>NumLayers</w:t>
+      </w:r>
+      <w:proofErr w:type="spellEnd"/>
+      <w:r>
+        <w:t xml:space="preserve"> Signifikant (0,001), Mapping Method und </w:t>
+      </w:r>
+      <w:proofErr w:type="spellStart"/>
+      <w:r>
+        <w:t>MappingMehtod</w:t>
+      </w:r>
+      <w:proofErr w:type="spellEnd"/>
+      <w:r>
+        <w:t xml:space="preserve"> * </w:t>
+      </w:r>
+      <w:proofErr w:type="spellStart"/>
+      <w:r>
+        <w:t>NumLayers</w:t>
+      </w:r>
+      <w:proofErr w:type="spellEnd"/>
+      <w:r>
+        <w:t xml:space="preserve"> nicht</w:t>
+      </w:r>
+    </w:p>
+    <w:p>
+      <w:pPr>
+        <w:pStyle w:val="Listenabsatz"/>
+        <w:numPr>
+          <w:ilvl w:val="1"/>
+          <w:numId w:val="2"/>
+        </w:numPr>
+      </w:pPr>
+      <w:r>
+        <w:t>R-Quadrat: 0,02</w:t>
+      </w:r>
+    </w:p>
+    <w:p>
+      <w:pPr>
+        <w:pStyle w:val="Listenabsatz"/>
+        <w:numPr>
+          <w:ilvl w:val="1"/>
+          <w:numId w:val="2"/>
+        </w:numPr>
+      </w:pPr>
+      <w:r>
+        <w:t>Paarweise Effekte: 6 – 18/21 signifikant</w:t>
+      </w:r>
+    </w:p>
+    <w:p>
+      <w:pPr>
+        <w:autoSpaceDE w:val="0"/>
+        <w:autoSpaceDN w:val="0"/>
+        <w:adjustRightInd w:val="0"/>
+        <w:spacing w:after="0" w:line="240" w:lineRule="auto"/>
+        <w:jc w:val="center"/>
+        <w:rPr>
+          <w:rFonts w:ascii="Times New Roman" w:hAnsi="Times New Roman" w:cs="Times New Roman"/>
+          <w:sz w:val="24"/>
+          <w:szCs w:val="24"/>
+        </w:rPr>
+      </w:pPr>
+      <w:r>
+        <w:rPr>
+          <w:noProof/>
+        </w:rPr>
+        <w:drawing>
+          <wp:inline distT="0" distB="0" distL="0" distR="0" wp14:anchorId="335CCF69" wp14:editId="22935E0C">
+            <wp:extent cx="3414998" cy="2009775"/>
+            <wp:effectExtent l="0" t="0" r="0" b="0"/>
+            <wp:docPr id="25" name="Grafik 25"/>
+            <wp:cNvGraphicFramePr>
+              <a:graphicFrameLocks xmlns:a="http://schemas.openxmlformats.org/drawingml/2006/main" noChangeAspect="1"/>
+            </wp:cNvGraphicFramePr>
+            <a:graphic xmlns:a="http://schemas.openxmlformats.org/drawingml/2006/main">
+              <a:graphicData uri="http://schemas.openxmlformats.org/drawingml/2006/picture">
+                <pic:pic xmlns:pic="http://schemas.openxmlformats.org/drawingml/2006/picture">
+                  <pic:nvPicPr>
+                    <pic:cNvPr id="0" name="Picture 9"/>
+                    <pic:cNvPicPr>
+                      <a:picLocks noChangeAspect="1" noChangeArrowheads="1"/>
+                    </pic:cNvPicPr>
+                  </pic:nvPicPr>
+                  <pic:blipFill>
+                    <a:blip r:embed="rId25" cstate="print">
+                      <a:extLst>
+                        <a:ext uri="{28A0092B-C50C-407E-A947-70E740481C1C}">
+                          <a14:useLocalDpi xmlns:a14="http://schemas.microsoft.com/office/drawing/2010/main" val="0"/>
+                        </a:ext>
+                      </a:extLst>
+                    </a:blip>
+                    <a:srcRect/>
+                    <a:stretch>
+                      <a:fillRect/>
+                    </a:stretch>
+                  </pic:blipFill>
+                  <pic:spPr bwMode="auto">
+                    <a:xfrm>
+                      <a:off x="0" y="0"/>
+                      <a:ext cx="3440128" cy="2024565"/>
+                    </a:xfrm>
+                    <a:prstGeom prst="rect">
+                      <a:avLst/>
+                    </a:prstGeom>
+                    <a:noFill/>
+                    <a:ln>
+                      <a:noFill/>
+                    </a:ln>
+                  </pic:spPr>
+                </pic:pic>
+              </a:graphicData>
+            </a:graphic>
+          </wp:inline>
+        </w:drawing>
+      </w:r>
+    </w:p>
+    <w:p>
+      <w:pPr>
+        <w:autoSpaceDE w:val="0"/>
+        <w:autoSpaceDN w:val="0"/>
+        <w:adjustRightInd w:val="0"/>
+        <w:spacing w:after="0" w:line="240" w:lineRule="auto"/>
+        <w:jc w:val="center"/>
+        <w:rPr>
+          <w:rFonts w:ascii="Times New Roman" w:hAnsi="Times New Roman" w:cs="Times New Roman"/>
+          <w:sz w:val="24"/>
+          <w:szCs w:val="24"/>
+        </w:rPr>
+      </w:pPr>
+    </w:p>
+    <w:p>
+      <w:pPr>
+        <w:autoSpaceDE w:val="0"/>
+        <w:autoSpaceDN w:val="0"/>
+        <w:adjustRightInd w:val="0"/>
+        <w:spacing w:after="0" w:line="240" w:lineRule="auto"/>
+        <w:jc w:val="center"/>
+        <w:rPr>
+          <w:rFonts w:ascii="Times New Roman" w:hAnsi="Times New Roman" w:cs="Times New Roman"/>
+          <w:sz w:val="24"/>
+          <w:szCs w:val="24"/>
+        </w:rPr>
+      </w:pPr>
+      <w:r>
+        <w:rPr>
+          <w:rFonts w:ascii="Times New Roman" w:hAnsi="Times New Roman" w:cs="Times New Roman"/>
+          <w:sz w:val="24"/>
+          <w:szCs w:val="24"/>
+        </w:rPr>
+        <w:drawing>
+          <wp:inline distT="0" distB="0" distL="0" distR="0" wp14:anchorId="3C15AD74" wp14:editId="5F6C0B3F">
+            <wp:extent cx="3419475" cy="2016555"/>
+            <wp:effectExtent l="0" t="0" r="0" b="3175"/>
+            <wp:docPr id="26" name="Grafik 26"/>
+            <wp:cNvGraphicFramePr>
+              <a:graphicFrameLocks xmlns:a="http://schemas.openxmlformats.org/drawingml/2006/main" noChangeAspect="1"/>
+            </wp:cNvGraphicFramePr>
+            <a:graphic xmlns:a="http://schemas.openxmlformats.org/drawingml/2006/main">
+              <a:graphicData uri="http://schemas.openxmlformats.org/drawingml/2006/picture">
+                <pic:pic xmlns:pic="http://schemas.openxmlformats.org/drawingml/2006/picture">
+                  <pic:nvPicPr>
+                    <pic:cNvPr id="1" name=""/>
+                    <pic:cNvPicPr/>
+                  </pic:nvPicPr>
+                  <pic:blipFill>
+                    <a:blip r:embed="rId26"/>
+                    <a:stretch>
+                      <a:fillRect/>
+                    </a:stretch>
+                  </pic:blipFill>
+                  <pic:spPr>
+                    <a:xfrm>
+                      <a:off x="0" y="0"/>
+                      <a:ext cx="3432915" cy="2024481"/>
+                    </a:xfrm>
+                    <a:prstGeom prst="rect">
+                      <a:avLst/>
+                    </a:prstGeom>
+                  </pic:spPr>
+                </pic:pic>
+              </a:graphicData>
+            </a:graphic>
+          </wp:inline>
+        </w:drawing>
+      </w:r>
+    </w:p>
+    <w:p/>
+    <w:p>
+      <w:pPr>
+        <w:pStyle w:val="berschrift3"/>
+      </w:pPr>
+      <w:r>
+        <w:t xml:space="preserve">Durchschnittliche Geschwindigkeit – </w:t>
+      </w:r>
+      <w:r>
+        <w:t>M</w:t>
+      </w:r>
+      <w:r>
+        <w:t>ANOVA</w:t>
+      </w:r>
+    </w:p>
+    <w:p>
+      <w:pPr>
+        <w:pStyle w:val="Listenabsatz"/>
+        <w:numPr>
+          <w:ilvl w:val="0"/>
+          <w:numId w:val="2"/>
+        </w:numPr>
+      </w:pPr>
+      <w:r>
+        <w:t xml:space="preserve">Dauer der einzelnen Trials als multivariate </w:t>
+      </w:r>
+      <w:proofErr w:type="spellStart"/>
+      <w:r>
+        <w:t>Anova</w:t>
+      </w:r>
+      <w:proofErr w:type="spellEnd"/>
+    </w:p>
+    <w:p>
+      <w:pPr>
+        <w:pStyle w:val="Listenabsatz"/>
+        <w:numPr>
+          <w:ilvl w:val="0"/>
+          <w:numId w:val="2"/>
+        </w:numPr>
+      </w:pPr>
+      <w:r>
+        <w:t>zweifaktorielle ANOVA</w:t>
+      </w:r>
+    </w:p>
+    <w:p>
+      <w:pPr>
+        <w:pStyle w:val="Listenabsatz"/>
+        <w:numPr>
+          <w:ilvl w:val="1"/>
+          <w:numId w:val="2"/>
+        </w:numPr>
+      </w:pPr>
+      <w:r>
+        <w:t>abhängige Variable: Dauer</w:t>
+      </w:r>
+    </w:p>
+    <w:p>
+      <w:pPr>
+        <w:pStyle w:val="Listenabsatz"/>
+        <w:numPr>
+          <w:ilvl w:val="1"/>
+          <w:numId w:val="2"/>
+        </w:numPr>
+      </w:pPr>
+      <w:r>
+        <w:t xml:space="preserve">Gruppenvariablen: </w:t>
+      </w:r>
+      <w:proofErr w:type="spellStart"/>
+      <w:r>
+        <w:t>Ebenenanzahl</w:t>
+      </w:r>
+      <w:proofErr w:type="spellEnd"/>
+      <w:r>
+        <w:t xml:space="preserve">, </w:t>
+      </w:r>
+      <w:proofErr w:type="spellStart"/>
+      <w:r>
+        <w:t>Ebenenanordnung</w:t>
+      </w:r>
+      <w:proofErr w:type="spellEnd"/>
+    </w:p>
+    <w:p>
+      <w:pPr>
+        <w:pStyle w:val="Listenabsatz"/>
+        <w:numPr>
+          <w:ilvl w:val="0"/>
+          <w:numId w:val="2"/>
+        </w:numPr>
+      </w:pPr>
+      <w:r>
+        <w:t>Weiteres: s.u.</w:t>
+      </w:r>
+    </w:p>
+    <w:p/>
+    <w:p>
+      <w:pPr>
+        <w:pStyle w:val="berschrift3"/>
+      </w:pPr>
+      <w:r>
+        <w:t xml:space="preserve">Durchschnittliche Geschwindigkeit – </w:t>
+      </w:r>
+      <w:r>
+        <w:t>Messwiederholung</w:t>
+      </w:r>
+    </w:p>
+    <w:p>
+      <w:pPr>
+        <w:pStyle w:val="Listenabsatz"/>
+        <w:numPr>
+          <w:ilvl w:val="0"/>
+          <w:numId w:val="2"/>
+        </w:numPr>
+      </w:pPr>
+      <w:r>
+        <w:t>Einzelne Trials als Messreihen</w:t>
+      </w:r>
+    </w:p>
+    <w:p>
+      <w:pPr>
+        <w:pStyle w:val="Listenabsatz"/>
+        <w:numPr>
+          <w:ilvl w:val="0"/>
+          <w:numId w:val="2"/>
+        </w:numPr>
+      </w:pPr>
+      <w:r>
+        <w:t>zweifaktorielle ANOVA</w:t>
+      </w:r>
+    </w:p>
+    <w:p>
+      <w:pPr>
+        <w:pStyle w:val="Listenabsatz"/>
+        <w:numPr>
+          <w:ilvl w:val="1"/>
+          <w:numId w:val="2"/>
+        </w:numPr>
+      </w:pPr>
+      <w:r>
+        <w:t>abhängige Variable: Dauer</w:t>
+      </w:r>
+    </w:p>
+    <w:p>
+      <w:pPr>
+        <w:pStyle w:val="Listenabsatz"/>
+        <w:numPr>
+          <w:ilvl w:val="1"/>
+          <w:numId w:val="2"/>
+        </w:numPr>
+      </w:pPr>
+      <w:r>
+        <w:t xml:space="preserve">Gruppenvariablen: </w:t>
+      </w:r>
+      <w:proofErr w:type="spellStart"/>
+      <w:r>
+        <w:t>Ebenenanzahl</w:t>
+      </w:r>
+      <w:proofErr w:type="spellEnd"/>
+      <w:r>
+        <w:t xml:space="preserve">, </w:t>
+      </w:r>
+      <w:proofErr w:type="spellStart"/>
+      <w:r>
+        <w:t>Ebenenanordnung</w:t>
+      </w:r>
+      <w:proofErr w:type="spellEnd"/>
+    </w:p>
+    <w:p>
+      <w:pPr>
+        <w:pStyle w:val="Listenabsatz"/>
+        <w:numPr>
+          <w:ilvl w:val="0"/>
+          <w:numId w:val="2"/>
+        </w:numPr>
+      </w:pPr>
+      <w:r>
+        <w:t>Import:</w:t>
+      </w:r>
+    </w:p>
+    <w:p>
+      <w:pPr>
+        <w:pStyle w:val="Listenabsatz"/>
+        <w:numPr>
+          <w:ilvl w:val="1"/>
+          <w:numId w:val="2"/>
+        </w:numPr>
+        <w:rPr>
+          <w:lang w:val="en-GB"/>
+        </w:rPr>
+      </w:pPr>
+      <w:r>
+        <w:rPr>
+          <w:lang w:val="en-GB"/>
+        </w:rPr>
+        <w:t>export/</w:t>
+      </w:r>
+      <w:r>
+        <w:rPr>
+          <w:lang w:val="en-GB"/>
+        </w:rPr>
+        <w:t>times</w:t>
+      </w:r>
+      <w:r>
+        <w:rPr>
+          <w:lang w:val="en-GB"/>
+        </w:rPr>
+        <w:t>_repeat</w:t>
+      </w:r>
+      <w:r>
+        <w:rPr>
+          <w:lang w:val="en-GB"/>
+        </w:rPr>
+        <w:t>.csv</w:t>
+      </w:r>
+    </w:p>
+    <w:p>
+      <w:pPr>
+        <w:pStyle w:val="Listenabsatz"/>
+        <w:numPr>
+          <w:ilvl w:val="1"/>
+          <w:numId w:val="2"/>
+        </w:numPr>
+        <w:rPr>
+          <w:lang w:val="en-GB"/>
+        </w:rPr>
+      </w:pPr>
+      <w:proofErr w:type="spellStart"/>
+      <w:r>
+        <w:rPr>
+          <w:lang w:val="en-GB"/>
+        </w:rPr>
+        <w:t>Variablen</w:t>
+      </w:r>
+      <w:proofErr w:type="spellEnd"/>
+      <w:r>
+        <w:rPr>
+          <w:lang w:val="en-GB"/>
+        </w:rPr>
+        <w:t xml:space="preserve">: </w:t>
+      </w:r>
+    </w:p>
+    <w:p>
+      <w:pPr>
+        <w:pStyle w:val="Listenabsatz"/>
+        <w:numPr>
+          <w:ilvl w:val="2"/>
+          <w:numId w:val="2"/>
+        </w:numPr>
+        <w:rPr>
+          <w:lang w:val="en-GB"/>
+        </w:rPr>
+      </w:pPr>
+      <w:r>
+        <w:rPr>
+          <w:lang w:val="en-GB"/>
+        </w:rPr>
+        <w:t>Proband/</w:t>
+      </w:r>
+      <w:proofErr w:type="spellStart"/>
+      <w:r>
+        <w:rPr>
+          <w:lang w:val="en-GB"/>
+        </w:rPr>
+        <w:t>MappingMethod</w:t>
+      </w:r>
+      <w:proofErr w:type="spellEnd"/>
+      <w:r>
+        <w:rPr>
+          <w:lang w:val="en-GB"/>
+        </w:rPr>
+        <w:t>/Block/Task/: Nominal</w:t>
+      </w:r>
+    </w:p>
+    <w:p>
+      <w:pPr>
+        <w:pStyle w:val="Listenabsatz"/>
+        <w:numPr>
+          <w:ilvl w:val="2"/>
+          <w:numId w:val="2"/>
+        </w:numPr>
+        <w:rPr>
+          <w:lang w:val="en-GB"/>
+        </w:rPr>
+      </w:pPr>
+      <w:proofErr w:type="spellStart"/>
+      <w:r>
+        <w:rPr>
+          <w:lang w:val="en-GB"/>
+        </w:rPr>
+        <w:t>NumLayers</w:t>
+      </w:r>
+      <w:proofErr w:type="spellEnd"/>
+      <w:r>
+        <w:rPr>
+          <w:lang w:val="en-GB"/>
+        </w:rPr>
+        <w:t>: Ordinal</w:t>
+      </w:r>
+    </w:p>
+    <w:p>
+      <w:pPr>
+        <w:pStyle w:val="Listenabsatz"/>
+        <w:numPr>
+          <w:ilvl w:val="2"/>
+          <w:numId w:val="2"/>
+        </w:numPr>
+        <w:rPr>
+          <w:lang w:val="en-GB"/>
+        </w:rPr>
+      </w:pPr>
+      <w:r>
+        <w:rPr>
+          <w:lang w:val="en-GB"/>
+        </w:rPr>
+        <w:t xml:space="preserve">Rest: </w:t>
+      </w:r>
+      <w:proofErr w:type="spellStart"/>
+      <w:r>
+        <w:rPr>
+          <w:lang w:val="en-GB"/>
+        </w:rPr>
+        <w:t>Metrisch</w:t>
+      </w:r>
+      <w:proofErr w:type="spellEnd"/>
+    </w:p>
+    <w:p>
+      <w:pPr>
+        <w:pStyle w:val="Listenabsatz"/>
+        <w:numPr>
+          <w:ilvl w:val="0"/>
+          <w:numId w:val="2"/>
+        </w:numPr>
+        <w:rPr>
+          <w:lang w:val="en-GB"/>
+        </w:rPr>
+      </w:pPr>
+      <w:r>
+        <w:rPr>
+          <w:lang w:val="en-GB"/>
+        </w:rPr>
+        <w:t>Export:</w:t>
+      </w:r>
+    </w:p>
+    <w:p>
+      <w:pPr>
+        <w:pStyle w:val="Listenabsatz"/>
+        <w:numPr>
+          <w:ilvl w:val="1"/>
+          <w:numId w:val="2"/>
+        </w:numPr>
+        <w:rPr>
+          <w:lang w:val="en-GB"/>
+        </w:rPr>
+      </w:pPr>
+      <w:proofErr w:type="spellStart"/>
+      <w:r>
+        <w:rPr>
+          <w:lang w:val="en-GB"/>
+        </w:rPr>
+        <w:t>spss</w:t>
+      </w:r>
+      <w:proofErr w:type="spellEnd"/>
+      <w:r>
+        <w:rPr>
+          <w:lang w:val="en-GB"/>
+        </w:rPr>
+        <w:t>/</w:t>
+      </w:r>
+      <w:proofErr w:type="spellStart"/>
+      <w:r>
+        <w:rPr>
+          <w:lang w:val="en-GB"/>
+        </w:rPr>
+        <w:t>results_times_repeat.spv</w:t>
+      </w:r>
+      <w:proofErr w:type="spellEnd"/>
+    </w:p>
+    <w:p>
+      <w:pPr>
+        <w:pStyle w:val="Listenabsatz"/>
+        <w:numPr>
+          <w:ilvl w:val="1"/>
+          <w:numId w:val="2"/>
+        </w:numPr>
+        <w:rPr>
+          <w:lang w:val="en-GB"/>
+        </w:rPr>
+      </w:pPr>
+      <w:proofErr w:type="spellStart"/>
+      <w:r>
+        <w:rPr>
+          <w:lang w:val="en-GB"/>
+        </w:rPr>
+        <w:t>spss</w:t>
+      </w:r>
+      <w:proofErr w:type="spellEnd"/>
+      <w:r>
+        <w:rPr>
+          <w:lang w:val="en-GB"/>
+        </w:rPr>
+        <w:t>/</w:t>
+      </w:r>
+      <w:proofErr w:type="spellStart"/>
+      <w:r>
+        <w:rPr>
+          <w:lang w:val="en-GB"/>
+        </w:rPr>
+        <w:t>data_times_repeat.sav</w:t>
+      </w:r>
+      <w:proofErr w:type="spellEnd"/>
+    </w:p>
+    <w:p>
+      <w:pPr>
+        <w:pStyle w:val="Listenabsatz"/>
+        <w:numPr>
+          <w:ilvl w:val="0"/>
+          <w:numId w:val="2"/>
+        </w:numPr>
+        <w:rPr>
+          <w:lang w:val="en-GB"/>
+        </w:rPr>
+      </w:pPr>
+      <w:proofErr w:type="spellStart"/>
+      <w:r>
+        <w:rPr>
+          <w:lang w:val="en-GB"/>
+        </w:rPr>
+        <w:t>Messwiederholung</w:t>
+      </w:r>
+      <w:proofErr w:type="spellEnd"/>
+      <w:r>
+        <w:rPr>
+          <w:lang w:val="en-GB"/>
+        </w:rPr>
+        <w:t>:</w:t>
+      </w:r>
+    </w:p>
+    <w:p>
+      <w:pPr>
+        <w:pStyle w:val="Listenabsatz"/>
+        <w:numPr>
+          <w:ilvl w:val="1"/>
+          <w:numId w:val="2"/>
+        </w:numPr>
+        <w:rPr>
+          <w:lang w:val="en-GB"/>
+        </w:rPr>
+      </w:pPr>
+      <w:proofErr w:type="spellStart"/>
+      <w:r>
+        <w:rPr>
+          <w:lang w:val="en-GB"/>
+        </w:rPr>
+        <w:t>mit</w:t>
+      </w:r>
+      <w:proofErr w:type="spellEnd"/>
+      <w:r>
+        <w:rPr>
+          <w:lang w:val="en-GB"/>
+        </w:rPr>
+        <w:t xml:space="preserve"> 5 </w:t>
+      </w:r>
+      <w:proofErr w:type="spellStart"/>
+      <w:r>
+        <w:rPr>
+          <w:lang w:val="en-GB"/>
+        </w:rPr>
+        <w:t>Messzeitpunkten</w:t>
+      </w:r>
+      <w:proofErr w:type="spellEnd"/>
+      <w:r>
+        <w:rPr>
+          <w:lang w:val="en-GB"/>
+        </w:rPr>
+        <w:t xml:space="preserve"> @0, @</w:t>
+      </w:r>
+      <w:proofErr w:type="gramStart"/>
+      <w:r>
+        <w:rPr>
+          <w:lang w:val="en-GB"/>
+        </w:rPr>
+        <w:t>1,@</w:t>
+      </w:r>
+      <w:proofErr w:type="gramEnd"/>
+      <w:r>
+        <w:rPr>
+          <w:lang w:val="en-GB"/>
+        </w:rPr>
+        <w:t>2, @3,@4</w:t>
+      </w:r>
+    </w:p>
+    <w:p>
+      <w:pPr>
+        <w:pStyle w:val="Listenabsatz"/>
+        <w:numPr>
+          <w:ilvl w:val="1"/>
+          <w:numId w:val="2"/>
+        </w:numPr>
+        <w:rPr>
+          <w:lang w:val="en-GB"/>
+        </w:rPr>
+      </w:pPr>
+      <w:proofErr w:type="spellStart"/>
+      <w:r>
+        <w:rPr>
+          <w:lang w:val="en-GB"/>
+        </w:rPr>
+        <w:t>Zwischensubjektfaktoren</w:t>
+      </w:r>
+      <w:proofErr w:type="spellEnd"/>
+      <w:r>
+        <w:rPr>
+          <w:lang w:val="en-GB"/>
+        </w:rPr>
+        <w:t xml:space="preserve">: </w:t>
+      </w:r>
+      <w:proofErr w:type="spellStart"/>
+      <w:r>
+        <w:rPr>
+          <w:lang w:val="en-GB"/>
+        </w:rPr>
+        <w:t>MappingMethod</w:t>
+      </w:r>
+      <w:proofErr w:type="spellEnd"/>
+      <w:r>
+        <w:rPr>
+          <w:lang w:val="en-GB"/>
+        </w:rPr>
+        <w:t xml:space="preserve">, </w:t>
+      </w:r>
+      <w:proofErr w:type="spellStart"/>
+      <w:r>
+        <w:rPr>
+          <w:lang w:val="en-GB"/>
+        </w:rPr>
+        <w:t>NumLayers</w:t>
+      </w:r>
+      <w:proofErr w:type="spellEnd"/>
+    </w:p>
+    <w:p>
+      <w:pPr>
+        <w:pStyle w:val="Listenabsatz"/>
+        <w:numPr>
+          <w:ilvl w:val="1"/>
+          <w:numId w:val="2"/>
+        </w:numPr>
+      </w:pPr>
+      <w:r>
+        <w:t xml:space="preserve">Diagramme: </w:t>
+      </w:r>
+      <w:proofErr w:type="spellStart"/>
+      <w:r>
+        <w:t>MaapingMethod</w:t>
+      </w:r>
+      <w:proofErr w:type="spellEnd"/>
+      <w:r>
+        <w:t>/</w:t>
+      </w:r>
+      <w:proofErr w:type="spellStart"/>
+      <w:r>
+        <w:t>NumLayers</w:t>
+      </w:r>
+      <w:proofErr w:type="spellEnd"/>
+      <w:r>
+        <w:t xml:space="preserve"> als horizontale Achse, Duration als Separate Linie</w:t>
+      </w:r>
+    </w:p>
+    <w:p>
+      <w:pPr>
+        <w:pStyle w:val="Listenabsatz"/>
+        <w:numPr>
+          <w:ilvl w:val="0"/>
+          <w:numId w:val="2"/>
+        </w:numPr>
+      </w:pPr>
+      <w:r>
+        <w:t>Ergebnisse:</w:t>
+      </w:r>
+    </w:p>
+    <w:p>
+      <w:pPr>
+        <w:pStyle w:val="Listenabsatz"/>
+        <w:numPr>
+          <w:ilvl w:val="1"/>
+          <w:numId w:val="2"/>
+        </w:numPr>
+      </w:pPr>
+      <w:r>
+        <w:t xml:space="preserve">Box-Test: Signifikanz </w:t>
+      </w:r>
+      <w:proofErr w:type="gramStart"/>
+      <w:r>
+        <w:t>0,000 ?</w:t>
+      </w:r>
+      <w:proofErr w:type="gramEnd"/>
+    </w:p>
+    <w:p>
+      <w:pPr>
+        <w:pStyle w:val="Listenabsatz"/>
+        <w:numPr>
+          <w:ilvl w:val="1"/>
+          <w:numId w:val="2"/>
+        </w:numPr>
+      </w:pPr>
+      <w:r>
+        <w:t>Duration als signifikanter Effekt (&lt;0,001)</w:t>
+      </w:r>
+    </w:p>
+    <w:p>
+      <w:pPr>
+        <w:pStyle w:val="Listenabsatz"/>
+        <w:numPr>
+          <w:ilvl w:val="1"/>
+          <w:numId w:val="2"/>
+        </w:numPr>
+      </w:pPr>
+      <w:proofErr w:type="spellStart"/>
+      <w:r>
+        <w:t>NumLayers</w:t>
+      </w:r>
+      <w:proofErr w:type="spellEnd"/>
+      <w:r>
+        <w:t>: signifikant bei paarweisen vergleichen: 6 vs. 18/21</w:t>
+      </w:r>
+    </w:p>
+    <w:p>
+      <w:pPr>
+        <w:pStyle w:val="Listenabsatz"/>
+        <w:numPr>
+          <w:ilvl w:val="1"/>
+          <w:numId w:val="2"/>
+        </w:numPr>
+      </w:pPr>
+      <w:r>
+        <w:t>Gesamteffekt: Signifikant (0,001)</w:t>
+      </w:r>
+    </w:p>
+    <w:p>
+      <w:pPr>
+        <w:pStyle w:val="Listenabsatz"/>
+        <w:numPr>
+          <w:ilvl w:val="1"/>
+          <w:numId w:val="2"/>
+        </w:numPr>
+      </w:pPr>
+      <w:r>
+        <w:t>Duration: signifikanter Effekt Durchgang 1 vs. Andere Durchgänge (&lt;0,001), keine Effekt</w:t>
+      </w:r>
+      <w:r>
+        <w:t>e</w:t>
+      </w:r>
+      <w:r>
+        <w:t xml:space="preserve"> zwischen </w:t>
+      </w:r>
+      <w:r>
+        <w:t xml:space="preserve">Durchgängen </w:t>
+      </w:r>
+      <w:r>
+        <w:t>2-</w:t>
+      </w:r>
+      <w:proofErr w:type="gramStart"/>
+      <w:r>
+        <w:t>5 !</w:t>
+      </w:r>
+      <w:proofErr w:type="gramEnd"/>
+    </w:p>
+    <w:p>
+      <w:pPr>
+        <w:jc w:val="center"/>
+      </w:pPr>
+      <w:r>
+        <w:drawing>
+          <wp:inline distT="0" distB="0" distL="0" distR="0" wp14:anchorId="3FA7BCB9" wp14:editId="4BF55615">
+            <wp:extent cx="3724275" cy="2196304"/>
+            <wp:effectExtent l="0" t="0" r="0" b="0"/>
+            <wp:docPr id="21" name="Grafik 21"/>
+            <wp:cNvGraphicFramePr>
+              <a:graphicFrameLocks xmlns:a="http://schemas.openxmlformats.org/drawingml/2006/main" noChangeAspect="1"/>
+            </wp:cNvGraphicFramePr>
+            <a:graphic xmlns:a="http://schemas.openxmlformats.org/drawingml/2006/main">
+              <a:graphicData uri="http://schemas.openxmlformats.org/drawingml/2006/picture">
+                <pic:pic xmlns:pic="http://schemas.openxmlformats.org/drawingml/2006/picture">
+                  <pic:nvPicPr>
+                    <pic:cNvPr id="1" name=""/>
+                    <pic:cNvPicPr/>
+                  </pic:nvPicPr>
+                  <pic:blipFill>
+                    <a:blip r:embed="rId27"/>
+                    <a:stretch>
+                      <a:fillRect/>
+                    </a:stretch>
+                  </pic:blipFill>
+                  <pic:spPr>
+                    <a:xfrm>
+                      <a:off x="0" y="0"/>
+                      <a:ext cx="3735069" cy="2202669"/>
+                    </a:xfrm>
+                    <a:prstGeom prst="rect">
+                      <a:avLst/>
+                    </a:prstGeom>
+                  </pic:spPr>
+                </pic:pic>
+              </a:graphicData>
+            </a:graphic>
+          </wp:inline>
+        </w:drawing>
+      </w:r>
+    </w:p>
+    <w:p>
+      <w:pPr>
+        <w:pStyle w:val="Listenabsatz"/>
+        <w:numPr>
+          <w:ilvl w:val="1"/>
+          <w:numId w:val="2"/>
+        </w:numPr>
+      </w:pPr>
+      <w:r>
+        <w:t xml:space="preserve">Effekte bei </w:t>
+      </w:r>
+      <w:proofErr w:type="spellStart"/>
+      <w:r>
+        <w:t>NumLayers</w:t>
+      </w:r>
+      <w:proofErr w:type="spellEnd"/>
+      <w:r>
+        <w:t>* Duration:</w:t>
+      </w:r>
+    </w:p>
+    <w:p>
+      <w:pPr>
+        <w:pStyle w:val="Listenabsatz"/>
+        <w:numPr>
+          <w:ilvl w:val="2"/>
+          <w:numId w:val="2"/>
+        </w:numPr>
+      </w:pPr>
+      <w:proofErr w:type="spellStart"/>
+      <w:r>
+        <w:t>Durchngang</w:t>
+      </w:r>
+      <w:proofErr w:type="spellEnd"/>
+      <w:r>
+        <w:t xml:space="preserve"> 1: Keine </w:t>
+      </w:r>
+      <w:proofErr w:type="gramStart"/>
+      <w:r>
+        <w:t xml:space="preserve">Effekte </w:t>
+      </w:r>
+      <w:r>
+        <w:t>!</w:t>
+      </w:r>
+      <w:proofErr w:type="gramEnd"/>
+    </w:p>
+    <w:p>
+      <w:pPr>
+        <w:pStyle w:val="Listenabsatz"/>
+        <w:numPr>
+          <w:ilvl w:val="2"/>
+          <w:numId w:val="2"/>
+        </w:numPr>
+      </w:pPr>
+      <w:r>
+        <w:t xml:space="preserve">2 und 5 durchgängig starke </w:t>
+      </w:r>
+      <w:proofErr w:type="spellStart"/>
+      <w:r>
+        <w:t>effekte</w:t>
+      </w:r>
+      <w:proofErr w:type="spellEnd"/>
+      <w:r>
+        <w:t xml:space="preserve">, 3,4 weniger stark </w:t>
+      </w:r>
+      <w:proofErr w:type="gramStart"/>
+      <w:r>
+        <w:t>ausgeprägt</w:t>
+      </w:r>
+      <w:proofErr w:type="gramEnd"/>
+      <w:r>
+        <w:t xml:space="preserve"> aber vorhanden</w:t>
+      </w:r>
+    </w:p>
+    <w:p>
+      <w:pPr>
+        <w:pStyle w:val="Listenabsatz"/>
+        <w:numPr>
+          <w:ilvl w:val="2"/>
+          <w:numId w:val="2"/>
+        </w:numPr>
+      </w:pPr>
+      <w:r>
+        <w:t xml:space="preserve">Grafiken aus der </w:t>
+      </w:r>
+      <w:proofErr w:type="gramStart"/>
+      <w:r>
+        <w:t>MANOVA :</w:t>
+      </w:r>
+      <w:proofErr w:type="gramEnd"/>
+    </w:p>
+    <w:p>
+      <w:pPr>
+        <w:autoSpaceDE w:val="0"/>
+        <w:autoSpaceDN w:val="0"/>
+        <w:adjustRightInd w:val="0"/>
+        <w:spacing w:after="0" w:line="240" w:lineRule="auto"/>
+        <w:rPr>
+          <w:noProof/>
+        </w:rPr>
+      </w:pPr>
+      <w:r>
+        <w:rPr>
+          <w:noProof/>
+        </w:rPr>
+        <w:lastRenderedPageBreak/>
+        <w:drawing>
+          <wp:inline distT="0" distB="0" distL="0" distR="0" wp14:anchorId="2B3F18C1" wp14:editId="026B27FE">
+            <wp:extent cx="2492463" cy="1466850"/>
+            <wp:effectExtent l="0" t="0" r="3175" b="0"/>
+            <wp:docPr id="19" name="Grafik 19"/>
+            <wp:cNvGraphicFramePr>
+              <a:graphicFrameLocks xmlns:a="http://schemas.openxmlformats.org/drawingml/2006/main" noChangeAspect="1"/>
+            </wp:cNvGraphicFramePr>
+            <a:graphic xmlns:a="http://schemas.openxmlformats.org/drawingml/2006/main">
+              <a:graphicData uri="http://schemas.openxmlformats.org/drawingml/2006/picture">
+                <pic:pic xmlns:pic="http://schemas.openxmlformats.org/drawingml/2006/picture">
+                  <pic:nvPicPr>
+                    <pic:cNvPr id="0" name="Picture 1"/>
+                    <pic:cNvPicPr>
+                      <a:picLocks noChangeAspect="1" noChangeArrowheads="1"/>
+                    </pic:cNvPicPr>
+                  </pic:nvPicPr>
+                  <pic:blipFill>
+                    <a:blip r:embed="rId28" cstate="print">
+                      <a:extLst>
+                        <a:ext uri="{28A0092B-C50C-407E-A947-70E740481C1C}">
+                          <a14:useLocalDpi xmlns:a14="http://schemas.microsoft.com/office/drawing/2010/main" val="0"/>
+                        </a:ext>
+                      </a:extLst>
+                    </a:blip>
+                    <a:srcRect/>
+                    <a:stretch>
+                      <a:fillRect/>
+                    </a:stretch>
+                  </pic:blipFill>
+                  <pic:spPr bwMode="auto">
+                    <a:xfrm>
+                      <a:off x="0" y="0"/>
+                      <a:ext cx="2506962" cy="1475383"/>
+                    </a:xfrm>
+                    <a:prstGeom prst="rect">
+                      <a:avLst/>
+                    </a:prstGeom>
+                    <a:noFill/>
+                    <a:ln>
+                      <a:noFill/>
+                    </a:ln>
+                  </pic:spPr>
+                </pic:pic>
+              </a:graphicData>
+            </a:graphic>
+          </wp:inline>
+        </w:drawing>
+      </w:r>
+      <w:r>
+        <w:rPr>
+          <w:noProof/>
+        </w:rPr>
+        <w:t xml:space="preserve">   </w:t>
+      </w:r>
+      <w:r>
+        <w:rPr>
+          <w:noProof/>
         </w:rPr>
         <w:t xml:space="preserve"> </w:t>
       </w:r>
-      <w:proofErr w:type="spellStart"/>
-      <w:r>
-        <w:rPr>
-          <w:lang w:val="en-GB"/>
-        </w:rPr>
-        <w:t>erfüllt</w:t>
-      </w:r>
-      <w:proofErr w:type="spellEnd"/>
-      <w:r>
-        <w:rPr>
-          <w:lang w:val="en-GB"/>
-        </w:rPr>
-        <w:t xml:space="preserve"> (S</w:t>
-      </w:r>
-      <w:r>
-        <w:rPr>
-          <w:lang w:val="en-GB"/>
-        </w:rPr>
-        <w:t>ig &gt; 0,8)</w:t>
-      </w:r>
-    </w:p>
-    <w:p>
-      <w:pPr>
-        <w:pStyle w:val="Listenabsatz"/>
-        <w:numPr>
-          <w:ilvl w:val="1"/>
-          <w:numId w:val="2"/>
-        </w:numPr>
-      </w:pPr>
+      <w:r>
+        <w:rPr>
+          <w:rFonts w:ascii="Times New Roman" w:hAnsi="Times New Roman" w:cs="Times New Roman"/>
+          <w:sz w:val="24"/>
+          <w:szCs w:val="24"/>
+        </w:rPr>
+        <w:drawing>
+          <wp:inline distT="0" distB="0" distL="0" distR="0" wp14:anchorId="79CDE80A" wp14:editId="47E05CE2">
+            <wp:extent cx="2492375" cy="1469820"/>
+            <wp:effectExtent l="0" t="0" r="3175" b="0"/>
+            <wp:docPr id="20" name="Grafik 20"/>
+            <wp:cNvGraphicFramePr>
+              <a:graphicFrameLocks xmlns:a="http://schemas.openxmlformats.org/drawingml/2006/main" noChangeAspect="1"/>
+            </wp:cNvGraphicFramePr>
+            <a:graphic xmlns:a="http://schemas.openxmlformats.org/drawingml/2006/main">
+              <a:graphicData uri="http://schemas.openxmlformats.org/drawingml/2006/picture">
+                <pic:pic xmlns:pic="http://schemas.openxmlformats.org/drawingml/2006/picture">
+                  <pic:nvPicPr>
+                    <pic:cNvPr id="1" name=""/>
+                    <pic:cNvPicPr/>
+                  </pic:nvPicPr>
+                  <pic:blipFill>
+                    <a:blip r:embed="rId29"/>
+                    <a:stretch>
+                      <a:fillRect/>
+                    </a:stretch>
+                  </pic:blipFill>
+                  <pic:spPr>
+                    <a:xfrm>
+                      <a:off x="0" y="0"/>
+                      <a:ext cx="2510336" cy="1480412"/>
+                    </a:xfrm>
+                    <a:prstGeom prst="rect">
+                      <a:avLst/>
+                    </a:prstGeom>
+                  </pic:spPr>
+                </pic:pic>
+              </a:graphicData>
+            </a:graphic>
+          </wp:inline>
+        </w:drawing>
+      </w:r>
+    </w:p>
+    <w:p>
+      <w:pPr>
+        <w:autoSpaceDE w:val="0"/>
+        <w:autoSpaceDN w:val="0"/>
+        <w:adjustRightInd w:val="0"/>
+        <w:spacing w:after="0" w:line="240" w:lineRule="auto"/>
+        <w:rPr>
+          <w:rFonts w:ascii="Times New Roman" w:hAnsi="Times New Roman" w:cs="Times New Roman"/>
+          <w:sz w:val="24"/>
+          <w:szCs w:val="24"/>
+        </w:rPr>
+      </w:pPr>
+      <w:r>
+        <w:rPr>
+          <w:rFonts w:ascii="Times New Roman" w:hAnsi="Times New Roman" w:cs="Times New Roman"/>
+          <w:noProof/>
+          <w:sz w:val="24"/>
+          <w:szCs w:val="24"/>
+        </w:rPr>
+        <w:drawing>
+          <wp:inline distT="0" distB="0" distL="0" distR="0" wp14:anchorId="5E452F1B" wp14:editId="1838FDED">
+            <wp:extent cx="2476279" cy="1457325"/>
+            <wp:effectExtent l="0" t="0" r="635" b="0"/>
+            <wp:docPr id="22" name="Grafik 22"/>
+            <wp:cNvGraphicFramePr>
+              <a:graphicFrameLocks xmlns:a="http://schemas.openxmlformats.org/drawingml/2006/main" noChangeAspect="1"/>
+            </wp:cNvGraphicFramePr>
+            <a:graphic xmlns:a="http://schemas.openxmlformats.org/drawingml/2006/main">
+              <a:graphicData uri="http://schemas.openxmlformats.org/drawingml/2006/picture">
+                <pic:pic xmlns:pic="http://schemas.openxmlformats.org/drawingml/2006/picture">
+                  <pic:nvPicPr>
+                    <pic:cNvPr id="0" name="Picture 3"/>
+                    <pic:cNvPicPr>
+                      <a:picLocks noChangeAspect="1" noChangeArrowheads="1"/>
+                    </pic:cNvPicPr>
+                  </pic:nvPicPr>
+                  <pic:blipFill>
+                    <a:blip r:embed="rId30" cstate="print">
+                      <a:extLst>
+                        <a:ext uri="{28A0092B-C50C-407E-A947-70E740481C1C}">
+                          <a14:useLocalDpi xmlns:a14="http://schemas.microsoft.com/office/drawing/2010/main" val="0"/>
+                        </a:ext>
+                      </a:extLst>
+                    </a:blip>
+                    <a:srcRect/>
+                    <a:stretch>
+                      <a:fillRect/>
+                    </a:stretch>
+                  </pic:blipFill>
+                  <pic:spPr bwMode="auto">
+                    <a:xfrm>
+                      <a:off x="0" y="0"/>
+                      <a:ext cx="2483137" cy="1461361"/>
+                    </a:xfrm>
+                    <a:prstGeom prst="rect">
+                      <a:avLst/>
+                    </a:prstGeom>
+                    <a:noFill/>
+                    <a:ln>
+                      <a:noFill/>
+                    </a:ln>
+                  </pic:spPr>
+                </pic:pic>
+              </a:graphicData>
+            </a:graphic>
+          </wp:inline>
+        </w:drawing>
+      </w:r>
+      <w:r>
+        <w:rPr>
+          <w:rFonts w:ascii="Times New Roman" w:hAnsi="Times New Roman" w:cs="Times New Roman"/>
+          <w:sz w:val="24"/>
+          <w:szCs w:val="24"/>
+        </w:rPr>
+        <w:t xml:space="preserve">    </w:t>
+      </w:r>
+      <w:r>
+        <w:rPr>
+          <w:rFonts w:ascii="Times New Roman" w:hAnsi="Times New Roman" w:cs="Times New Roman"/>
+          <w:noProof/>
+          <w:sz w:val="24"/>
+          <w:szCs w:val="24"/>
+        </w:rPr>
+        <w:drawing>
+          <wp:inline distT="0" distB="0" distL="0" distR="0" wp14:anchorId="053B485B" wp14:editId="0887BB2C">
+            <wp:extent cx="2486025" cy="1463061"/>
+            <wp:effectExtent l="0" t="0" r="0" b="3810"/>
+            <wp:docPr id="24" name="Grafik 24"/>
+            <wp:cNvGraphicFramePr>
+              <a:graphicFrameLocks xmlns:a="http://schemas.openxmlformats.org/drawingml/2006/main" noChangeAspect="1"/>
+            </wp:cNvGraphicFramePr>
+            <a:graphic xmlns:a="http://schemas.openxmlformats.org/drawingml/2006/main">
+              <a:graphicData uri="http://schemas.openxmlformats.org/drawingml/2006/picture">
+                <pic:pic xmlns:pic="http://schemas.openxmlformats.org/drawingml/2006/picture">
+                  <pic:nvPicPr>
+                    <pic:cNvPr id="0" name="Picture 7"/>
+                    <pic:cNvPicPr>
+                      <a:picLocks noChangeAspect="1" noChangeArrowheads="1"/>
+                    </pic:cNvPicPr>
+                  </pic:nvPicPr>
+                  <pic:blipFill>
+                    <a:blip r:embed="rId31" cstate="print">
+                      <a:extLst>
+                        <a:ext uri="{28A0092B-C50C-407E-A947-70E740481C1C}">
+                          <a14:useLocalDpi xmlns:a14="http://schemas.microsoft.com/office/drawing/2010/main" val="0"/>
+                        </a:ext>
+                      </a:extLst>
+                    </a:blip>
+                    <a:srcRect/>
+                    <a:stretch>
+                      <a:fillRect/>
+                    </a:stretch>
+                  </pic:blipFill>
+                  <pic:spPr bwMode="auto">
+                    <a:xfrm>
+                      <a:off x="0" y="0"/>
+                      <a:ext cx="2508970" cy="1476564"/>
+                    </a:xfrm>
+                    <a:prstGeom prst="rect">
+                      <a:avLst/>
+                    </a:prstGeom>
+                    <a:noFill/>
+                    <a:ln>
+                      <a:noFill/>
+                    </a:ln>
+                  </pic:spPr>
+                </pic:pic>
+              </a:graphicData>
+            </a:graphic>
+          </wp:inline>
+        </w:drawing>
+      </w:r>
+    </w:p>
+    <w:p>
+      <w:pPr>
+        <w:autoSpaceDE w:val="0"/>
+        <w:autoSpaceDN w:val="0"/>
+        <w:adjustRightInd w:val="0"/>
+        <w:spacing w:after="0" w:line="400" w:lineRule="atLeast"/>
+        <w:rPr>
+          <w:rFonts w:ascii="Times New Roman" w:hAnsi="Times New Roman" w:cs="Times New Roman"/>
+          <w:sz w:val="24"/>
+          <w:szCs w:val="24"/>
+        </w:rPr>
+      </w:pPr>
+    </w:p>
+    <w:p>
+      <w:pPr>
+        <w:autoSpaceDE w:val="0"/>
+        <w:autoSpaceDN w:val="0"/>
+        <w:adjustRightInd w:val="0"/>
+        <w:spacing w:after="0" w:line="240" w:lineRule="auto"/>
+        <w:rPr>
+          <w:rFonts w:ascii="Times New Roman" w:hAnsi="Times New Roman" w:cs="Times New Roman"/>
+          <w:sz w:val="24"/>
+          <w:szCs w:val="24"/>
+        </w:rPr>
+      </w:pPr>
+      <w:r>
+        <w:rPr>
+          <w:rFonts w:ascii="Times New Roman" w:hAnsi="Times New Roman" w:cs="Times New Roman"/>
+          <w:noProof/>
+          <w:sz w:val="24"/>
+          <w:szCs w:val="24"/>
+        </w:rPr>
+        <w:drawing>
+          <wp:inline distT="0" distB="0" distL="0" distR="0" wp14:anchorId="778E7809" wp14:editId="2B46D0CC">
+            <wp:extent cx="2457450" cy="1446244"/>
+            <wp:effectExtent l="0" t="0" r="0" b="1905"/>
+            <wp:docPr id="23" name="Grafik 23"/>
+            <wp:cNvGraphicFramePr>
+              <a:graphicFrameLocks xmlns:a="http://schemas.openxmlformats.org/drawingml/2006/main" noChangeAspect="1"/>
+            </wp:cNvGraphicFramePr>
+            <a:graphic xmlns:a="http://schemas.openxmlformats.org/drawingml/2006/main">
+              <a:graphicData uri="http://schemas.openxmlformats.org/drawingml/2006/picture">
+                <pic:pic xmlns:pic="http://schemas.openxmlformats.org/drawingml/2006/picture">
+                  <pic:nvPicPr>
+                    <pic:cNvPr id="0" name="Picture 5"/>
+                    <pic:cNvPicPr>
+                      <a:picLocks noChangeAspect="1" noChangeArrowheads="1"/>
+                    </pic:cNvPicPr>
+                  </pic:nvPicPr>
+                  <pic:blipFill>
+                    <a:blip r:embed="rId32" cstate="print">
+                      <a:extLst>
+                        <a:ext uri="{28A0092B-C50C-407E-A947-70E740481C1C}">
+                          <a14:useLocalDpi xmlns:a14="http://schemas.microsoft.com/office/drawing/2010/main" val="0"/>
+                        </a:ext>
+                      </a:extLst>
+                    </a:blip>
+                    <a:srcRect/>
+                    <a:stretch>
+                      <a:fillRect/>
+                    </a:stretch>
+                  </pic:blipFill>
+                  <pic:spPr bwMode="auto">
+                    <a:xfrm>
+                      <a:off x="0" y="0"/>
+                      <a:ext cx="2468917" cy="1452993"/>
+                    </a:xfrm>
+                    <a:prstGeom prst="rect">
+                      <a:avLst/>
+                    </a:prstGeom>
+                    <a:noFill/>
+                    <a:ln>
+                      <a:noFill/>
+                    </a:ln>
+                  </pic:spPr>
+                </pic:pic>
+              </a:graphicData>
+            </a:graphic>
+          </wp:inline>
+        </w:drawing>
+      </w:r>
+    </w:p>
+    <w:p>
+      <w:pPr>
+        <w:autoSpaceDE w:val="0"/>
+        <w:autoSpaceDN w:val="0"/>
+        <w:adjustRightInd w:val="0"/>
+        <w:spacing w:after="0" w:line="240" w:lineRule="auto"/>
+        <w:rPr>
+          <w:rFonts w:ascii="Times New Roman" w:hAnsi="Times New Roman" w:cs="Times New Roman"/>
+          <w:sz w:val="24"/>
+          <w:szCs w:val="24"/>
+        </w:rPr>
+      </w:pPr>
+    </w:p>
+    <w:p>
+      <w:pPr>
+        <w:pStyle w:val="Listenabsatz"/>
+        <w:numPr>
+          <w:ilvl w:val="0"/>
+          <w:numId w:val="2"/>
+        </w:numPr>
+        <w:autoSpaceDE w:val="0"/>
+        <w:autoSpaceDN w:val="0"/>
+        <w:adjustRightInd w:val="0"/>
+        <w:spacing w:after="0" w:line="240" w:lineRule="auto"/>
+        <w:rPr>
+          <w:rFonts w:cstheme="minorHAnsi"/>
+          <w:sz w:val="24"/>
+          <w:szCs w:val="24"/>
+        </w:rPr>
+      </w:pPr>
+      <w:r>
+        <w:rPr>
+          <w:rFonts w:cstheme="minorHAnsi"/>
+          <w:sz w:val="24"/>
+          <w:szCs w:val="24"/>
+        </w:rPr>
+        <w:t>Probleme</w:t>
+      </w:r>
+      <w:r>
+        <w:rPr>
+          <w:rFonts w:cstheme="minorHAnsi"/>
+          <w:sz w:val="24"/>
+          <w:szCs w:val="24"/>
+        </w:rPr>
+        <w:t>:</w:t>
+      </w:r>
+    </w:p>
+    <w:p>
+      <w:pPr>
+        <w:pStyle w:val="Listenabsatz"/>
+        <w:numPr>
+          <w:ilvl w:val="1"/>
+          <w:numId w:val="2"/>
+        </w:numPr>
+        <w:autoSpaceDE w:val="0"/>
+        <w:autoSpaceDN w:val="0"/>
+        <w:adjustRightInd w:val="0"/>
+        <w:spacing w:after="0" w:line="240" w:lineRule="auto"/>
+        <w:rPr>
+          <w:rFonts w:cstheme="minorHAnsi"/>
+          <w:sz w:val="24"/>
+          <w:szCs w:val="24"/>
+        </w:rPr>
+      </w:pPr>
+      <w:r>
+        <w:rPr>
+          <w:rFonts w:cstheme="minorHAnsi"/>
+          <w:sz w:val="24"/>
+          <w:szCs w:val="24"/>
+        </w:rPr>
+        <w:t>Levene-Test:</w:t>
+      </w:r>
+    </w:p>
+    <w:p>
+      <w:pPr>
+        <w:pStyle w:val="Listenabsatz"/>
+        <w:numPr>
+          <w:ilvl w:val="2"/>
+          <w:numId w:val="2"/>
+        </w:numPr>
+        <w:autoSpaceDE w:val="0"/>
+        <w:autoSpaceDN w:val="0"/>
+        <w:adjustRightInd w:val="0"/>
+        <w:spacing w:after="0" w:line="240" w:lineRule="auto"/>
+        <w:rPr>
+          <w:rFonts w:cstheme="minorHAnsi"/>
+          <w:sz w:val="24"/>
+          <w:szCs w:val="24"/>
+        </w:rPr>
+      </w:pPr>
+      <w:r>
+        <w:rPr>
+          <w:rFonts w:cstheme="minorHAnsi"/>
+          <w:sz w:val="24"/>
+          <w:szCs w:val="24"/>
+        </w:rPr>
+        <w:t>Durchgängig Signifikant bei@1, @4, ansonsten nur der Mittelwert</w:t>
+      </w:r>
+    </w:p>
+    <w:p>
+      <w:pPr>
+        <w:pStyle w:val="Listenabsatz"/>
+        <w:numPr>
+          <w:ilvl w:val="1"/>
+          <w:numId w:val="2"/>
+        </w:numPr>
+        <w:autoSpaceDE w:val="0"/>
+        <w:autoSpaceDN w:val="0"/>
+        <w:adjustRightInd w:val="0"/>
+        <w:spacing w:after="0" w:line="240" w:lineRule="auto"/>
+        <w:rPr>
+          <w:rFonts w:cstheme="minorHAnsi"/>
+          <w:sz w:val="24"/>
+          <w:szCs w:val="24"/>
+        </w:rPr>
+      </w:pPr>
+      <w:r>
+        <w:rPr>
+          <w:rFonts w:cstheme="minorHAnsi"/>
+          <w:sz w:val="24"/>
+          <w:szCs w:val="24"/>
+        </w:rPr>
+        <w:t>Box-Test: Signifikant: 0,000</w:t>
+      </w:r>
+    </w:p>
+    <w:p>
+      <w:r>
+        <w:drawing>
+          <wp:inline distT="0" distB="0" distL="0" distR="0" wp14:anchorId="0027AE7C" wp14:editId="4CBD5449">
+            <wp:extent cx="5760720" cy="3397250"/>
+            <wp:effectExtent l="0" t="0" r="0" b="0"/>
+            <wp:docPr id="11" name="Grafik 11"/>
+            <wp:cNvGraphicFramePr>
+              <a:graphicFrameLocks xmlns:a="http://schemas.openxmlformats.org/drawingml/2006/main" noChangeAspect="1"/>
+            </wp:cNvGraphicFramePr>
+            <a:graphic xmlns:a="http://schemas.openxmlformats.org/drawingml/2006/main">
+              <a:graphicData uri="http://schemas.openxmlformats.org/drawingml/2006/picture">
+                <pic:pic xmlns:pic="http://schemas.openxmlformats.org/drawingml/2006/picture">
+                  <pic:nvPicPr>
+                    <pic:cNvPr id="1" name=""/>
+                    <pic:cNvPicPr/>
+                  </pic:nvPicPr>
+                  <pic:blipFill>
+                    <a:blip r:embed="rId27"/>
+                    <a:stretch>
+                      <a:fillRect/>
+                    </a:stretch>
+                  </pic:blipFill>
+                  <pic:spPr>
+                    <a:xfrm>
+                      <a:off x="0" y="0"/>
+                      <a:ext cx="5760720" cy="3397250"/>
+                    </a:xfrm>
+                    <a:prstGeom prst="rect">
+                      <a:avLst/>
+                    </a:prstGeom>
+                  </pic:spPr>
+                </pic:pic>
+              </a:graphicData>
+            </a:graphic>
+          </wp:inline>
+        </w:drawing>
+      </w:r>
     </w:p>
     <w:p>
       <w:pPr>
         <w:pStyle w:val="berschrift3"/>
       </w:pPr>
       <w:r>
-        <w:t xml:space="preserve">Fundquote </w:t>
-      </w:r>
-    </w:p>
-    <w:p>
-      <w:pPr>
-        <w:pStyle w:val="Listenabsatz"/>
-        <w:numPr>
-          <w:ilvl w:val="0"/>
-          <w:numId w:val="2"/>
-        </w:numPr>
-      </w:pPr>
-      <w:r>
-        <w:t xml:space="preserve">falsche Ebene vs. </w:t>
-      </w:r>
-      <w:r>
-        <w:t>g</w:t>
-      </w:r>
-      <w:r>
-        <w:t>ehalten oder gewackelt</w:t>
-      </w:r>
-    </w:p>
-    <w:p>
-      <w:pPr>
-        <w:pStyle w:val="Listenabsatz"/>
-        <w:numPr>
-          <w:ilvl w:val="0"/>
-          <w:numId w:val="2"/>
-        </w:numPr>
-      </w:pPr>
-      <w:r>
-        <w:t>zweifaktorielle ANOVA</w:t>
-      </w:r>
-    </w:p>
-    <w:p>
-      <w:pPr>
-        <w:pStyle w:val="Listenabsatz"/>
-        <w:numPr>
-          <w:ilvl w:val="1"/>
-          <w:numId w:val="2"/>
-        </w:numPr>
-      </w:pPr>
-      <w:r>
-        <w:t xml:space="preserve">abhängige Variable: </w:t>
-      </w:r>
-      <w:r>
-        <w:t>falsche Ebene</w:t>
-      </w:r>
-      <w:r>
-        <w:t xml:space="preserve"> /</w:t>
-      </w:r>
-      <w:r>
-        <w:t xml:space="preserve"> </w:t>
-      </w:r>
-      <w:r>
-        <w:t>Gesamtanzahl</w:t>
-      </w:r>
-    </w:p>
-    <w:p>
-      <w:pPr>
-        <w:pStyle w:val="Listenabsatz"/>
-        <w:numPr>
-          <w:ilvl w:val="1"/>
-          <w:numId w:val="2"/>
-        </w:numPr>
-      </w:pPr>
-      <w:r>
-        <w:t xml:space="preserve">Gruppenvariablen: </w:t>
-      </w:r>
-      <w:proofErr w:type="spellStart"/>
-      <w:r>
-        <w:t>Ebenenanzahl</w:t>
-      </w:r>
-      <w:proofErr w:type="spellEnd"/>
-      <w:r>
-        <w:t xml:space="preserve">, </w:t>
-      </w:r>
-      <w:proofErr w:type="spellStart"/>
-      <w:r>
-        <w:t>Ebenenanordnung</w:t>
-      </w:r>
-      <w:proofErr w:type="spellEnd"/>
-    </w:p>
-    <w:p>
-      <w:pPr>
-        <w:pStyle w:val="Listenabsatz"/>
-        <w:numPr>
-          <w:ilvl w:val="0"/>
-          <w:numId w:val="2"/>
-        </w:numPr>
-      </w:pPr>
-      <w:r>
-        <w:t>Import/Export: s.o.</w:t>
-      </w:r>
-    </w:p>
-    <w:p>
-      <w:pPr>
-        <w:pStyle w:val="Listenabsatz"/>
-        <w:numPr>
-          <w:ilvl w:val="0"/>
-          <w:numId w:val="2"/>
-        </w:numPr>
-      </w:pPr>
-      <w:r>
-        <w:t>Ergebnis:</w:t>
-      </w:r>
-    </w:p>
-    <w:p>
-      <w:pPr>
-        <w:pStyle w:val="Listenabsatz"/>
-        <w:numPr>
-          <w:ilvl w:val="1"/>
-          <w:numId w:val="2"/>
-        </w:numPr>
-        <w:rPr>
-          <w:lang w:val="en-GB"/>
-        </w:rPr>
-      </w:pPr>
-      <w:proofErr w:type="spellStart"/>
-      <w:r>
-        <w:rPr>
-          <w:lang w:val="en-GB"/>
-        </w:rPr>
-        <w:t>NumLayers</w:t>
-      </w:r>
-      <w:proofErr w:type="spellEnd"/>
-      <w:r>
-        <w:rPr>
-          <w:lang w:val="en-GB"/>
-        </w:rPr>
-        <w:t xml:space="preserve"> FAST </w:t>
-      </w:r>
-      <w:proofErr w:type="spellStart"/>
-      <w:r>
-        <w:rPr>
-          <w:lang w:val="en-GB"/>
-        </w:rPr>
-        <w:t>signifikant</w:t>
-      </w:r>
-      <w:proofErr w:type="spellEnd"/>
-      <w:r>
-        <w:rPr>
-          <w:lang w:val="en-GB"/>
-        </w:rPr>
-        <w:t xml:space="preserve"> </w:t>
-      </w:r>
-      <w:proofErr w:type="spellStart"/>
-      <w:r>
-        <w:rPr>
-          <w:lang w:val="en-GB"/>
-        </w:rPr>
-        <w:t>bei</w:t>
-      </w:r>
-      <w:proofErr w:type="spellEnd"/>
-      <w:r>
-        <w:rPr>
-          <w:lang w:val="en-GB"/>
-        </w:rPr>
-        <w:t xml:space="preserve"> </w:t>
-      </w:r>
-      <w:proofErr w:type="spellStart"/>
-      <w:r>
-        <w:rPr>
-          <w:lang w:val="en-GB"/>
-        </w:rPr>
-        <w:t>Failed_A</w:t>
-      </w:r>
-      <w:r>
-        <w:rPr>
-          <w:lang w:val="en-GB"/>
-        </w:rPr>
-        <w:t>bs</w:t>
-      </w:r>
-      <w:proofErr w:type="spellEnd"/>
-      <w:r>
-        <w:rPr>
-          <w:lang w:val="en-GB"/>
-        </w:rPr>
-        <w:t xml:space="preserve"> (Sig 0.055)</w:t>
-      </w:r>
-    </w:p>
-    <w:p>
-      <w:pPr>
-        <w:pStyle w:val="Listenabsatz"/>
-        <w:numPr>
-          <w:ilvl w:val="1"/>
-          <w:numId w:val="2"/>
-        </w:numPr>
-      </w:pPr>
-      <w:r>
-        <w:rPr>
-          <w:lang w:val="en-GB"/>
-        </w:rPr>
-        <w:t xml:space="preserve">Problem: </w:t>
-      </w:r>
-      <w:proofErr w:type="spellStart"/>
-      <w:r>
-        <w:rPr>
-          <w:lang w:val="en-GB"/>
-        </w:rPr>
-        <w:t>Levene</w:t>
-      </w:r>
-      <w:proofErr w:type="spellEnd"/>
-      <w:r>
-        <w:rPr>
-          <w:lang w:val="en-GB"/>
-        </w:rPr>
-        <w:t xml:space="preserve">-Test </w:t>
-      </w:r>
-      <w:proofErr w:type="spellStart"/>
-      <w:r>
-        <w:rPr>
-          <w:lang w:val="en-GB"/>
-        </w:rPr>
-        <w:t>bei</w:t>
-      </w:r>
-      <w:proofErr w:type="spellEnd"/>
-      <w:r>
-        <w:rPr>
-          <w:lang w:val="en-GB"/>
-        </w:rPr>
-        <w:t xml:space="preserve"> </w:t>
-      </w:r>
-      <w:proofErr w:type="spellStart"/>
-      <w:r>
-        <w:rPr>
-          <w:lang w:val="en-GB"/>
-        </w:rPr>
-        <w:t>Failed_Abs</w:t>
-      </w:r>
-      <w:proofErr w:type="spellEnd"/>
-      <w:r>
-        <w:rPr>
-          <w:lang w:val="en-GB"/>
-        </w:rPr>
-        <w:t xml:space="preserve"> Sig. </w:t>
-      </w:r>
-      <w:r>
-        <w:t>&lt; 0,001, d.h. zu große S</w:t>
-      </w:r>
-      <w:r>
-        <w:t>treuung, Aussagen sind nicht „</w:t>
-      </w:r>
-      <w:proofErr w:type="gramStart"/>
-      <w:r>
-        <w:t>vertrauenswürdig“</w:t>
-      </w:r>
-      <w:proofErr w:type="gramEnd"/>
+        <w:lastRenderedPageBreak/>
+        <w:t>ANOVA über Gesamtergebnis (</w:t>
+      </w:r>
+      <w:r>
+        <w:t>Dauer</w:t>
+      </w:r>
+      <w:r>
+        <w:t xml:space="preserve"> pro Task)</w:t>
+      </w:r>
     </w:p>
     <w:p>
       <w:pPr>
         <w:pStyle w:val="berschrift3"/>
       </w:pPr>
       <w:r>
-        <w:t>Durchschnittliche Geschwindigkeit</w:t>
-      </w:r>
-      <w:r>
-        <w:t xml:space="preserve"> – global</w:t>
-      </w:r>
-    </w:p>
-    <w:p>
-      <w:pPr>
-        <w:pStyle w:val="Listenabsatz"/>
-        <w:numPr>
-          <w:ilvl w:val="0"/>
-          <w:numId w:val="2"/>
-        </w:numPr>
-      </w:pPr>
-      <w:r>
-        <w:t>Versuchsdauer unabhängig vom Versuchsausgang</w:t>
-      </w:r>
-    </w:p>
-    <w:p>
-      <w:pPr>
-        <w:pStyle w:val="Listenabsatz"/>
-        <w:numPr>
-          <w:ilvl w:val="0"/>
-          <w:numId w:val="2"/>
-        </w:numPr>
-      </w:pPr>
-      <w:r>
-        <w:t>zweifaktorielle ANOVA</w:t>
-      </w:r>
-    </w:p>
-    <w:p>
-      <w:pPr>
-        <w:pStyle w:val="Listenabsatz"/>
-        <w:numPr>
-          <w:ilvl w:val="1"/>
-          <w:numId w:val="2"/>
-        </w:numPr>
-      </w:pPr>
-      <w:r>
-        <w:t>abhängige Variable: Dauer</w:t>
-      </w:r>
-    </w:p>
-    <w:p>
-      <w:pPr>
-        <w:pStyle w:val="Listenabsatz"/>
-        <w:numPr>
-          <w:ilvl w:val="1"/>
-          <w:numId w:val="2"/>
-        </w:numPr>
-      </w:pPr>
-      <w:r>
-        <w:t xml:space="preserve">Gruppenvariablen: </w:t>
-      </w:r>
-      <w:proofErr w:type="spellStart"/>
-      <w:r>
-        <w:t>Ebenenanzahl</w:t>
-      </w:r>
-      <w:proofErr w:type="spellEnd"/>
-      <w:r>
-        <w:t xml:space="preserve">, </w:t>
-      </w:r>
-      <w:proofErr w:type="spellStart"/>
-      <w:r>
-        <w:t>Ebenenanordnung</w:t>
-      </w:r>
-      <w:proofErr w:type="spellEnd"/>
-    </w:p>
-    <w:p>
-      <w:pPr>
-        <w:pStyle w:val="Listenabsatz"/>
-        <w:numPr>
-          <w:ilvl w:val="0"/>
-          <w:numId w:val="2"/>
-        </w:numPr>
-      </w:pPr>
-      <w:r>
-        <w:t>Import:</w:t>
-      </w:r>
-    </w:p>
-    <w:p>
-      <w:pPr>
-        <w:pStyle w:val="Listenabsatz"/>
-        <w:numPr>
-          <w:ilvl w:val="1"/>
-          <w:numId w:val="2"/>
-        </w:numPr>
-        <w:rPr>
-          <w:lang w:val="en-GB"/>
-        </w:rPr>
-      </w:pPr>
-      <w:r>
-        <w:rPr>
-          <w:lang w:val="en-GB"/>
-        </w:rPr>
-        <w:t>export/</w:t>
-      </w:r>
-      <w:r>
-        <w:rPr>
-          <w:lang w:val="en-GB"/>
-        </w:rPr>
-        <w:t>times</w:t>
-      </w:r>
-      <w:r>
-        <w:rPr>
-          <w:lang w:val="en-GB"/>
-        </w:rPr>
-        <w:t>.csv</w:t>
-      </w:r>
-    </w:p>
-    <w:p>
-      <w:pPr>
-        <w:pStyle w:val="Listenabsatz"/>
-        <w:numPr>
-          <w:ilvl w:val="1"/>
-          <w:numId w:val="2"/>
-        </w:numPr>
-        <w:rPr>
-          <w:lang w:val="en-GB"/>
-        </w:rPr>
-      </w:pPr>
-      <w:proofErr w:type="spellStart"/>
-      <w:r>
-        <w:rPr>
-          <w:lang w:val="en-GB"/>
-        </w:rPr>
-        <w:t>Variablen</w:t>
-      </w:r>
-      <w:proofErr w:type="spellEnd"/>
-      <w:r>
-        <w:rPr>
-          <w:lang w:val="en-GB"/>
-        </w:rPr>
-        <w:t xml:space="preserve">: </w:t>
-      </w:r>
-    </w:p>
-    <w:p>
-      <w:pPr>
-        <w:pStyle w:val="Listenabsatz"/>
-        <w:numPr>
-          <w:ilvl w:val="2"/>
-          <w:numId w:val="2"/>
-        </w:numPr>
-        <w:rPr>
-          <w:lang w:val="en-GB"/>
-        </w:rPr>
-      </w:pPr>
-      <w:r>
-        <w:rPr>
-          <w:lang w:val="en-GB"/>
-        </w:rPr>
-        <w:t>V1/Proband/</w:t>
-      </w:r>
-      <w:proofErr w:type="spellStart"/>
-      <w:r>
-        <w:rPr>
-          <w:lang w:val="en-GB"/>
-        </w:rPr>
-        <w:t>MappingMethod</w:t>
-      </w:r>
-      <w:proofErr w:type="spellEnd"/>
-      <w:r>
-        <w:rPr>
-          <w:lang w:val="en-GB"/>
-        </w:rPr>
-        <w:t>/Block/Task/Trial/Target</w:t>
-      </w:r>
-      <w:r>
-        <w:rPr>
-          <w:lang w:val="en-GB"/>
-        </w:rPr>
-        <w:t>: Nominal</w:t>
-      </w:r>
-    </w:p>
-    <w:p>
-      <w:pPr>
-        <w:pStyle w:val="Listenabsatz"/>
-        <w:numPr>
-          <w:ilvl w:val="2"/>
-          <w:numId w:val="2"/>
-        </w:numPr>
-        <w:rPr>
-          <w:lang w:val="en-GB"/>
-        </w:rPr>
-      </w:pPr>
-      <w:proofErr w:type="spellStart"/>
-      <w:r>
-        <w:rPr>
-          <w:lang w:val="en-GB"/>
-        </w:rPr>
-        <w:t>NumLayers</w:t>
-      </w:r>
-      <w:proofErr w:type="spellEnd"/>
-      <w:r>
-        <w:rPr>
-          <w:lang w:val="en-GB"/>
-        </w:rPr>
-        <w:t>: Ordinal</w:t>
-      </w:r>
-    </w:p>
-    <w:p>
-      <w:pPr>
-        <w:pStyle w:val="Listenabsatz"/>
-        <w:numPr>
-          <w:ilvl w:val="2"/>
-          <w:numId w:val="2"/>
-        </w:numPr>
-        <w:rPr>
-          <w:lang w:val="en-GB"/>
-        </w:rPr>
-      </w:pPr>
-      <w:r>
-        <w:rPr>
-          <w:lang w:val="en-GB"/>
-        </w:rPr>
-        <w:t xml:space="preserve">Rest: </w:t>
-      </w:r>
-      <w:proofErr w:type="spellStart"/>
-      <w:r>
-        <w:rPr>
-          <w:lang w:val="en-GB"/>
-        </w:rPr>
-        <w:t>Metrisch</w:t>
-      </w:r>
-      <w:proofErr w:type="spellEnd"/>
-    </w:p>
-    <w:p>
-      <w:pPr>
-        <w:pStyle w:val="Listenabsatz"/>
-        <w:numPr>
-          <w:ilvl w:val="1"/>
-          <w:numId w:val="2"/>
-        </w:numPr>
-      </w:pPr>
+        <w:drawing>
+          <wp:inline distT="0" distB="0" distL="0" distR="0" wp14:anchorId="5AD75EE9" wp14:editId="7139C10C">
+            <wp:extent cx="2584248" cy="1524000"/>
+            <wp:effectExtent l="0" t="0" r="6985" b="0"/>
+            <wp:docPr id="29" name="Grafik 29"/>
+            <wp:cNvGraphicFramePr>
+              <a:graphicFrameLocks xmlns:a="http://schemas.openxmlformats.org/drawingml/2006/main" noChangeAspect="1"/>
+            </wp:cNvGraphicFramePr>
+            <a:graphic xmlns:a="http://schemas.openxmlformats.org/drawingml/2006/main">
+              <a:graphicData uri="http://schemas.openxmlformats.org/drawingml/2006/picture">
+                <pic:pic xmlns:pic="http://schemas.openxmlformats.org/drawingml/2006/picture">
+                  <pic:nvPicPr>
+                    <pic:cNvPr id="1" name=""/>
+                    <pic:cNvPicPr/>
+                  </pic:nvPicPr>
+                  <pic:blipFill>
+                    <a:blip r:embed="rId33"/>
+                    <a:stretch>
+                      <a:fillRect/>
+                    </a:stretch>
+                  </pic:blipFill>
+                  <pic:spPr>
+                    <a:xfrm>
+                      <a:off x="0" y="0"/>
+                      <a:ext cx="2595881" cy="1530860"/>
+                    </a:xfrm>
+                    <a:prstGeom prst="rect">
+                      <a:avLst/>
+                    </a:prstGeom>
+                  </pic:spPr>
+                </pic:pic>
+              </a:graphicData>
+            </a:graphic>
+          </wp:inline>
+        </w:drawing>
+      </w:r>
+      <w:r>
+        <w:t xml:space="preserve">    </w:t>
+      </w:r>
+      <w:r>
+        <w:drawing>
+          <wp:inline distT="0" distB="0" distL="0" distR="0" wp14:anchorId="0B3CF575" wp14:editId="17C43797">
+            <wp:extent cx="2543175" cy="1499778"/>
+            <wp:effectExtent l="0" t="0" r="0" b="5715"/>
+            <wp:docPr id="30" name="Grafik 30"/>
+            <wp:cNvGraphicFramePr>
+              <a:graphicFrameLocks xmlns:a="http://schemas.openxmlformats.org/drawingml/2006/main" noChangeAspect="1"/>
+            </wp:cNvGraphicFramePr>
+            <a:graphic xmlns:a="http://schemas.openxmlformats.org/drawingml/2006/main">
+              <a:graphicData uri="http://schemas.openxmlformats.org/drawingml/2006/picture">
+                <pic:pic xmlns:pic="http://schemas.openxmlformats.org/drawingml/2006/picture">
+                  <pic:nvPicPr>
+                    <pic:cNvPr id="1" name=""/>
+                    <pic:cNvPicPr/>
+                  </pic:nvPicPr>
+                  <pic:blipFill>
+                    <a:blip r:embed="rId34"/>
+                    <a:stretch>
+                      <a:fillRect/>
+                    </a:stretch>
+                  </pic:blipFill>
+                  <pic:spPr>
+                    <a:xfrm>
+                      <a:off x="0" y="0"/>
+                      <a:ext cx="2559059" cy="1509145"/>
+                    </a:xfrm>
+                    <a:prstGeom prst="rect">
+                      <a:avLst/>
+                    </a:prstGeom>
+                  </pic:spPr>
+                </pic:pic>
+              </a:graphicData>
+            </a:graphic>
+          </wp:inline>
+        </w:drawing>
+      </w:r>
     </w:p>
     <w:p>
       <w:pPr>
@@ -3839,7 +5960,7 @@
           <w:lang w:val="en-GB"/>
         </w:rPr>
       </w:pPr>
-      <w:hyperlink r:id="rId23" w:history="1">
+      <w:hyperlink r:id="rId35" w:history="1">
         <w:r>
           <w:rPr>
             <w:rStyle w:val="Hyperlink"/>

</xml_diff>

<commit_message>
feature: export stats for peaks containing only relevant data feature: updates spss files feature: spss anonva for peaks feature: documentation MANOVA/Messwiederholung
Former-commit-id: 964f60d13c6095d9d9f7e4bb0ab38135b3ad4846
</commit_message>
<xml_diff>
--- a/doc/Versuchsauswertung Zelasto.docx
+++ b/doc/Versuchsauswertung Zelasto.docx
@@ -1899,6 +1899,320 @@
         </w:drawing>
       </w:r>
     </w:p>
+    <w:p/>
+    <w:p>
+      <w:pPr>
+        <w:pStyle w:val="Listenabsatz"/>
+        <w:numPr>
+          <w:ilvl w:val="0"/>
+          <w:numId w:val="4"/>
+        </w:numPr>
+      </w:pPr>
+      <w:r>
+        <w:t>Multivariate ANOVA:</w:t>
+      </w:r>
+    </w:p>
+    <w:p>
+      <w:pPr>
+        <w:pStyle w:val="Listenabsatz"/>
+        <w:numPr>
+          <w:ilvl w:val="1"/>
+          <w:numId w:val="4"/>
+        </w:numPr>
+      </w:pPr>
+      <w:r>
+        <w:t xml:space="preserve">Analysieren </w:t>
+      </w:r>
+      <w:r>
+        <w:sym w:font="Wingdings" w:char="F0E0"/>
+      </w:r>
+      <w:r>
+        <w:t xml:space="preserve"> Allgemeines lineares Modell… </w:t>
+      </w:r>
+      <w:r>
+        <w:sym w:font="Wingdings" w:char="F0E0"/>
+      </w:r>
+      <w:r>
+        <w:t xml:space="preserve"> </w:t>
+      </w:r>
+      <w:proofErr w:type="gramStart"/>
+      <w:r>
+        <w:t>Multivariat</w:t>
+      </w:r>
+      <w:proofErr w:type="gramEnd"/>
+      <w:r>
+        <w:t>…</w:t>
+      </w:r>
+    </w:p>
+    <w:p>
+      <w:pPr>
+        <w:pStyle w:val="Listenabsatz"/>
+        <w:numPr>
+          <w:ilvl w:val="1"/>
+          <w:numId w:val="4"/>
+        </w:numPr>
+      </w:pPr>
+      <w:r>
+        <w:t>Einzelne Messreihen als Abhängige Variablen</w:t>
+      </w:r>
+    </w:p>
+    <w:p>
+      <w:pPr>
+        <w:pStyle w:val="Listenabsatz"/>
+        <w:numPr>
+          <w:ilvl w:val="1"/>
+          <w:numId w:val="4"/>
+        </w:numPr>
+      </w:pPr>
+      <w:r>
+        <w:t>Andere Einstellungen analog zur ANOVA</w:t>
+      </w:r>
+    </w:p>
+    <w:p>
+      <w:pPr>
+        <w:jc w:val="center"/>
+      </w:pPr>
+      <w:r>
+        <w:rPr>
+          <w:noProof/>
+        </w:rPr>
+        <w:drawing>
+          <wp:inline distT="0" distB="0" distL="0" distR="0" wp14:anchorId="2D3C3524" wp14:editId="3531678C">
+            <wp:extent cx="2519222" cy="1885950"/>
+            <wp:effectExtent l="0" t="0" r="0" b="0"/>
+            <wp:docPr id="33" name="Grafik 33"/>
+            <wp:cNvGraphicFramePr>
+              <a:graphicFrameLocks xmlns:a="http://schemas.openxmlformats.org/drawingml/2006/main" noChangeAspect="1"/>
+            </wp:cNvGraphicFramePr>
+            <a:graphic xmlns:a="http://schemas.openxmlformats.org/drawingml/2006/main">
+              <a:graphicData uri="http://schemas.openxmlformats.org/drawingml/2006/picture">
+                <pic:pic xmlns:pic="http://schemas.openxmlformats.org/drawingml/2006/picture">
+                  <pic:nvPicPr>
+                    <pic:cNvPr id="0" name="Picture 2"/>
+                    <pic:cNvPicPr>
+                      <a:picLocks noChangeAspect="1" noChangeArrowheads="1"/>
+                    </pic:cNvPicPr>
+                  </pic:nvPicPr>
+                  <pic:blipFill>
+                    <a:blip r:embed="rId22">
+                      <a:extLst>
+                        <a:ext uri="{28A0092B-C50C-407E-A947-70E740481C1C}">
+                          <a14:useLocalDpi xmlns:a14="http://schemas.microsoft.com/office/drawing/2010/main" val="0"/>
+                        </a:ext>
+                      </a:extLst>
+                    </a:blip>
+                    <a:srcRect/>
+                    <a:stretch>
+                      <a:fillRect/>
+                    </a:stretch>
+                  </pic:blipFill>
+                  <pic:spPr bwMode="auto">
+                    <a:xfrm>
+                      <a:off x="0" y="0"/>
+                      <a:ext cx="2531770" cy="1895344"/>
+                    </a:xfrm>
+                    <a:prstGeom prst="rect">
+                      <a:avLst/>
+                    </a:prstGeom>
+                    <a:noFill/>
+                    <a:ln>
+                      <a:noFill/>
+                    </a:ln>
+                  </pic:spPr>
+                </pic:pic>
+              </a:graphicData>
+            </a:graphic>
+          </wp:inline>
+        </w:drawing>
+      </w:r>
+    </w:p>
+    <w:p>
+      <w:pPr>
+        <w:ind w:left="1080"/>
+      </w:pPr>
+    </w:p>
+    <w:p>
+      <w:pPr>
+        <w:pStyle w:val="Listenabsatz"/>
+        <w:numPr>
+          <w:ilvl w:val="0"/>
+          <w:numId w:val="4"/>
+        </w:numPr>
+      </w:pPr>
+      <w:r>
+        <w:t>Messwiederholung</w:t>
+      </w:r>
+    </w:p>
+    <w:p>
+      <w:pPr>
+        <w:pStyle w:val="Listenabsatz"/>
+        <w:numPr>
+          <w:ilvl w:val="1"/>
+          <w:numId w:val="4"/>
+        </w:numPr>
+      </w:pPr>
+      <w:r>
+        <w:t xml:space="preserve">Analysieren </w:t>
+      </w:r>
+      <w:r>
+        <w:sym w:font="Wingdings" w:char="F0E0"/>
+      </w:r>
+      <w:r>
+        <w:t xml:space="preserve"> Allgemeines lineares Modell… </w:t>
+      </w:r>
+      <w:r>
+        <w:sym w:font="Wingdings" w:char="F0E0"/>
+      </w:r>
+      <w:r>
+        <w:t xml:space="preserve"> </w:t>
+      </w:r>
+      <w:r>
+        <w:t>Messwiederholung</w:t>
+      </w:r>
+      <w:r>
+        <w:t>…</w:t>
+      </w:r>
+    </w:p>
+    <w:p>
+      <w:pPr>
+        <w:pStyle w:val="Listenabsatz"/>
+        <w:numPr>
+          <w:ilvl w:val="1"/>
+          <w:numId w:val="4"/>
+        </w:numPr>
+      </w:pPr>
+      <w:r>
+        <w:t>Definition der Wiederholungen (Name/Anzahl)</w:t>
+      </w:r>
+    </w:p>
+    <w:p>
+      <w:pPr>
+        <w:jc w:val="center"/>
+      </w:pPr>
+      <w:r>
+        <w:rPr>
+          <w:noProof/>
+        </w:rPr>
+        <w:drawing>
+          <wp:inline distT="0" distB="0" distL="0" distR="0" wp14:anchorId="3574ADDD" wp14:editId="2EA331E0">
+            <wp:extent cx="2171700" cy="2247331"/>
+            <wp:effectExtent l="0" t="0" r="0" b="635"/>
+            <wp:docPr id="34" name="Grafik 34"/>
+            <wp:cNvGraphicFramePr>
+              <a:graphicFrameLocks xmlns:a="http://schemas.openxmlformats.org/drawingml/2006/main" noChangeAspect="1"/>
+            </wp:cNvGraphicFramePr>
+            <a:graphic xmlns:a="http://schemas.openxmlformats.org/drawingml/2006/main">
+              <a:graphicData uri="http://schemas.openxmlformats.org/drawingml/2006/picture">
+                <pic:pic xmlns:pic="http://schemas.openxmlformats.org/drawingml/2006/picture">
+                  <pic:nvPicPr>
+                    <pic:cNvPr id="0" name="Picture 3"/>
+                    <pic:cNvPicPr>
+                      <a:picLocks noChangeAspect="1" noChangeArrowheads="1"/>
+                    </pic:cNvPicPr>
+                  </pic:nvPicPr>
+                  <pic:blipFill>
+                    <a:blip r:embed="rId23">
+                      <a:extLst>
+                        <a:ext uri="{28A0092B-C50C-407E-A947-70E740481C1C}">
+                          <a14:useLocalDpi xmlns:a14="http://schemas.microsoft.com/office/drawing/2010/main" val="0"/>
+                        </a:ext>
+                      </a:extLst>
+                    </a:blip>
+                    <a:srcRect/>
+                    <a:stretch>
+                      <a:fillRect/>
+                    </a:stretch>
+                  </pic:blipFill>
+                  <pic:spPr bwMode="auto">
+                    <a:xfrm>
+                      <a:off x="0" y="0"/>
+                      <a:ext cx="2175589" cy="2251355"/>
+                    </a:xfrm>
+                    <a:prstGeom prst="rect">
+                      <a:avLst/>
+                    </a:prstGeom>
+                    <a:noFill/>
+                    <a:ln>
+                      <a:noFill/>
+                    </a:ln>
+                  </pic:spPr>
+                </pic:pic>
+              </a:graphicData>
+            </a:graphic>
+          </wp:inline>
+        </w:drawing>
+      </w:r>
+    </w:p>
+    <w:p>
+      <w:pPr>
+        <w:pStyle w:val="Listenabsatz"/>
+        <w:numPr>
+          <w:ilvl w:val="1"/>
+          <w:numId w:val="4"/>
+        </w:numPr>
+      </w:pPr>
+      <w:r>
+        <w:t>Spalten entsprechend zuordnen</w:t>
+      </w:r>
+    </w:p>
+    <w:p>
+      <w:pPr>
+        <w:jc w:val="center"/>
+      </w:pPr>
+      <w:r>
+        <w:rPr>
+          <w:noProof/>
+        </w:rPr>
+        <w:drawing>
+          <wp:inline distT="0" distB="0" distL="0" distR="0" wp14:anchorId="0216EBAE" wp14:editId="7655C997">
+            <wp:extent cx="3038475" cy="2517897"/>
+            <wp:effectExtent l="0" t="0" r="0" b="0"/>
+            <wp:docPr id="35" name="Grafik 35"/>
+            <wp:cNvGraphicFramePr>
+              <a:graphicFrameLocks xmlns:a="http://schemas.openxmlformats.org/drawingml/2006/main" noChangeAspect="1"/>
+            </wp:cNvGraphicFramePr>
+            <a:graphic xmlns:a="http://schemas.openxmlformats.org/drawingml/2006/main">
+              <a:graphicData uri="http://schemas.openxmlformats.org/drawingml/2006/picture">
+                <pic:pic xmlns:pic="http://schemas.openxmlformats.org/drawingml/2006/picture">
+                  <pic:nvPicPr>
+                    <pic:cNvPr id="0" name="Picture 4"/>
+                    <pic:cNvPicPr>
+                      <a:picLocks noChangeAspect="1" noChangeArrowheads="1"/>
+                    </pic:cNvPicPr>
+                  </pic:nvPicPr>
+                  <pic:blipFill>
+                    <a:blip r:embed="rId24">
+                      <a:extLst>
+                        <a:ext uri="{28A0092B-C50C-407E-A947-70E740481C1C}">
+                          <a14:useLocalDpi xmlns:a14="http://schemas.microsoft.com/office/drawing/2010/main" val="0"/>
+                        </a:ext>
+                      </a:extLst>
+                    </a:blip>
+                    <a:srcRect/>
+                    <a:stretch>
+                      <a:fillRect/>
+                    </a:stretch>
+                  </pic:blipFill>
+                  <pic:spPr bwMode="auto">
+                    <a:xfrm>
+                      <a:off x="0" y="0"/>
+                      <a:ext cx="3048093" cy="2525867"/>
+                    </a:xfrm>
+                    <a:prstGeom prst="rect">
+                      <a:avLst/>
+                    </a:prstGeom>
+                    <a:noFill/>
+                    <a:ln>
+                      <a:noFill/>
+                    </a:ln>
+                  </pic:spPr>
+                </pic:pic>
+              </a:graphicData>
+            </a:graphic>
+          </wp:inline>
+        </w:drawing>
+      </w:r>
+    </w:p>
     <w:p>
       <w:pPr>
         <w:pStyle w:val="berschrift1"/>
@@ -2219,7 +2533,7 @@
                     <pic:cNvPicPr/>
                   </pic:nvPicPr>
                   <pic:blipFill>
-                    <a:blip r:embed="rId22"/>
+                    <a:blip r:embed="rId25"/>
                     <a:stretch>
                       <a:fillRect/>
                     </a:stretch>
@@ -2359,14 +2673,140 @@
         <w:rPr>
           <w:lang w:val="en-GB"/>
         </w:rPr>
-        <w:t xml:space="preserve">ANOVA </w:t>
-      </w:r>
-      <w:proofErr w:type="spellStart"/>
-      <w:r>
-        <w:rPr>
-          <w:lang w:val="en-GB"/>
-        </w:rPr>
-        <w:t>für</w:t>
+        <w:t>ANOVA für:</w:t>
+      </w:r>
+    </w:p>
+    <w:p>
+      <w:pPr>
+        <w:pStyle w:val="Listenabsatz"/>
+        <w:numPr>
+          <w:ilvl w:val="1"/>
+          <w:numId w:val="2"/>
+        </w:numPr>
+        <w:rPr>
+          <w:lang w:val="en-GB"/>
+        </w:rPr>
+      </w:pPr>
+      <w:proofErr w:type="spellStart"/>
+      <w:r>
+        <w:rPr>
+          <w:lang w:val="en-GB"/>
+        </w:rPr>
+        <w:t>Completed_Abs</w:t>
+      </w:r>
+      <w:proofErr w:type="spellEnd"/>
+      <w:r>
+        <w:rPr>
+          <w:lang w:val="en-GB"/>
+        </w:rPr>
+        <w:t xml:space="preserve">, </w:t>
+      </w:r>
+      <w:proofErr w:type="spellStart"/>
+      <w:r>
+        <w:rPr>
+          <w:lang w:val="en-GB"/>
+        </w:rPr>
+        <w:t>Completed_Rel</w:t>
+      </w:r>
+      <w:proofErr w:type="spellEnd"/>
+      <w:r>
+        <w:rPr>
+          <w:lang w:val="en-GB"/>
+        </w:rPr>
+        <w:t xml:space="preserve"> (</w:t>
+      </w:r>
+      <w:proofErr w:type="spellStart"/>
+      <w:r>
+        <w:rPr>
+          <w:lang w:val="en-GB"/>
+        </w:rPr>
+        <w:t>kein</w:t>
+      </w:r>
+      <w:proofErr w:type="spellEnd"/>
+      <w:r>
+        <w:rPr>
+          <w:lang w:val="en-GB"/>
+        </w:rPr>
+        <w:t xml:space="preserve"> </w:t>
+      </w:r>
+      <w:proofErr w:type="spellStart"/>
+      <w:r>
+        <w:rPr>
+          <w:lang w:val="en-GB"/>
+        </w:rPr>
+        <w:t>Unterschied</w:t>
+      </w:r>
+      <w:proofErr w:type="spellEnd"/>
+      <w:r>
+        <w:rPr>
+          <w:lang w:val="en-GB"/>
+        </w:rPr>
+        <w:t>)</w:t>
+      </w:r>
+    </w:p>
+    <w:p>
+      <w:pPr>
+        <w:pStyle w:val="Listenabsatz"/>
+        <w:numPr>
+          <w:ilvl w:val="1"/>
+          <w:numId w:val="2"/>
+        </w:numPr>
+        <w:rPr>
+          <w:lang w:val="en-GB"/>
+        </w:rPr>
+      </w:pPr>
+      <w:proofErr w:type="spellStart"/>
+      <w:r>
+        <w:rPr>
+          <w:lang w:val="en-GB"/>
+        </w:rPr>
+        <w:t>Terminated_Abs</w:t>
+      </w:r>
+      <w:proofErr w:type="spellEnd"/>
+      <w:r>
+        <w:rPr>
+          <w:lang w:val="en-GB"/>
+        </w:rPr>
+        <w:t>,</w:t>
+      </w:r>
+    </w:p>
+    <w:p>
+      <w:pPr>
+        <w:pStyle w:val="Listenabsatz"/>
+        <w:numPr>
+          <w:ilvl w:val="1"/>
+          <w:numId w:val="2"/>
+        </w:numPr>
+        <w:rPr>
+          <w:lang w:val="en-GB"/>
+        </w:rPr>
+      </w:pPr>
+      <w:proofErr w:type="spellStart"/>
+      <w:r>
+        <w:rPr>
+          <w:lang w:val="en-GB"/>
+        </w:rPr>
+        <w:t>Failed_Abs</w:t>
+      </w:r>
+      <w:proofErr w:type="spellEnd"/>
+    </w:p>
+    <w:p>
+      <w:pPr>
+        <w:pStyle w:val="Listenabsatz"/>
+        <w:numPr>
+          <w:ilvl w:val="0"/>
+          <w:numId w:val="2"/>
+        </w:numPr>
+        <w:rPr>
+          <w:lang w:val="en-GB"/>
+        </w:rPr>
+      </w:pPr>
+      <w:proofErr w:type="spellStart"/>
+      <w:r>
+        <w:rPr>
+          <w:lang w:val="en-GB"/>
+        </w:rPr>
+        <w:t>Ergebnis</w:t>
       </w:r>
       <w:proofErr w:type="spellEnd"/>
       <w:r>
@@ -2383,44 +2823,278 @@
           <w:ilvl w:val="1"/>
           <w:numId w:val="2"/>
         </w:numPr>
-        <w:rPr>
-          <w:lang w:val="en-GB"/>
-        </w:rPr>
-      </w:pPr>
-      <w:proofErr w:type="spellStart"/>
-      <w:r>
-        <w:rPr>
-          <w:lang w:val="en-GB"/>
-        </w:rPr>
-        <w:t>Completed_Abs</w:t>
-      </w:r>
-      <w:proofErr w:type="spellEnd"/>
-      <w:r>
-        <w:rPr>
-          <w:lang w:val="en-GB"/>
-        </w:rPr>
-        <w:t xml:space="preserve">, </w:t>
-      </w:r>
-      <w:proofErr w:type="spellStart"/>
-      <w:r>
-        <w:rPr>
-          <w:lang w:val="en-GB"/>
-        </w:rPr>
-        <w:t>Completed_Rel</w:t>
-      </w:r>
-      <w:proofErr w:type="spellEnd"/>
-      <w:r>
-        <w:rPr>
-          <w:lang w:val="en-GB"/>
-        </w:rPr>
+      </w:pPr>
+      <w:r>
+        <w:t xml:space="preserve">Signifikanter Effekt: </w:t>
+      </w:r>
+      <w:proofErr w:type="spellStart"/>
+      <w:r>
+        <w:t>MappingMethod</w:t>
+      </w:r>
+      <w:proofErr w:type="spellEnd"/>
+      <w:r>
+        <w:t xml:space="preserve"> (&lt;0,001)</w:t>
+      </w:r>
+      <w:r>
+        <w:t xml:space="preserve"> </w:t>
+      </w:r>
+    </w:p>
+    <w:p>
+      <w:pPr>
+        <w:pStyle w:val="Listenabsatz"/>
+        <w:numPr>
+          <w:ilvl w:val="1"/>
+          <w:numId w:val="2"/>
+        </w:numPr>
+      </w:pPr>
+      <w:proofErr w:type="spellStart"/>
+      <w:r>
+        <w:t>Widening</w:t>
+      </w:r>
+      <w:proofErr w:type="spellEnd"/>
+      <w:r>
+        <w:t xml:space="preserve"> mit stärkstem Effekt (&lt;0,001 vs. </w:t>
+      </w:r>
+      <w:proofErr w:type="spellStart"/>
+      <w:r>
+        <w:t>direct</w:t>
+      </w:r>
+      <w:proofErr w:type="spellEnd"/>
+      <w:r>
+        <w:t xml:space="preserve"> und </w:t>
+      </w:r>
+      <w:proofErr w:type="spellStart"/>
+      <w:r>
+        <w:t>densening</w:t>
+      </w:r>
+      <w:proofErr w:type="spellEnd"/>
+      <w:r>
+        <w:t>)</w:t>
+      </w:r>
+      <w:r>
+        <w:t xml:space="preserve"> </w:t>
+      </w:r>
+    </w:p>
+    <w:p>
+      <w:pPr>
+        <w:pStyle w:val="Listenabsatz"/>
+        <w:numPr>
+          <w:ilvl w:val="1"/>
+          <w:numId w:val="2"/>
+        </w:numPr>
+      </w:pPr>
+      <w:proofErr w:type="spellStart"/>
+      <w:r>
+        <w:t>Widening</w:t>
+      </w:r>
+      <w:proofErr w:type="spellEnd"/>
+      <w:r>
+        <w:t xml:space="preserve"> deutlich unterdurchschnittlich</w:t>
+      </w:r>
+    </w:p>
+    <w:p>
+      <w:pPr>
+        <w:pStyle w:val="Listenabsatz"/>
+        <w:numPr>
+          <w:ilvl w:val="1"/>
+          <w:numId w:val="2"/>
+        </w:numPr>
+      </w:pPr>
+      <w:proofErr w:type="spellStart"/>
+      <w:r>
+        <w:t>Direct</w:t>
+      </w:r>
+      <w:proofErr w:type="spellEnd"/>
+      <w:r>
+        <w:t xml:space="preserve"> / </w:t>
+      </w:r>
+      <w:proofErr w:type="spellStart"/>
+      <w:r>
+        <w:t>Densening</w:t>
+      </w:r>
+      <w:proofErr w:type="spellEnd"/>
+      <w:r>
+        <w:t xml:space="preserve">: kein signifikanter </w:t>
+      </w:r>
+      <w:proofErr w:type="gramStart"/>
+      <w:r>
+        <w:t>Effekt !</w:t>
+      </w:r>
+      <w:proofErr w:type="gramEnd"/>
+    </w:p>
+    <w:p>
+      <w:pPr>
+        <w:pStyle w:val="Listenabsatz"/>
+        <w:numPr>
+          <w:ilvl w:val="1"/>
+          <w:numId w:val="2"/>
+        </w:numPr>
+      </w:pPr>
+      <w:proofErr w:type="spellStart"/>
+      <w:r>
+        <w:t>NumLayers</w:t>
+      </w:r>
+      <w:proofErr w:type="spellEnd"/>
+      <w:r>
+        <w:t>: kein Effekt (</w:t>
+      </w:r>
+      <w:proofErr w:type="spellStart"/>
+      <w:r>
+        <w:t>Sig</w:t>
+      </w:r>
+      <w:proofErr w:type="spellEnd"/>
+      <w:r>
+        <w:t>: 0,117)</w:t>
+      </w:r>
+    </w:p>
+    <w:p>
+      <w:pPr>
+        <w:pStyle w:val="Listenabsatz"/>
+        <w:numPr>
+          <w:ilvl w:val="1"/>
+          <w:numId w:val="2"/>
+        </w:numPr>
+      </w:pPr>
+      <w:proofErr w:type="spellStart"/>
+      <w:r>
+        <w:t>MappingMethod</w:t>
+      </w:r>
+      <w:proofErr w:type="spellEnd"/>
+      <w:r>
+        <w:t xml:space="preserve"> * </w:t>
+      </w:r>
+      <w:proofErr w:type="spellStart"/>
+      <w:r>
+        <w:t>NumLayers</w:t>
+      </w:r>
+      <w:proofErr w:type="spellEnd"/>
+      <w:r>
+        <w:t>: kein Effekt (</w:t>
+      </w:r>
+      <w:proofErr w:type="gramStart"/>
+      <w:r>
+        <w:t>Sig.:,</w:t>
+      </w:r>
+      <w:proofErr w:type="gramEnd"/>
+      <w:r>
+        <w:t>951) !</w:t>
+      </w:r>
+    </w:p>
+    <w:p>
+      <w:pPr>
+        <w:pStyle w:val="Listenabsatz"/>
+        <w:numPr>
+          <w:ilvl w:val="1"/>
+          <w:numId w:val="2"/>
+        </w:numPr>
+      </w:pPr>
+      <w:r>
+        <w:t>Aber: unterschiedlich starke Ausprägung des Effekts bei verschiedenen Layer-Anzahlen:</w:t>
+      </w:r>
+    </w:p>
+    <w:p>
+      <w:pPr>
+        <w:pStyle w:val="Listenabsatz"/>
+        <w:numPr>
+          <w:ilvl w:val="2"/>
+          <w:numId w:val="2"/>
+        </w:numPr>
+      </w:pPr>
+      <w:r>
+        <w:t>6 Ebenen: Effekt nicht signifikant (</w:t>
+      </w:r>
+      <w:proofErr w:type="spellStart"/>
+      <w:r>
+        <w:t>Sig</w:t>
+      </w:r>
+      <w:proofErr w:type="spellEnd"/>
+      <w:r>
+        <w:t>. 0.5)</w:t>
+      </w:r>
+    </w:p>
+    <w:p>
+      <w:pPr>
+        <w:pStyle w:val="Listenabsatz"/>
+        <w:numPr>
+          <w:ilvl w:val="2"/>
+          <w:numId w:val="2"/>
+        </w:numPr>
+      </w:pPr>
+      <w:r>
+        <w:t xml:space="preserve">9, 15,18 Ebenen: Effekt </w:t>
+      </w:r>
+      <w:proofErr w:type="spellStart"/>
+      <w:r>
+        <w:t>hochsignifkant</w:t>
+      </w:r>
+      <w:proofErr w:type="spellEnd"/>
+      <w:r>
         <w:t xml:space="preserve"> (</w:t>
       </w:r>
       <w:proofErr w:type="spellStart"/>
       <w:r>
-        <w:rPr>
-          <w:lang w:val="en-GB"/>
-        </w:rPr>
-        <w:t>kein</w:t>
+        <w:t>Sig</w:t>
+      </w:r>
+      <w:proofErr w:type="spellEnd"/>
+      <w:r>
+        <w:t>. 0,007 / 0,006 / 0,009)</w:t>
+      </w:r>
+    </w:p>
+    <w:p>
+      <w:pPr>
+        <w:pStyle w:val="Listenabsatz"/>
+        <w:numPr>
+          <w:ilvl w:val="2"/>
+          <w:numId w:val="2"/>
+        </w:numPr>
+      </w:pPr>
+      <w:r>
+        <w:t>12 / 21 Ebenen: weniger stark: (0,03 / 0,028)</w:t>
+      </w:r>
+    </w:p>
+    <w:p>
+      <w:pPr>
+        <w:pStyle w:val="Listenabsatz"/>
+        <w:numPr>
+          <w:ilvl w:val="2"/>
+          <w:numId w:val="2"/>
+        </w:numPr>
+      </w:pPr>
+      <w:r>
+        <w:t>ABER: dieser Zusammenhang ist statistisch nicht signifikant (s.o.)</w:t>
+      </w:r>
+    </w:p>
+    <w:p>
+      <w:pPr>
+        <w:pStyle w:val="Listenabsatz"/>
+        <w:numPr>
+          <w:ilvl w:val="1"/>
+          <w:numId w:val="2"/>
+        </w:numPr>
+        <w:rPr>
+          <w:lang w:val="en-GB"/>
+        </w:rPr>
+      </w:pPr>
+      <w:proofErr w:type="spellStart"/>
+      <w:r>
+        <w:rPr>
+          <w:lang w:val="en-GB"/>
+        </w:rPr>
+        <w:t>Levene</w:t>
+      </w:r>
+      <w:proofErr w:type="spellEnd"/>
+      <w:r>
+        <w:rPr>
+          <w:lang w:val="en-GB"/>
+        </w:rPr>
+        <w:t xml:space="preserve">-Test: </w:t>
+      </w:r>
+      <w:proofErr w:type="spellStart"/>
+      <w:r>
+        <w:rPr>
+          <w:lang w:val="en-GB"/>
+        </w:rPr>
+        <w:t>Nullhypothese</w:t>
       </w:r>
       <w:proofErr w:type="spellEnd"/>
       <w:r>
@@ -2434,61 +3108,29 @@
         <w:rPr>
           <w:lang w:val="en-GB"/>
         </w:rPr>
-        <w:t>Unterschied</w:t>
-      </w:r>
-      <w:proofErr w:type="spellEnd"/>
-      <w:r>
-        <w:rPr>
-          <w:lang w:val="en-GB"/>
-        </w:rPr>
-        <w:t>)</w:t>
-      </w:r>
-    </w:p>
-    <w:p>
-      <w:pPr>
-        <w:pStyle w:val="Listenabsatz"/>
-        <w:numPr>
-          <w:ilvl w:val="1"/>
-          <w:numId w:val="2"/>
-        </w:numPr>
-        <w:rPr>
-          <w:lang w:val="en-GB"/>
-        </w:rPr>
-      </w:pPr>
-      <w:proofErr w:type="spellStart"/>
-      <w:r>
-        <w:rPr>
-          <w:lang w:val="en-GB"/>
-        </w:rPr>
-        <w:t>Terminated_Abs</w:t>
-      </w:r>
-      <w:proofErr w:type="spellEnd"/>
-      <w:r>
-        <w:rPr>
-          <w:lang w:val="en-GB"/>
-        </w:rPr>
-        <w:t>,</w:t>
-      </w:r>
-    </w:p>
-    <w:p>
-      <w:pPr>
-        <w:pStyle w:val="Listenabsatz"/>
-        <w:numPr>
-          <w:ilvl w:val="1"/>
-          <w:numId w:val="2"/>
-        </w:numPr>
-        <w:rPr>
-          <w:lang w:val="en-GB"/>
-        </w:rPr>
-      </w:pPr>
-      <w:proofErr w:type="spellStart"/>
-      <w:r>
-        <w:rPr>
-          <w:lang w:val="en-GB"/>
-        </w:rPr>
-        <w:t>Failed_Abs</w:t>
-      </w:r>
-      <w:proofErr w:type="spellEnd"/>
+        <w:t>erfüllt</w:t>
+      </w:r>
+      <w:proofErr w:type="spellEnd"/>
+      <w:r>
+        <w:rPr>
+          <w:lang w:val="en-GB"/>
+        </w:rPr>
+        <w:t xml:space="preserve"> (S</w:t>
+      </w:r>
+      <w:r>
+        <w:rPr>
+          <w:lang w:val="en-GB"/>
+        </w:rPr>
+        <w:t>ig &gt; 0,8)</w:t>
+      </w:r>
+    </w:p>
+    <w:p>
+      <w:pPr>
+        <w:pStyle w:val="berschrift3"/>
+      </w:pPr>
+      <w:r>
+        <w:t xml:space="preserve">Erfolgsquote als Messwiederholung </w:t>
+      </w:r>
     </w:p>
     <w:p>
       <w:pPr>
@@ -2501,6 +3143,98 @@
           <w:lang w:val="en-GB"/>
         </w:rPr>
       </w:pPr>
+      <w:r>
+        <w:rPr>
+          <w:lang w:val="en-GB"/>
+        </w:rPr>
+        <w:t>Export:</w:t>
+      </w:r>
+    </w:p>
+    <w:p>
+      <w:pPr>
+        <w:pStyle w:val="Listenabsatz"/>
+        <w:numPr>
+          <w:ilvl w:val="1"/>
+          <w:numId w:val="2"/>
+        </w:numPr>
+        <w:rPr>
+          <w:lang w:val="en-GB"/>
+        </w:rPr>
+      </w:pPr>
+      <w:proofErr w:type="spellStart"/>
+      <w:r>
+        <w:rPr>
+          <w:lang w:val="en-GB"/>
+        </w:rPr>
+        <w:t>spss</w:t>
+      </w:r>
+      <w:proofErr w:type="spellEnd"/>
+      <w:r>
+        <w:rPr>
+          <w:lang w:val="en-GB"/>
+        </w:rPr>
+        <w:t>/</w:t>
+      </w:r>
+      <w:proofErr w:type="spellStart"/>
+      <w:r>
+        <w:rPr>
+          <w:lang w:val="en-GB"/>
+        </w:rPr>
+        <w:t>data_rates_repeat.sav</w:t>
+      </w:r>
+      <w:proofErr w:type="spellEnd"/>
+    </w:p>
+    <w:p>
+      <w:pPr>
+        <w:pStyle w:val="Listenabsatz"/>
+        <w:numPr>
+          <w:ilvl w:val="1"/>
+          <w:numId w:val="2"/>
+        </w:numPr>
+        <w:rPr>
+          <w:lang w:val="en-GB"/>
+        </w:rPr>
+      </w:pPr>
+      <w:proofErr w:type="spellStart"/>
+      <w:r>
+        <w:rPr>
+          <w:lang w:val="en-GB"/>
+        </w:rPr>
+        <w:t>spss</w:t>
+      </w:r>
+      <w:proofErr w:type="spellEnd"/>
+      <w:r>
+        <w:rPr>
+          <w:lang w:val="en-GB"/>
+        </w:rPr>
+        <w:t>/</w:t>
+      </w:r>
+      <w:proofErr w:type="spellStart"/>
+      <w:r>
+        <w:rPr>
+          <w:lang w:val="en-GB"/>
+        </w:rPr>
+        <w:t>results_rates_</w:t>
+      </w:r>
+      <w:r>
+        <w:rPr>
+          <w:lang w:val="en-GB"/>
+        </w:rPr>
+        <w:t>repeat.spv</w:t>
+      </w:r>
+      <w:proofErr w:type="spellEnd"/>
+    </w:p>
+    <w:p>
+      <w:pPr>
+        <w:pStyle w:val="Listenabsatz"/>
+        <w:numPr>
+          <w:ilvl w:val="0"/>
+          <w:numId w:val="2"/>
+        </w:numPr>
+        <w:rPr>
+          <w:lang w:val="en-GB"/>
+        </w:rPr>
+      </w:pPr>
       <w:proofErr w:type="spellStart"/>
       <w:r>
         <w:rPr>
@@ -2524,16 +3258,59 @@
           <w:numId w:val="2"/>
         </w:numPr>
       </w:pPr>
-      <w:r>
-        <w:t xml:space="preserve">Signifikanter Effekt: </w:t>
-      </w:r>
+      <w:proofErr w:type="gramStart"/>
+      <w:r>
+        <w:t xml:space="preserve">Im wesentlichen </w:t>
+      </w:r>
+      <w:r>
+        <w:t>B</w:t>
+      </w:r>
+      <w:r>
+        <w:t>estätigung</w:t>
+      </w:r>
+      <w:proofErr w:type="gramEnd"/>
+      <w:r>
+        <w:t xml:space="preserve"> für o</w:t>
+      </w:r>
+      <w:r>
+        <w:t>bige Ergebnisse</w:t>
+      </w:r>
+    </w:p>
+    <w:p>
+      <w:pPr>
+        <w:pStyle w:val="Listenabsatz"/>
+        <w:numPr>
+          <w:ilvl w:val="1"/>
+          <w:numId w:val="2"/>
+        </w:numPr>
+      </w:pPr>
       <w:proofErr w:type="spellStart"/>
       <w:r>
         <w:t>MappingMethod</w:t>
       </w:r>
       <w:proofErr w:type="spellEnd"/>
       <w:r>
-        <w:t xml:space="preserve"> (&lt;0,001)</w:t>
+        <w:t>: signifikant (&lt;0,001)</w:t>
+      </w:r>
+    </w:p>
+    <w:p>
+      <w:pPr>
+        <w:pStyle w:val="Listenabsatz"/>
+        <w:numPr>
+          <w:ilvl w:val="1"/>
+          <w:numId w:val="2"/>
+        </w:numPr>
+      </w:pPr>
+      <w:r>
+        <w:t xml:space="preserve">Aber auch </w:t>
+      </w:r>
+      <w:proofErr w:type="spellStart"/>
+      <w:r>
+        <w:t>NumLayers</w:t>
+      </w:r>
+      <w:proofErr w:type="spellEnd"/>
+      <w:r>
+        <w:t xml:space="preserve"> (0,003)</w:t>
       </w:r>
       <w:r>
         <w:t xml:space="preserve"> </w:t>
@@ -2547,504 +3324,6 @@
           <w:numId w:val="2"/>
         </w:numPr>
       </w:pPr>
-      <w:proofErr w:type="spellStart"/>
-      <w:r>
-        <w:t>Widening</w:t>
-      </w:r>
-      <w:proofErr w:type="spellEnd"/>
-      <w:r>
-        <w:t xml:space="preserve"> mit stärkstem Effekt (&lt;0,001 vs. </w:t>
-      </w:r>
-      <w:proofErr w:type="spellStart"/>
-      <w:r>
-        <w:t>direct</w:t>
-      </w:r>
-      <w:proofErr w:type="spellEnd"/>
-      <w:r>
-        <w:t xml:space="preserve"> und </w:t>
-      </w:r>
-      <w:proofErr w:type="spellStart"/>
-      <w:r>
-        <w:t>densening</w:t>
-      </w:r>
-      <w:proofErr w:type="spellEnd"/>
-      <w:r>
-        <w:t>)</w:t>
-      </w:r>
-      <w:r>
-        <w:t xml:space="preserve"> </w:t>
-      </w:r>
-    </w:p>
-    <w:p>
-      <w:pPr>
-        <w:pStyle w:val="Listenabsatz"/>
-        <w:numPr>
-          <w:ilvl w:val="1"/>
-          <w:numId w:val="2"/>
-        </w:numPr>
-      </w:pPr>
-      <w:proofErr w:type="spellStart"/>
-      <w:r>
-        <w:t>Widening</w:t>
-      </w:r>
-      <w:proofErr w:type="spellEnd"/>
-      <w:r>
-        <w:t xml:space="preserve"> deutlich unterdurchschnittlich</w:t>
-      </w:r>
-    </w:p>
-    <w:p>
-      <w:pPr>
-        <w:pStyle w:val="Listenabsatz"/>
-        <w:numPr>
-          <w:ilvl w:val="1"/>
-          <w:numId w:val="2"/>
-        </w:numPr>
-      </w:pPr>
-      <w:proofErr w:type="spellStart"/>
-      <w:r>
-        <w:t>Direct</w:t>
-      </w:r>
-      <w:proofErr w:type="spellEnd"/>
-      <w:r>
-        <w:t xml:space="preserve"> / </w:t>
-      </w:r>
-      <w:proofErr w:type="spellStart"/>
-      <w:r>
-        <w:t>Densening</w:t>
-      </w:r>
-      <w:proofErr w:type="spellEnd"/>
-      <w:r>
-        <w:t xml:space="preserve">: kein signifikanter </w:t>
-      </w:r>
-      <w:proofErr w:type="gramStart"/>
-      <w:r>
-        <w:t>Effekt !</w:t>
-      </w:r>
-      <w:proofErr w:type="gramEnd"/>
-    </w:p>
-    <w:p>
-      <w:pPr>
-        <w:pStyle w:val="Listenabsatz"/>
-        <w:numPr>
-          <w:ilvl w:val="1"/>
-          <w:numId w:val="2"/>
-        </w:numPr>
-      </w:pPr>
-      <w:proofErr w:type="spellStart"/>
-      <w:r>
-        <w:t>NumLayers</w:t>
-      </w:r>
-      <w:proofErr w:type="spellEnd"/>
-      <w:r>
-        <w:t>: kein Effekt (</w:t>
-      </w:r>
-      <w:proofErr w:type="spellStart"/>
-      <w:r>
-        <w:t>Sig</w:t>
-      </w:r>
-      <w:proofErr w:type="spellEnd"/>
-      <w:r>
-        <w:t>: 0,117)</w:t>
-      </w:r>
-    </w:p>
-    <w:p>
-      <w:pPr>
-        <w:pStyle w:val="Listenabsatz"/>
-        <w:numPr>
-          <w:ilvl w:val="1"/>
-          <w:numId w:val="2"/>
-        </w:numPr>
-      </w:pPr>
-      <w:proofErr w:type="spellStart"/>
-      <w:r>
-        <w:t>MappingMethod</w:t>
-      </w:r>
-      <w:proofErr w:type="spellEnd"/>
-      <w:r>
-        <w:t xml:space="preserve"> * </w:t>
-      </w:r>
-      <w:proofErr w:type="spellStart"/>
-      <w:r>
-        <w:t>NumLayers</w:t>
-      </w:r>
-      <w:proofErr w:type="spellEnd"/>
-      <w:r>
-        <w:t>: kein Effekt (</w:t>
-      </w:r>
-      <w:proofErr w:type="gramStart"/>
-      <w:r>
-        <w:t>Sig.:,</w:t>
-      </w:r>
-      <w:proofErr w:type="gramEnd"/>
-      <w:r>
-        <w:t>951) !</w:t>
-      </w:r>
-    </w:p>
-    <w:p>
-      <w:pPr>
-        <w:pStyle w:val="Listenabsatz"/>
-        <w:numPr>
-          <w:ilvl w:val="1"/>
-          <w:numId w:val="2"/>
-        </w:numPr>
-      </w:pPr>
-      <w:r>
-        <w:t>Aber: unterschiedlich starke Ausprägung des Effekts bei verschiedenen Layer-Anzahlen:</w:t>
-      </w:r>
-    </w:p>
-    <w:p>
-      <w:pPr>
-        <w:pStyle w:val="Listenabsatz"/>
-        <w:numPr>
-          <w:ilvl w:val="2"/>
-          <w:numId w:val="2"/>
-        </w:numPr>
-      </w:pPr>
-      <w:r>
-        <w:t>6 Ebenen: Effekt nicht signifikant (</w:t>
-      </w:r>
-      <w:proofErr w:type="spellStart"/>
-      <w:r>
-        <w:t>Sig</w:t>
-      </w:r>
-      <w:proofErr w:type="spellEnd"/>
-      <w:r>
-        <w:t>. 0.5)</w:t>
-      </w:r>
-    </w:p>
-    <w:p>
-      <w:pPr>
-        <w:pStyle w:val="Listenabsatz"/>
-        <w:numPr>
-          <w:ilvl w:val="2"/>
-          <w:numId w:val="2"/>
-        </w:numPr>
-      </w:pPr>
-      <w:r>
-        <w:t xml:space="preserve">9, 15,18 Ebenen: Effekt </w:t>
-      </w:r>
-      <w:proofErr w:type="spellStart"/>
-      <w:r>
-        <w:t>hochsignifkant</w:t>
-      </w:r>
-      <w:proofErr w:type="spellEnd"/>
-      <w:r>
-        <w:t xml:space="preserve"> (</w:t>
-      </w:r>
-      <w:proofErr w:type="spellStart"/>
-      <w:r>
-        <w:t>Sig</w:t>
-      </w:r>
-      <w:proofErr w:type="spellEnd"/>
-      <w:r>
-        <w:t>. 0,007 / 0,006 / 0,009)</w:t>
-      </w:r>
-    </w:p>
-    <w:p>
-      <w:pPr>
-        <w:pStyle w:val="Listenabsatz"/>
-        <w:numPr>
-          <w:ilvl w:val="2"/>
-          <w:numId w:val="2"/>
-        </w:numPr>
-      </w:pPr>
-      <w:r>
-        <w:t>12 / 21 Ebenen: weniger stark: (0,03 / 0,028)</w:t>
-      </w:r>
-    </w:p>
-    <w:p>
-      <w:pPr>
-        <w:pStyle w:val="Listenabsatz"/>
-        <w:numPr>
-          <w:ilvl w:val="2"/>
-          <w:numId w:val="2"/>
-        </w:numPr>
-      </w:pPr>
-      <w:r>
-        <w:t>ABER: dieser Zusammenhang ist statistisch nicht signifikant (s.o.)</w:t>
-      </w:r>
-    </w:p>
-    <w:p>
-      <w:pPr>
-        <w:pStyle w:val="Listenabsatz"/>
-        <w:numPr>
-          <w:ilvl w:val="1"/>
-          <w:numId w:val="2"/>
-        </w:numPr>
-        <w:rPr>
-          <w:lang w:val="en-GB"/>
-        </w:rPr>
-      </w:pPr>
-      <w:proofErr w:type="spellStart"/>
-      <w:r>
-        <w:rPr>
-          <w:lang w:val="en-GB"/>
-        </w:rPr>
-        <w:t>Levene</w:t>
-      </w:r>
-      <w:proofErr w:type="spellEnd"/>
-      <w:r>
-        <w:rPr>
-          <w:lang w:val="en-GB"/>
-        </w:rPr>
-        <w:t xml:space="preserve">-Test: </w:t>
-      </w:r>
-      <w:proofErr w:type="spellStart"/>
-      <w:r>
-        <w:rPr>
-          <w:lang w:val="en-GB"/>
-        </w:rPr>
-        <w:t>Nullhypothese</w:t>
-      </w:r>
-      <w:proofErr w:type="spellEnd"/>
-      <w:r>
-        <w:rPr>
-          <w:lang w:val="en-GB"/>
-        </w:rPr>
-        <w:t xml:space="preserve"> </w:t>
-      </w:r>
-      <w:proofErr w:type="spellStart"/>
-      <w:r>
-        <w:rPr>
-          <w:lang w:val="en-GB"/>
-        </w:rPr>
-        <w:t>erfüllt</w:t>
-      </w:r>
-      <w:proofErr w:type="spellEnd"/>
-      <w:r>
-        <w:rPr>
-          <w:lang w:val="en-GB"/>
-        </w:rPr>
-        <w:t xml:space="preserve"> (S</w:t>
-      </w:r>
-      <w:r>
-        <w:rPr>
-          <w:lang w:val="en-GB"/>
-        </w:rPr>
-        <w:t>ig &gt; 0,8)</w:t>
-      </w:r>
-    </w:p>
-    <w:p>
-      <w:pPr>
-        <w:pStyle w:val="berschrift3"/>
-      </w:pPr>
-      <w:r>
-        <w:t>Erfolgsquote als Messwiederholung</w:t>
-      </w:r>
-      <w:r>
-        <w:t xml:space="preserve"> </w:t>
-      </w:r>
-    </w:p>
-    <w:p>
-      <w:pPr>
-        <w:pStyle w:val="Listenabsatz"/>
-        <w:numPr>
-          <w:ilvl w:val="0"/>
-          <w:numId w:val="2"/>
-        </w:numPr>
-        <w:rPr>
-          <w:lang w:val="en-GB"/>
-        </w:rPr>
-      </w:pPr>
-      <w:r>
-        <w:rPr>
-          <w:lang w:val="en-GB"/>
-        </w:rPr>
-        <w:t>Export:</w:t>
-      </w:r>
-    </w:p>
-    <w:p>
-      <w:pPr>
-        <w:pStyle w:val="Listenabsatz"/>
-        <w:numPr>
-          <w:ilvl w:val="1"/>
-          <w:numId w:val="2"/>
-        </w:numPr>
-        <w:rPr>
-          <w:lang w:val="en-GB"/>
-        </w:rPr>
-      </w:pPr>
-      <w:proofErr w:type="spellStart"/>
-      <w:r>
-        <w:rPr>
-          <w:lang w:val="en-GB"/>
-        </w:rPr>
-        <w:t>spss</w:t>
-      </w:r>
-      <w:proofErr w:type="spellEnd"/>
-      <w:r>
-        <w:rPr>
-          <w:lang w:val="en-GB"/>
-        </w:rPr>
-        <w:t>/</w:t>
-      </w:r>
-      <w:proofErr w:type="spellStart"/>
-      <w:r>
-        <w:rPr>
-          <w:lang w:val="en-GB"/>
-        </w:rPr>
-        <w:t>data_rates_</w:t>
-      </w:r>
-      <w:r>
-        <w:rPr>
-          <w:lang w:val="en-GB"/>
-        </w:rPr>
-        <w:t>repeat</w:t>
-      </w:r>
-      <w:r>
-        <w:rPr>
-          <w:lang w:val="en-GB"/>
-        </w:rPr>
-        <w:t>.sav</w:t>
-      </w:r>
-      <w:proofErr w:type="spellEnd"/>
-    </w:p>
-    <w:p>
-      <w:pPr>
-        <w:pStyle w:val="Listenabsatz"/>
-        <w:numPr>
-          <w:ilvl w:val="1"/>
-          <w:numId w:val="2"/>
-        </w:numPr>
-        <w:rPr>
-          <w:lang w:val="en-GB"/>
-        </w:rPr>
-      </w:pPr>
-      <w:proofErr w:type="spellStart"/>
-      <w:r>
-        <w:rPr>
-          <w:lang w:val="en-GB"/>
-        </w:rPr>
-        <w:t>spss</w:t>
-      </w:r>
-      <w:proofErr w:type="spellEnd"/>
-      <w:r>
-        <w:rPr>
-          <w:lang w:val="en-GB"/>
-        </w:rPr>
-        <w:t>/</w:t>
-      </w:r>
-      <w:proofErr w:type="spellStart"/>
-      <w:r>
-        <w:rPr>
-          <w:lang w:val="en-GB"/>
-        </w:rPr>
-        <w:t>results_rates_</w:t>
-      </w:r>
-      <w:r>
-        <w:rPr>
-          <w:lang w:val="en-GB"/>
-        </w:rPr>
-        <w:t>repeat</w:t>
-      </w:r>
-      <w:r>
-        <w:rPr>
-          <w:lang w:val="en-GB"/>
-        </w:rPr>
-        <w:t>.spv</w:t>
-      </w:r>
-      <w:proofErr w:type="spellEnd"/>
-    </w:p>
-    <w:p>
-      <w:pPr>
-        <w:pStyle w:val="Listenabsatz"/>
-        <w:numPr>
-          <w:ilvl w:val="0"/>
-          <w:numId w:val="2"/>
-        </w:numPr>
-        <w:rPr>
-          <w:lang w:val="en-GB"/>
-        </w:rPr>
-      </w:pPr>
-      <w:proofErr w:type="spellStart"/>
-      <w:r>
-        <w:rPr>
-          <w:lang w:val="en-GB"/>
-        </w:rPr>
-        <w:t>Ergebnis</w:t>
-      </w:r>
-      <w:proofErr w:type="spellEnd"/>
-      <w:r>
-        <w:rPr>
-          <w:lang w:val="en-GB"/>
-        </w:rPr>
-        <w:t>:</w:t>
-      </w:r>
-    </w:p>
-    <w:p>
-      <w:pPr>
-        <w:pStyle w:val="Listenabsatz"/>
-        <w:numPr>
-          <w:ilvl w:val="1"/>
-          <w:numId w:val="2"/>
-        </w:numPr>
-      </w:pPr>
-      <w:proofErr w:type="gramStart"/>
-      <w:r>
-        <w:t xml:space="preserve">Im wesentlichen </w:t>
-      </w:r>
-      <w:r>
-        <w:t>B</w:t>
-      </w:r>
-      <w:r>
-        <w:t>estätigung</w:t>
-      </w:r>
-      <w:proofErr w:type="gramEnd"/>
-      <w:r>
-        <w:t xml:space="preserve"> für o</w:t>
-      </w:r>
-      <w:r>
-        <w:t>bige Ergebnisse</w:t>
-      </w:r>
-    </w:p>
-    <w:p>
-      <w:pPr>
-        <w:pStyle w:val="Listenabsatz"/>
-        <w:numPr>
-          <w:ilvl w:val="1"/>
-          <w:numId w:val="2"/>
-        </w:numPr>
-      </w:pPr>
-      <w:proofErr w:type="spellStart"/>
-      <w:r>
-        <w:t>MappingMethod</w:t>
-      </w:r>
-      <w:proofErr w:type="spellEnd"/>
-      <w:r>
-        <w:t>: signifikant (&lt;0,001)</w:t>
-      </w:r>
-    </w:p>
-    <w:p>
-      <w:pPr>
-        <w:pStyle w:val="Listenabsatz"/>
-        <w:numPr>
-          <w:ilvl w:val="1"/>
-          <w:numId w:val="2"/>
-        </w:numPr>
-      </w:pPr>
-      <w:r>
-        <w:t xml:space="preserve">Aber auch </w:t>
-      </w:r>
-      <w:proofErr w:type="spellStart"/>
-      <w:r>
-        <w:t>NumLayers</w:t>
-      </w:r>
-      <w:proofErr w:type="spellEnd"/>
-      <w:r>
-        <w:t xml:space="preserve"> (0,003)</w:t>
-      </w:r>
-      <w:r>
-        <w:t xml:space="preserve"> </w:t>
-      </w:r>
-    </w:p>
-    <w:p>
-      <w:pPr>
-        <w:pStyle w:val="Listenabsatz"/>
-        <w:numPr>
-          <w:ilvl w:val="1"/>
-          <w:numId w:val="2"/>
-        </w:numPr>
-      </w:pPr>
       <w:r>
         <w:t>Im Detail: 6 -21 schwach (0,01), 9-21 hoch (&lt;0,001) signifikant</w:t>
       </w:r>
@@ -3075,6 +3354,9 @@
     </w:p>
     <w:p>
       <w:r>
+        <w:rPr>
+          <w:noProof/>
+        </w:rPr>
         <w:lastRenderedPageBreak/>
         <w:drawing>
           <wp:inline distT="0" distB="0" distL="0" distR="0" wp14:anchorId="44BAE635" wp14:editId="75C51595">
@@ -3092,7 +3374,7 @@
                     <pic:cNvPicPr/>
                   </pic:nvPicPr>
                   <pic:blipFill>
-                    <a:blip r:embed="rId23"/>
+                    <a:blip r:embed="rId26"/>
                     <a:stretch>
                       <a:fillRect/>
                     </a:stretch>
@@ -3116,6 +3398,9 @@
         <w:t xml:space="preserve">     </w:t>
       </w:r>
       <w:r>
+        <w:rPr>
+          <w:noProof/>
+        </w:rPr>
         <w:drawing>
           <wp:inline distT="0" distB="0" distL="0" distR="0" wp14:anchorId="1F71E334" wp14:editId="3ED8F3CE">
             <wp:extent cx="2638425" cy="1555950"/>
@@ -3132,7 +3417,7 @@
                     <pic:cNvPicPr/>
                   </pic:nvPicPr>
                   <pic:blipFill>
-                    <a:blip r:embed="rId24"/>
+                    <a:blip r:embed="rId27"/>
                     <a:stretch>
                       <a:fillRect/>
                     </a:stretch>
@@ -4367,7 +4652,7 @@
                     </pic:cNvPicPr>
                   </pic:nvPicPr>
                   <pic:blipFill>
-                    <a:blip r:embed="rId25" cstate="print">
+                    <a:blip r:embed="rId28" cstate="print">
                       <a:extLst>
                         <a:ext uri="{28A0092B-C50C-407E-A947-70E740481C1C}">
                           <a14:useLocalDpi xmlns:a14="http://schemas.microsoft.com/office/drawing/2010/main" val="0"/>
@@ -4429,6 +4714,7 @@
       <w:r>
         <w:rPr>
           <w:rFonts w:ascii="Times New Roman" w:hAnsi="Times New Roman" w:cs="Times New Roman"/>
+          <w:noProof/>
           <w:sz w:val="24"/>
           <w:szCs w:val="24"/>
         </w:rPr>
@@ -4448,7 +4734,7 @@
                     <pic:cNvPicPr/>
                   </pic:nvPicPr>
                   <pic:blipFill>
-                    <a:blip r:embed="rId26"/>
+                    <a:blip r:embed="rId29"/>
                     <a:stretch>
                       <a:fillRect/>
                     </a:stretch>
@@ -4475,13 +4761,7 @@
         <w:pStyle w:val="berschrift3"/>
       </w:pPr>
       <w:r>
-        <w:t xml:space="preserve">Durchschnittliche Geschwindigkeit – </w:t>
-      </w:r>
-      <w:r>
-        <w:t>M</w:t>
-      </w:r>
-      <w:r>
-        <w:t>ANOVA</w:t>
+        <w:t>Durchschnittliche Geschwindigkeit – MANOVA</w:t>
       </w:r>
     </w:p>
     <w:p>
@@ -4568,11 +4848,457 @@
         <w:pStyle w:val="berschrift3"/>
       </w:pPr>
       <w:r>
-        <w:t xml:space="preserve">Durchschnittliche Geschwindigkeit – </w:t>
-      </w:r>
-      <w:r>
+        <w:t>Durchschnittliche Geschwindigkeit – Messwiederholung</w:t>
+      </w:r>
+    </w:p>
+    <w:p>
+      <w:pPr>
+        <w:pStyle w:val="Listenabsatz"/>
+        <w:numPr>
+          <w:ilvl w:val="0"/>
+          <w:numId w:val="2"/>
+        </w:numPr>
+      </w:pPr>
+      <w:r>
+        <w:t>Einzelne Trials als Messreihen</w:t>
+      </w:r>
+    </w:p>
+    <w:p>
+      <w:pPr>
+        <w:pStyle w:val="Listenabsatz"/>
+        <w:numPr>
+          <w:ilvl w:val="0"/>
+          <w:numId w:val="2"/>
+        </w:numPr>
+      </w:pPr>
+      <w:r>
+        <w:t>zweifaktorielle ANOVA</w:t>
+      </w:r>
+    </w:p>
+    <w:p>
+      <w:pPr>
+        <w:pStyle w:val="Listenabsatz"/>
+        <w:numPr>
+          <w:ilvl w:val="1"/>
+          <w:numId w:val="2"/>
+        </w:numPr>
+      </w:pPr>
+      <w:r>
+        <w:t>abhängige Variable: Dauer</w:t>
+      </w:r>
+    </w:p>
+    <w:p>
+      <w:pPr>
+        <w:pStyle w:val="Listenabsatz"/>
+        <w:numPr>
+          <w:ilvl w:val="1"/>
+          <w:numId w:val="2"/>
+        </w:numPr>
+      </w:pPr>
+      <w:r>
+        <w:t xml:space="preserve">Gruppenvariablen: </w:t>
+      </w:r>
+      <w:proofErr w:type="spellStart"/>
+      <w:r>
+        <w:t>Ebenenanzahl</w:t>
+      </w:r>
+      <w:proofErr w:type="spellEnd"/>
+      <w:r>
+        <w:t xml:space="preserve">, </w:t>
+      </w:r>
+      <w:proofErr w:type="spellStart"/>
+      <w:r>
+        <w:t>Ebenenanordnung</w:t>
+      </w:r>
+      <w:proofErr w:type="spellEnd"/>
+    </w:p>
+    <w:p>
+      <w:pPr>
+        <w:pStyle w:val="Listenabsatz"/>
+        <w:numPr>
+          <w:ilvl w:val="0"/>
+          <w:numId w:val="2"/>
+        </w:numPr>
+      </w:pPr>
+      <w:r>
+        <w:t>Import:</w:t>
+      </w:r>
+    </w:p>
+    <w:p>
+      <w:pPr>
+        <w:pStyle w:val="Listenabsatz"/>
+        <w:numPr>
+          <w:ilvl w:val="1"/>
+          <w:numId w:val="2"/>
+        </w:numPr>
+        <w:rPr>
+          <w:lang w:val="en-GB"/>
+        </w:rPr>
+      </w:pPr>
+      <w:r>
+        <w:rPr>
+          <w:lang w:val="en-GB"/>
+        </w:rPr>
+        <w:t>export/</w:t>
+      </w:r>
+      <w:r>
+        <w:rPr>
+          <w:lang w:val="en-GB"/>
+        </w:rPr>
+        <w:t>times_repeat.csv</w:t>
+      </w:r>
+    </w:p>
+    <w:p>
+      <w:pPr>
+        <w:pStyle w:val="Listenabsatz"/>
+        <w:numPr>
+          <w:ilvl w:val="1"/>
+          <w:numId w:val="2"/>
+        </w:numPr>
+        <w:rPr>
+          <w:lang w:val="en-GB"/>
+        </w:rPr>
+      </w:pPr>
+      <w:proofErr w:type="spellStart"/>
+      <w:r>
+        <w:rPr>
+          <w:lang w:val="en-GB"/>
+        </w:rPr>
+        <w:t>Variablen</w:t>
+      </w:r>
+      <w:proofErr w:type="spellEnd"/>
+      <w:r>
+        <w:rPr>
+          <w:lang w:val="en-GB"/>
+        </w:rPr>
+        <w:t xml:space="preserve">: </w:t>
+      </w:r>
+    </w:p>
+    <w:p>
+      <w:pPr>
+        <w:pStyle w:val="Listenabsatz"/>
+        <w:numPr>
+          <w:ilvl w:val="2"/>
+          <w:numId w:val="2"/>
+        </w:numPr>
+        <w:rPr>
+          <w:lang w:val="en-GB"/>
+        </w:rPr>
+      </w:pPr>
+      <w:r>
+        <w:rPr>
+          <w:lang w:val="en-GB"/>
+        </w:rPr>
+        <w:t>Proband/</w:t>
+      </w:r>
+      <w:proofErr w:type="spellStart"/>
+      <w:r>
+        <w:rPr>
+          <w:lang w:val="en-GB"/>
+        </w:rPr>
+        <w:t>MappingMethod</w:t>
+      </w:r>
+      <w:proofErr w:type="spellEnd"/>
+      <w:r>
+        <w:rPr>
+          <w:lang w:val="en-GB"/>
+        </w:rPr>
+        <w:t>/Block/Task/: Nominal</w:t>
+      </w:r>
+    </w:p>
+    <w:p>
+      <w:pPr>
+        <w:pStyle w:val="Listenabsatz"/>
+        <w:numPr>
+          <w:ilvl w:val="2"/>
+          <w:numId w:val="2"/>
+        </w:numPr>
+        <w:rPr>
+          <w:lang w:val="en-GB"/>
+        </w:rPr>
+      </w:pPr>
+      <w:proofErr w:type="spellStart"/>
+      <w:r>
+        <w:rPr>
+          <w:lang w:val="en-GB"/>
+        </w:rPr>
+        <w:t>NumLayers</w:t>
+      </w:r>
+      <w:proofErr w:type="spellEnd"/>
+      <w:r>
+        <w:rPr>
+          <w:lang w:val="en-GB"/>
+        </w:rPr>
+        <w:t>: Ordinal</w:t>
+      </w:r>
+    </w:p>
+    <w:p>
+      <w:pPr>
+        <w:pStyle w:val="Listenabsatz"/>
+        <w:numPr>
+          <w:ilvl w:val="2"/>
+          <w:numId w:val="2"/>
+        </w:numPr>
+        <w:rPr>
+          <w:lang w:val="en-GB"/>
+        </w:rPr>
+      </w:pPr>
+      <w:r>
+        <w:rPr>
+          <w:lang w:val="en-GB"/>
+        </w:rPr>
+        <w:t xml:space="preserve">Rest: </w:t>
+      </w:r>
+      <w:proofErr w:type="spellStart"/>
+      <w:r>
+        <w:rPr>
+          <w:lang w:val="en-GB"/>
+        </w:rPr>
+        <w:t>Metrisch</w:t>
+      </w:r>
+      <w:proofErr w:type="spellEnd"/>
+    </w:p>
+    <w:p>
+      <w:pPr>
+        <w:pStyle w:val="Listenabsatz"/>
+        <w:numPr>
+          <w:ilvl w:val="0"/>
+          <w:numId w:val="2"/>
+        </w:numPr>
+        <w:rPr>
+          <w:lang w:val="en-GB"/>
+        </w:rPr>
+      </w:pPr>
+      <w:r>
+        <w:rPr>
+          <w:lang w:val="en-GB"/>
+        </w:rPr>
+        <w:t>Export:</w:t>
+      </w:r>
+    </w:p>
+    <w:p>
+      <w:pPr>
+        <w:pStyle w:val="Listenabsatz"/>
+        <w:numPr>
+          <w:ilvl w:val="1"/>
+          <w:numId w:val="2"/>
+        </w:numPr>
+        <w:rPr>
+          <w:lang w:val="en-GB"/>
+        </w:rPr>
+      </w:pPr>
+      <w:proofErr w:type="spellStart"/>
+      <w:r>
+        <w:rPr>
+          <w:lang w:val="en-GB"/>
+        </w:rPr>
+        <w:t>spss</w:t>
+      </w:r>
+      <w:proofErr w:type="spellEnd"/>
+      <w:r>
+        <w:rPr>
+          <w:lang w:val="en-GB"/>
+        </w:rPr>
+        <w:t>/</w:t>
+      </w:r>
+      <w:proofErr w:type="spellStart"/>
+      <w:r>
+        <w:rPr>
+          <w:lang w:val="en-GB"/>
+        </w:rPr>
+        <w:t>results_times_repeat.spv</w:t>
+      </w:r>
+      <w:proofErr w:type="spellEnd"/>
+    </w:p>
+    <w:p>
+      <w:pPr>
+        <w:pStyle w:val="Listenabsatz"/>
+        <w:numPr>
+          <w:ilvl w:val="1"/>
+          <w:numId w:val="2"/>
+        </w:numPr>
+        <w:rPr>
+          <w:lang w:val="en-GB"/>
+        </w:rPr>
+      </w:pPr>
+      <w:proofErr w:type="spellStart"/>
+      <w:r>
+        <w:rPr>
+          <w:lang w:val="en-GB"/>
+        </w:rPr>
+        <w:t>spss</w:t>
+      </w:r>
+      <w:proofErr w:type="spellEnd"/>
+      <w:r>
+        <w:rPr>
+          <w:lang w:val="en-GB"/>
+        </w:rPr>
+        <w:t>/</w:t>
+      </w:r>
+      <w:proofErr w:type="spellStart"/>
+      <w:r>
+        <w:rPr>
+          <w:lang w:val="en-GB"/>
+        </w:rPr>
+        <w:t>data_times_repeat.sav</w:t>
+      </w:r>
+      <w:proofErr w:type="spellEnd"/>
+    </w:p>
+    <w:p>
+      <w:pPr>
+        <w:pStyle w:val="Listenabsatz"/>
+        <w:numPr>
+          <w:ilvl w:val="0"/>
+          <w:numId w:val="2"/>
+        </w:numPr>
+        <w:rPr>
+          <w:lang w:val="en-GB"/>
+        </w:rPr>
+      </w:pPr>
+      <w:proofErr w:type="spellStart"/>
+      <w:r>
+        <w:rPr>
+          <w:lang w:val="en-GB"/>
+        </w:rPr>
         <w:t>Messwiederholung</w:t>
       </w:r>
+      <w:proofErr w:type="spellEnd"/>
+      <w:r>
+        <w:rPr>
+          <w:lang w:val="en-GB"/>
+        </w:rPr>
+        <w:t>:</w:t>
+      </w:r>
+    </w:p>
+    <w:p>
+      <w:pPr>
+        <w:pStyle w:val="Listenabsatz"/>
+        <w:numPr>
+          <w:ilvl w:val="1"/>
+          <w:numId w:val="2"/>
+        </w:numPr>
+        <w:rPr>
+          <w:lang w:val="en-GB"/>
+        </w:rPr>
+      </w:pPr>
+      <w:proofErr w:type="spellStart"/>
+      <w:r>
+        <w:rPr>
+          <w:lang w:val="en-GB"/>
+        </w:rPr>
+        <w:t>mit</w:t>
+      </w:r>
+      <w:proofErr w:type="spellEnd"/>
+      <w:r>
+        <w:rPr>
+          <w:lang w:val="en-GB"/>
+        </w:rPr>
+        <w:t xml:space="preserve"> 5 </w:t>
+      </w:r>
+      <w:proofErr w:type="spellStart"/>
+      <w:r>
+        <w:rPr>
+          <w:lang w:val="en-GB"/>
+        </w:rPr>
+        <w:t>Messzeitpunkten</w:t>
+      </w:r>
+      <w:proofErr w:type="spellEnd"/>
+      <w:r>
+        <w:rPr>
+          <w:lang w:val="en-GB"/>
+        </w:rPr>
+        <w:t xml:space="preserve"> @0, @</w:t>
+      </w:r>
+      <w:proofErr w:type="gramStart"/>
+      <w:r>
+        <w:rPr>
+          <w:lang w:val="en-GB"/>
+        </w:rPr>
+        <w:t>1,@</w:t>
+      </w:r>
+      <w:proofErr w:type="gramEnd"/>
+      <w:r>
+        <w:rPr>
+          <w:lang w:val="en-GB"/>
+        </w:rPr>
+        <w:t>2, @3,@4</w:t>
+      </w:r>
+    </w:p>
+    <w:p>
+      <w:pPr>
+        <w:pStyle w:val="Listenabsatz"/>
+        <w:numPr>
+          <w:ilvl w:val="1"/>
+          <w:numId w:val="2"/>
+        </w:numPr>
+        <w:rPr>
+          <w:lang w:val="en-GB"/>
+        </w:rPr>
+      </w:pPr>
+      <w:proofErr w:type="spellStart"/>
+      <w:r>
+        <w:rPr>
+          <w:lang w:val="en-GB"/>
+        </w:rPr>
+        <w:t>Zwischensubjektfaktoren</w:t>
+      </w:r>
+      <w:proofErr w:type="spellEnd"/>
+      <w:r>
+        <w:rPr>
+          <w:lang w:val="en-GB"/>
+        </w:rPr>
+        <w:t xml:space="preserve">: </w:t>
+      </w:r>
+      <w:proofErr w:type="spellStart"/>
+      <w:r>
+        <w:rPr>
+          <w:lang w:val="en-GB"/>
+        </w:rPr>
+        <w:t>MappingMethod</w:t>
+      </w:r>
+      <w:proofErr w:type="spellEnd"/>
+      <w:r>
+        <w:rPr>
+          <w:lang w:val="en-GB"/>
+        </w:rPr>
+        <w:t xml:space="preserve">, </w:t>
+      </w:r>
+      <w:proofErr w:type="spellStart"/>
+      <w:r>
+        <w:rPr>
+          <w:lang w:val="en-GB"/>
+        </w:rPr>
+        <w:t>NumLayers</w:t>
+      </w:r>
+      <w:proofErr w:type="spellEnd"/>
+    </w:p>
+    <w:p>
+      <w:pPr>
+        <w:pStyle w:val="Listenabsatz"/>
+        <w:numPr>
+          <w:ilvl w:val="1"/>
+          <w:numId w:val="2"/>
+        </w:numPr>
+      </w:pPr>
+      <w:r>
+        <w:t xml:space="preserve">Diagramme: </w:t>
+      </w:r>
+      <w:proofErr w:type="spellStart"/>
+      <w:r>
+        <w:t>MaapingMethod</w:t>
+      </w:r>
+      <w:proofErr w:type="spellEnd"/>
+      <w:r>
+        <w:t>/</w:t>
+      </w:r>
+      <w:proofErr w:type="spellStart"/>
+      <w:r>
+        <w:t>NumLayers</w:t>
+      </w:r>
+      <w:proofErr w:type="spellEnd"/>
+      <w:r>
+        <w:t xml:space="preserve"> als horizontale Achse, Duration als Separate Linie</w:t>
+      </w:r>
     </w:p>
     <w:p>
       <w:pPr>
@@ -4583,562 +5309,104 @@
         </w:numPr>
       </w:pPr>
       <w:r>
-        <w:t>Einzelne Trials als Messreihen</w:t>
-      </w:r>
-    </w:p>
-    <w:p>
-      <w:pPr>
-        <w:pStyle w:val="Listenabsatz"/>
-        <w:numPr>
-          <w:ilvl w:val="0"/>
-          <w:numId w:val="2"/>
-        </w:numPr>
-      </w:pPr>
-      <w:r>
-        <w:t>zweifaktorielle ANOVA</w:t>
-      </w:r>
-    </w:p>
-    <w:p>
-      <w:pPr>
-        <w:pStyle w:val="Listenabsatz"/>
-        <w:numPr>
-          <w:ilvl w:val="1"/>
-          <w:numId w:val="2"/>
-        </w:numPr>
-      </w:pPr>
-      <w:r>
-        <w:t>abhängige Variable: Dauer</w:t>
-      </w:r>
-    </w:p>
-    <w:p>
-      <w:pPr>
-        <w:pStyle w:val="Listenabsatz"/>
-        <w:numPr>
-          <w:ilvl w:val="1"/>
-          <w:numId w:val="2"/>
-        </w:numPr>
-      </w:pPr>
-      <w:r>
-        <w:t xml:space="preserve">Gruppenvariablen: </w:t>
-      </w:r>
-      <w:proofErr w:type="spellStart"/>
-      <w:r>
-        <w:t>Ebenenanzahl</w:t>
-      </w:r>
-      <w:proofErr w:type="spellEnd"/>
-      <w:r>
-        <w:t xml:space="preserve">, </w:t>
-      </w:r>
-      <w:proofErr w:type="spellStart"/>
-      <w:r>
-        <w:t>Ebenenanordnung</w:t>
-      </w:r>
-      <w:proofErr w:type="spellEnd"/>
-    </w:p>
-    <w:p>
-      <w:pPr>
-        <w:pStyle w:val="Listenabsatz"/>
-        <w:numPr>
-          <w:ilvl w:val="0"/>
-          <w:numId w:val="2"/>
-        </w:numPr>
-      </w:pPr>
-      <w:r>
-        <w:t>Import:</w:t>
-      </w:r>
-    </w:p>
-    <w:p>
-      <w:pPr>
-        <w:pStyle w:val="Listenabsatz"/>
-        <w:numPr>
-          <w:ilvl w:val="1"/>
-          <w:numId w:val="2"/>
-        </w:numPr>
-        <w:rPr>
-          <w:lang w:val="en-GB"/>
-        </w:rPr>
-      </w:pPr>
-      <w:r>
-        <w:rPr>
-          <w:lang w:val="en-GB"/>
-        </w:rPr>
-        <w:t>export/</w:t>
-      </w:r>
-      <w:r>
-        <w:rPr>
-          <w:lang w:val="en-GB"/>
-        </w:rPr>
-        <w:t>times</w:t>
-      </w:r>
-      <w:r>
-        <w:rPr>
-          <w:lang w:val="en-GB"/>
-        </w:rPr>
-        <w:t>_repeat</w:t>
-      </w:r>
-      <w:r>
-        <w:rPr>
-          <w:lang w:val="en-GB"/>
-        </w:rPr>
-        <w:t>.csv</w:t>
-      </w:r>
-    </w:p>
-    <w:p>
-      <w:pPr>
-        <w:pStyle w:val="Listenabsatz"/>
-        <w:numPr>
-          <w:ilvl w:val="1"/>
-          <w:numId w:val="2"/>
-        </w:numPr>
-        <w:rPr>
-          <w:lang w:val="en-GB"/>
-        </w:rPr>
-      </w:pPr>
-      <w:proofErr w:type="spellStart"/>
-      <w:r>
-        <w:rPr>
-          <w:lang w:val="en-GB"/>
-        </w:rPr>
-        <w:t>Variablen</w:t>
-      </w:r>
-      <w:proofErr w:type="spellEnd"/>
-      <w:r>
-        <w:rPr>
-          <w:lang w:val="en-GB"/>
-        </w:rPr>
-        <w:t xml:space="preserve">: </w:t>
-      </w:r>
-    </w:p>
-    <w:p>
-      <w:pPr>
-        <w:pStyle w:val="Listenabsatz"/>
-        <w:numPr>
-          <w:ilvl w:val="2"/>
-          <w:numId w:val="2"/>
-        </w:numPr>
-        <w:rPr>
-          <w:lang w:val="en-GB"/>
-        </w:rPr>
-      </w:pPr>
-      <w:r>
-        <w:rPr>
-          <w:lang w:val="en-GB"/>
-        </w:rPr>
-        <w:t>Proband/</w:t>
-      </w:r>
-      <w:proofErr w:type="spellStart"/>
-      <w:r>
-        <w:rPr>
-          <w:lang w:val="en-GB"/>
-        </w:rPr>
-        <w:t>MappingMethod</w:t>
-      </w:r>
-      <w:proofErr w:type="spellEnd"/>
-      <w:r>
-        <w:rPr>
-          <w:lang w:val="en-GB"/>
-        </w:rPr>
-        <w:t>/Block/Task/: Nominal</w:t>
-      </w:r>
-    </w:p>
-    <w:p>
-      <w:pPr>
-        <w:pStyle w:val="Listenabsatz"/>
-        <w:numPr>
-          <w:ilvl w:val="2"/>
-          <w:numId w:val="2"/>
-        </w:numPr>
-        <w:rPr>
-          <w:lang w:val="en-GB"/>
-        </w:rPr>
-      </w:pPr>
-      <w:proofErr w:type="spellStart"/>
-      <w:r>
-        <w:rPr>
-          <w:lang w:val="en-GB"/>
-        </w:rPr>
+        <w:t>Ergebnisse:</w:t>
+      </w:r>
+    </w:p>
+    <w:p>
+      <w:pPr>
+        <w:pStyle w:val="Listenabsatz"/>
+        <w:numPr>
+          <w:ilvl w:val="1"/>
+          <w:numId w:val="2"/>
+        </w:numPr>
+      </w:pPr>
+      <w:r>
+        <w:t xml:space="preserve">Box-Test: Signifikanz </w:t>
+      </w:r>
+      <w:proofErr w:type="gramStart"/>
+      <w:r>
+        <w:t>0,000 ?</w:t>
+      </w:r>
+      <w:proofErr w:type="gramEnd"/>
+    </w:p>
+    <w:p>
+      <w:pPr>
+        <w:pStyle w:val="Listenabsatz"/>
+        <w:numPr>
+          <w:ilvl w:val="1"/>
+          <w:numId w:val="2"/>
+        </w:numPr>
+      </w:pPr>
+      <w:r>
+        <w:t>Duration als signifikanter Effekt (&lt;0,001)</w:t>
+      </w:r>
+    </w:p>
+    <w:p>
+      <w:pPr>
+        <w:pStyle w:val="Listenabsatz"/>
+        <w:numPr>
+          <w:ilvl w:val="1"/>
+          <w:numId w:val="2"/>
+        </w:numPr>
+      </w:pPr>
+      <w:proofErr w:type="spellStart"/>
+      <w:r>
         <w:t>NumLayers</w:t>
       </w:r>
       <w:proofErr w:type="spellEnd"/>
       <w:r>
-        <w:rPr>
-          <w:lang w:val="en-GB"/>
-        </w:rPr>
-        <w:t>: Ordinal</w:t>
-      </w:r>
-    </w:p>
-    <w:p>
-      <w:pPr>
-        <w:pStyle w:val="Listenabsatz"/>
-        <w:numPr>
-          <w:ilvl w:val="2"/>
-          <w:numId w:val="2"/>
-        </w:numPr>
-        <w:rPr>
-          <w:lang w:val="en-GB"/>
-        </w:rPr>
-      </w:pPr>
-      <w:r>
-        <w:rPr>
-          <w:lang w:val="en-GB"/>
-        </w:rPr>
-        <w:t xml:space="preserve">Rest: </w:t>
-      </w:r>
-      <w:proofErr w:type="spellStart"/>
-      <w:r>
-        <w:rPr>
-          <w:lang w:val="en-GB"/>
-        </w:rPr>
-        <w:t>Metrisch</w:t>
-      </w:r>
-      <w:proofErr w:type="spellEnd"/>
-    </w:p>
-    <w:p>
-      <w:pPr>
-        <w:pStyle w:val="Listenabsatz"/>
-        <w:numPr>
-          <w:ilvl w:val="0"/>
-          <w:numId w:val="2"/>
-        </w:numPr>
-        <w:rPr>
-          <w:lang w:val="en-GB"/>
-        </w:rPr>
-      </w:pPr>
-      <w:r>
-        <w:rPr>
-          <w:lang w:val="en-GB"/>
-        </w:rPr>
-        <w:t>Export:</w:t>
-      </w:r>
-    </w:p>
-    <w:p>
-      <w:pPr>
-        <w:pStyle w:val="Listenabsatz"/>
-        <w:numPr>
-          <w:ilvl w:val="1"/>
-          <w:numId w:val="2"/>
-        </w:numPr>
-        <w:rPr>
-          <w:lang w:val="en-GB"/>
-        </w:rPr>
-      </w:pPr>
-      <w:proofErr w:type="spellStart"/>
-      <w:r>
-        <w:rPr>
-          <w:lang w:val="en-GB"/>
-        </w:rPr>
-        <w:t>spss</w:t>
-      </w:r>
-      <w:proofErr w:type="spellEnd"/>
-      <w:r>
-        <w:rPr>
-          <w:lang w:val="en-GB"/>
-        </w:rPr>
-        <w:t>/</w:t>
-      </w:r>
-      <w:proofErr w:type="spellStart"/>
-      <w:r>
-        <w:rPr>
-          <w:lang w:val="en-GB"/>
-        </w:rPr>
-        <w:t>results_times_repeat.spv</w:t>
-      </w:r>
-      <w:proofErr w:type="spellEnd"/>
-    </w:p>
-    <w:p>
-      <w:pPr>
-        <w:pStyle w:val="Listenabsatz"/>
-        <w:numPr>
-          <w:ilvl w:val="1"/>
-          <w:numId w:val="2"/>
-        </w:numPr>
-        <w:rPr>
-          <w:lang w:val="en-GB"/>
-        </w:rPr>
-      </w:pPr>
-      <w:proofErr w:type="spellStart"/>
-      <w:r>
-        <w:rPr>
-          <w:lang w:val="en-GB"/>
-        </w:rPr>
-        <w:t>spss</w:t>
-      </w:r>
-      <w:proofErr w:type="spellEnd"/>
-      <w:r>
-        <w:rPr>
-          <w:lang w:val="en-GB"/>
-        </w:rPr>
-        <w:t>/</w:t>
-      </w:r>
-      <w:proofErr w:type="spellStart"/>
-      <w:r>
-        <w:rPr>
-          <w:lang w:val="en-GB"/>
-        </w:rPr>
-        <w:t>data_times_repeat.sav</w:t>
-      </w:r>
-      <w:proofErr w:type="spellEnd"/>
-    </w:p>
-    <w:p>
-      <w:pPr>
-        <w:pStyle w:val="Listenabsatz"/>
-        <w:numPr>
-          <w:ilvl w:val="0"/>
-          <w:numId w:val="2"/>
-        </w:numPr>
-        <w:rPr>
-          <w:lang w:val="en-GB"/>
-        </w:rPr>
-      </w:pPr>
-      <w:proofErr w:type="spellStart"/>
-      <w:r>
-        <w:rPr>
-          <w:lang w:val="en-GB"/>
-        </w:rPr>
-        <w:t>Messwiederholung</w:t>
-      </w:r>
-      <w:proofErr w:type="spellEnd"/>
-      <w:r>
-        <w:rPr>
-          <w:lang w:val="en-GB"/>
-        </w:rPr>
-        <w:t>:</w:t>
-      </w:r>
-    </w:p>
-    <w:p>
-      <w:pPr>
-        <w:pStyle w:val="Listenabsatz"/>
-        <w:numPr>
-          <w:ilvl w:val="1"/>
-          <w:numId w:val="2"/>
-        </w:numPr>
-        <w:rPr>
-          <w:lang w:val="en-GB"/>
-        </w:rPr>
-      </w:pPr>
-      <w:proofErr w:type="spellStart"/>
-      <w:r>
-        <w:rPr>
-          <w:lang w:val="en-GB"/>
-        </w:rPr>
-        <w:t>mit</w:t>
-      </w:r>
-      <w:proofErr w:type="spellEnd"/>
-      <w:r>
-        <w:rPr>
-          <w:lang w:val="en-GB"/>
-        </w:rPr>
-        <w:t xml:space="preserve"> 5 </w:t>
-      </w:r>
-      <w:proofErr w:type="spellStart"/>
-      <w:r>
-        <w:rPr>
-          <w:lang w:val="en-GB"/>
-        </w:rPr>
-        <w:t>Messzeitpunkten</w:t>
-      </w:r>
-      <w:proofErr w:type="spellEnd"/>
-      <w:r>
-        <w:rPr>
-          <w:lang w:val="en-GB"/>
-        </w:rPr>
-        <w:t xml:space="preserve"> @0, @</w:t>
+        <w:t>: signifikant bei paarweisen vergleichen: 6 vs. 18/21</w:t>
+      </w:r>
+    </w:p>
+    <w:p>
+      <w:pPr>
+        <w:pStyle w:val="Listenabsatz"/>
+        <w:numPr>
+          <w:ilvl w:val="1"/>
+          <w:numId w:val="2"/>
+        </w:numPr>
+      </w:pPr>
+      <w:r>
+        <w:t>Gesamteffekt: Signifikant (0,001)</w:t>
+      </w:r>
+    </w:p>
+    <w:p>
+      <w:pPr>
+        <w:pStyle w:val="Listenabsatz"/>
+        <w:numPr>
+          <w:ilvl w:val="1"/>
+          <w:numId w:val="2"/>
+        </w:numPr>
+      </w:pPr>
+      <w:r>
+        <w:t>Duration: signifikanter Effekt Durchgang 1 vs. Andere Durchgänge (&lt;0,001), keine Effekt</w:t>
+      </w:r>
+      <w:r>
+        <w:t>e</w:t>
+      </w:r>
+      <w:r>
+        <w:t xml:space="preserve"> zwischen </w:t>
+      </w:r>
+      <w:r>
+        <w:t xml:space="preserve">Durchgängen </w:t>
+      </w:r>
+      <w:r>
+        <w:t>2-</w:t>
       </w:r>
       <w:proofErr w:type="gramStart"/>
       <w:r>
-        <w:rPr>
-          <w:lang w:val="en-GB"/>
-        </w:rPr>
-        <w:t>1,@</w:t>
+        <w:t>5 !</w:t>
       </w:r>
       <w:proofErr w:type="gramEnd"/>
-      <w:r>
-        <w:rPr>
-          <w:lang w:val="en-GB"/>
-        </w:rPr>
-        <w:t>2, @3,@4</w:t>
-      </w:r>
-    </w:p>
-    <w:p>
-      <w:pPr>
-        <w:pStyle w:val="Listenabsatz"/>
-        <w:numPr>
-          <w:ilvl w:val="1"/>
-          <w:numId w:val="2"/>
-        </w:numPr>
-        <w:rPr>
-          <w:lang w:val="en-GB"/>
-        </w:rPr>
-      </w:pPr>
-      <w:proofErr w:type="spellStart"/>
-      <w:r>
-        <w:rPr>
-          <w:lang w:val="en-GB"/>
-        </w:rPr>
-        <w:t>Zwischensubjektfaktoren</w:t>
-      </w:r>
-      <w:proofErr w:type="spellEnd"/>
-      <w:r>
-        <w:rPr>
-          <w:lang w:val="en-GB"/>
-        </w:rPr>
-        <w:t xml:space="preserve">: </w:t>
-      </w:r>
-      <w:proofErr w:type="spellStart"/>
-      <w:r>
-        <w:rPr>
-          <w:lang w:val="en-GB"/>
-        </w:rPr>
-        <w:t>MappingMethod</w:t>
-      </w:r>
-      <w:proofErr w:type="spellEnd"/>
-      <w:r>
-        <w:rPr>
-          <w:lang w:val="en-GB"/>
-        </w:rPr>
-        <w:t xml:space="preserve">, </w:t>
-      </w:r>
-      <w:proofErr w:type="spellStart"/>
-      <w:r>
-        <w:rPr>
-          <w:lang w:val="en-GB"/>
-        </w:rPr>
-        <w:t>NumLayers</w:t>
-      </w:r>
-      <w:proofErr w:type="spellEnd"/>
-    </w:p>
-    <w:p>
-      <w:pPr>
-        <w:pStyle w:val="Listenabsatz"/>
-        <w:numPr>
-          <w:ilvl w:val="1"/>
-          <w:numId w:val="2"/>
-        </w:numPr>
-      </w:pPr>
-      <w:r>
-        <w:t xml:space="preserve">Diagramme: </w:t>
-      </w:r>
-      <w:proofErr w:type="spellStart"/>
-      <w:r>
-        <w:t>MaapingMethod</w:t>
-      </w:r>
-      <w:proofErr w:type="spellEnd"/>
-      <w:r>
-        <w:t>/</w:t>
-      </w:r>
-      <w:proofErr w:type="spellStart"/>
-      <w:r>
-        <w:t>NumLayers</w:t>
-      </w:r>
-      <w:proofErr w:type="spellEnd"/>
-      <w:r>
-        <w:t xml:space="preserve"> als horizontale Achse, Duration als Separate Linie</w:t>
-      </w:r>
-    </w:p>
-    <w:p>
-      <w:pPr>
-        <w:pStyle w:val="Listenabsatz"/>
-        <w:numPr>
-          <w:ilvl w:val="0"/>
-          <w:numId w:val="2"/>
-        </w:numPr>
-      </w:pPr>
-      <w:r>
-        <w:t>Ergebnisse:</w:t>
-      </w:r>
-    </w:p>
-    <w:p>
-      <w:pPr>
-        <w:pStyle w:val="Listenabsatz"/>
-        <w:numPr>
-          <w:ilvl w:val="1"/>
-          <w:numId w:val="2"/>
-        </w:numPr>
-      </w:pPr>
-      <w:r>
-        <w:t xml:space="preserve">Box-Test: Signifikanz </w:t>
-      </w:r>
-      <w:proofErr w:type="gramStart"/>
-      <w:r>
-        <w:t>0,000 ?</w:t>
-      </w:r>
-      <w:proofErr w:type="gramEnd"/>
-    </w:p>
-    <w:p>
-      <w:pPr>
-        <w:pStyle w:val="Listenabsatz"/>
-        <w:numPr>
-          <w:ilvl w:val="1"/>
-          <w:numId w:val="2"/>
-        </w:numPr>
-      </w:pPr>
-      <w:r>
-        <w:t>Duration als signifikanter Effekt (&lt;0,001)</w:t>
-      </w:r>
-    </w:p>
-    <w:p>
-      <w:pPr>
-        <w:pStyle w:val="Listenabsatz"/>
-        <w:numPr>
-          <w:ilvl w:val="1"/>
-          <w:numId w:val="2"/>
-        </w:numPr>
-      </w:pPr>
-      <w:proofErr w:type="spellStart"/>
-      <w:r>
-        <w:t>NumLayers</w:t>
-      </w:r>
-      <w:proofErr w:type="spellEnd"/>
-      <w:r>
-        <w:t>: signifikant bei paarweisen vergleichen: 6 vs. 18/21</w:t>
-      </w:r>
-    </w:p>
-    <w:p>
-      <w:pPr>
-        <w:pStyle w:val="Listenabsatz"/>
-        <w:numPr>
-          <w:ilvl w:val="1"/>
-          <w:numId w:val="2"/>
-        </w:numPr>
-      </w:pPr>
-      <w:r>
-        <w:t>Gesamteffekt: Signifikant (0,001)</w:t>
-      </w:r>
-    </w:p>
-    <w:p>
-      <w:pPr>
-        <w:pStyle w:val="Listenabsatz"/>
-        <w:numPr>
-          <w:ilvl w:val="1"/>
-          <w:numId w:val="2"/>
-        </w:numPr>
-      </w:pPr>
-      <w:r>
-        <w:t>Duration: signifikanter Effekt Durchgang 1 vs. Andere Durchgänge (&lt;0,001), keine Effekt</w:t>
-      </w:r>
-      <w:r>
-        <w:t>e</w:t>
-      </w:r>
-      <w:r>
-        <w:t xml:space="preserve"> zwischen </w:t>
-      </w:r>
-      <w:r>
-        <w:t xml:space="preserve">Durchgängen </w:t>
-      </w:r>
-      <w:r>
-        <w:t>2-</w:t>
-      </w:r>
-      <w:proofErr w:type="gramStart"/>
-      <w:r>
-        <w:t>5 !</w:t>
-      </w:r>
-      <w:proofErr w:type="gramEnd"/>
     </w:p>
     <w:p>
       <w:pPr>
         <w:jc w:val="center"/>
       </w:pPr>
       <w:r>
+        <w:rPr>
+          <w:noProof/>
+        </w:rPr>
         <w:drawing>
           <wp:inline distT="0" distB="0" distL="0" distR="0" wp14:anchorId="3FA7BCB9" wp14:editId="4BF55615">
             <wp:extent cx="3724275" cy="2196304"/>
@@ -5155,7 +5423,7 @@
                     <pic:cNvPicPr/>
                   </pic:nvPicPr>
                   <pic:blipFill>
-                    <a:blip r:embed="rId27"/>
+                    <a:blip r:embed="rId30"/>
                     <a:stretch>
                       <a:fillRect/>
                     </a:stretch>
@@ -5299,7 +5567,7 @@
                     </pic:cNvPicPr>
                   </pic:nvPicPr>
                   <pic:blipFill>
-                    <a:blip r:embed="rId28" cstate="print">
+                    <a:blip r:embed="rId31" cstate="print">
                       <a:extLst>
                         <a:ext uri="{28A0092B-C50C-407E-A947-70E740481C1C}">
                           <a14:useLocalDpi xmlns:a14="http://schemas.microsoft.com/office/drawing/2010/main" val="0"/>
@@ -5345,6 +5613,7 @@
       <w:r>
         <w:rPr>
           <w:rFonts w:ascii="Times New Roman" w:hAnsi="Times New Roman" w:cs="Times New Roman"/>
+          <w:noProof/>
           <w:sz w:val="24"/>
           <w:szCs w:val="24"/>
         </w:rPr>
@@ -5364,7 +5633,7 @@
                     <pic:cNvPicPr/>
                   </pic:nvPicPr>
                   <pic:blipFill>
-                    <a:blip r:embed="rId29"/>
+                    <a:blip r:embed="rId32"/>
                     <a:stretch>
                       <a:fillRect/>
                     </a:stretch>
@@ -5422,7 +5691,7 @@
                     </pic:cNvPicPr>
                   </pic:nvPicPr>
                   <pic:blipFill>
-                    <a:blip r:embed="rId30" cstate="print">
+                    <a:blip r:embed="rId33" cstate="print">
                       <a:extLst>
                         <a:ext uri="{28A0092B-C50C-407E-A947-70E740481C1C}">
                           <a14:useLocalDpi xmlns:a14="http://schemas.microsoft.com/office/drawing/2010/main" val="0"/>
@@ -5486,7 +5755,7 @@
                     </pic:cNvPicPr>
                   </pic:nvPicPr>
                   <pic:blipFill>
-                    <a:blip r:embed="rId31" cstate="print">
+                    <a:blip r:embed="rId34" cstate="print">
                       <a:extLst>
                         <a:ext uri="{28A0092B-C50C-407E-A947-70E740481C1C}">
                           <a14:useLocalDpi xmlns:a14="http://schemas.microsoft.com/office/drawing/2010/main" val="0"/>
@@ -5568,7 +5837,7 @@
                     </pic:cNvPicPr>
                   </pic:nvPicPr>
                   <pic:blipFill>
-                    <a:blip r:embed="rId32" cstate="print">
+                    <a:blip r:embed="rId35" cstate="print">
                       <a:extLst>
                         <a:ext uri="{28A0092B-C50C-407E-A947-70E740481C1C}">
                           <a14:useLocalDpi xmlns:a14="http://schemas.microsoft.com/office/drawing/2010/main" val="0"/>
@@ -5727,6 +5996,9 @@
     </w:p>
     <w:p>
       <w:r>
+        <w:rPr>
+          <w:noProof/>
+        </w:rPr>
         <w:lastRenderedPageBreak/>
         <w:drawing>
           <wp:inline distT="0" distB="0" distL="0" distR="0" wp14:anchorId="07DD4E7A" wp14:editId="1BC94132">
@@ -5744,7 +6016,7 @@
                     <pic:cNvPicPr/>
                   </pic:nvPicPr>
                   <pic:blipFill>
-                    <a:blip r:embed="rId33"/>
+                    <a:blip r:embed="rId36"/>
                     <a:stretch>
                       <a:fillRect/>
                     </a:stretch>
@@ -5765,6 +6037,9 @@
         </w:drawing>
       </w:r>
       <w:r>
+        <w:rPr>
+          <w:noProof/>
+        </w:rPr>
         <w:drawing>
           <wp:inline distT="0" distB="0" distL="0" distR="0" wp14:anchorId="0027AE7C" wp14:editId="4CBD5449">
             <wp:extent cx="5760720" cy="3397250"/>
@@ -5781,7 +6056,7 @@
                     <pic:cNvPicPr/>
                   </pic:nvPicPr>
                   <pic:blipFill>
-                    <a:blip r:embed="rId27"/>
+                    <a:blip r:embed="rId30"/>
                     <a:stretch>
                       <a:fillRect/>
                     </a:stretch>
@@ -5808,13 +6083,7 @@
       </w:pPr>
       <w:r>
         <w:lastRenderedPageBreak/>
-        <w:t>ANOVA über Gesamtergebnis (</w:t>
-      </w:r>
-      <w:r>
-        <w:t>Dauer</w:t>
-      </w:r>
-      <w:r>
-        <w:t xml:space="preserve"> pro Task)</w:t>
+        <w:t>ANOVA über Gesamtergebnis (Dauer pro Task)</w:t>
       </w:r>
     </w:p>
     <w:p>
@@ -5822,6 +6091,9 @@
         <w:pStyle w:val="berschrift3"/>
       </w:pPr>
       <w:r>
+        <w:rPr>
+          <w:noProof/>
+        </w:rPr>
         <w:drawing>
           <wp:inline distT="0" distB="0" distL="0" distR="0" wp14:anchorId="5AD75EE9" wp14:editId="7139C10C">
             <wp:extent cx="2584248" cy="1524000"/>
@@ -5838,7 +6110,7 @@
                     <pic:cNvPicPr/>
                   </pic:nvPicPr>
                   <pic:blipFill>
-                    <a:blip r:embed="rId34"/>
+                    <a:blip r:embed="rId37"/>
                     <a:stretch>
                       <a:fillRect/>
                     </a:stretch>
@@ -5862,6 +6134,9 @@
         <w:t xml:space="preserve">    </w:t>
       </w:r>
       <w:r>
+        <w:rPr>
+          <w:noProof/>
+        </w:rPr>
         <w:drawing>
           <wp:inline distT="0" distB="0" distL="0" distR="0" wp14:anchorId="0B3CF575" wp14:editId="17C43797">
             <wp:extent cx="2543175" cy="1499778"/>
@@ -5878,7 +6153,7 @@
                     <pic:cNvPicPr/>
                   </pic:nvPicPr>
                   <pic:blipFill>
-                    <a:blip r:embed="rId33"/>
+                    <a:blip r:embed="rId36"/>
                     <a:stretch>
                       <a:fillRect/>
                     </a:stretch>
@@ -5982,6 +6257,75 @@
       </w:r>
       <w:proofErr w:type="spellEnd"/>
     </w:p>
+    <w:p/>
+    <w:p>
+      <w:pPr>
+        <w:pStyle w:val="berschrift3"/>
+      </w:pPr>
+      <w:r>
+        <w:t>Anzahl der Umkehrpunkte</w:t>
+      </w:r>
+    </w:p>
+    <w:p>
+      <w:pPr>
+        <w:pStyle w:val="berschrift3"/>
+        <w:jc w:val="center"/>
+      </w:pPr>
+      <w:r>
+        <w:rPr>
+          <w:noProof/>
+        </w:rPr>
+        <w:drawing>
+          <wp:inline distT="0" distB="0" distL="0" distR="0" wp14:anchorId="61152D6B" wp14:editId="0B7E5852">
+            <wp:extent cx="3162300" cy="2408258"/>
+            <wp:effectExtent l="0" t="0" r="0" b="0"/>
+            <wp:docPr id="32" name="Grafik 32"/>
+            <wp:cNvGraphicFramePr>
+              <a:graphicFrameLocks xmlns:a="http://schemas.openxmlformats.org/drawingml/2006/main" noChangeAspect="1"/>
+            </wp:cNvGraphicFramePr>
+            <a:graphic xmlns:a="http://schemas.openxmlformats.org/drawingml/2006/main">
+              <a:graphicData uri="http://schemas.openxmlformats.org/drawingml/2006/picture">
+                <pic:pic xmlns:pic="http://schemas.openxmlformats.org/drawingml/2006/picture">
+                  <pic:nvPicPr>
+                    <pic:cNvPr id="0" name="Picture 1"/>
+                    <pic:cNvPicPr>
+                      <a:picLocks noChangeAspect="1" noChangeArrowheads="1"/>
+                    </pic:cNvPicPr>
+                  </pic:nvPicPr>
+                  <pic:blipFill>
+                    <a:blip r:embed="rId38">
+                      <a:extLst>
+                        <a:ext uri="{28A0092B-C50C-407E-A947-70E740481C1C}">
+                          <a14:useLocalDpi xmlns:a14="http://schemas.microsoft.com/office/drawing/2010/main" val="0"/>
+                        </a:ext>
+                      </a:extLst>
+                    </a:blip>
+                    <a:srcRect/>
+                    <a:stretch>
+                      <a:fillRect/>
+                    </a:stretch>
+                  </pic:blipFill>
+                  <pic:spPr bwMode="auto">
+                    <a:xfrm>
+                      <a:off x="0" y="0"/>
+                      <a:ext cx="3172520" cy="2416041"/>
+                    </a:xfrm>
+                    <a:prstGeom prst="rect">
+                      <a:avLst/>
+                    </a:prstGeom>
+                    <a:noFill/>
+                    <a:ln>
+                      <a:noFill/>
+                    </a:ln>
+                  </pic:spPr>
+                </pic:pic>
+              </a:graphicData>
+            </a:graphic>
+          </wp:inline>
+        </w:drawing>
+      </w:r>
+    </w:p>
+    <w:p/>
     <w:p>
       <w:r>
         <w:t>Komplexe Korrelationen</w:t>
@@ -5998,7 +6342,7 @@
           <w:lang w:val="en-GB"/>
         </w:rPr>
       </w:pPr>
-      <w:hyperlink r:id="rId35" w:history="1">
+      <w:hyperlink r:id="rId39" w:history="1">
         <w:r>
           <w:rPr>
             <w:rStyle w:val="Hyperlink"/>

</xml_diff>